<commit_message>
less about me and 4 projects now : (allnews, mail bot, MNIST , graph
</commit_message>
<xml_diff>
--- a/CV-RenanBazinin.docx
+++ b/CV-RenanBazinin.docx
@@ -388,7 +388,7 @@
       </w:tr>
       <w:tr>
         <w:trPr>
-          <w:trHeight w:val="716"/>
+          <w:trHeight w:val="347"/>
         </w:trPr>
         <w:tc>
           <w:tcPr>
@@ -397,32 +397,10 @@
           </w:tcPr>
           <w:p>
             <w:r>
-              <w:t xml:space="preserve">Motivated and self-driven Software Engineer pursuing a </w:t>
-            </w:r>
-            <w:r>
-              <w:t>B</w:t>
-            </w:r>
-            <w:r>
-              <w:t>.Sc. in Computer Science at the Academic College of Tel Aviv–Yaffo (MTA</w:t>
-            </w:r>
-            <w:r>
-              <w:t>)</w:t>
-            </w:r>
-            <w:r>
-              <w:br/>
-              <w:t>P</w:t>
-            </w:r>
-            <w:r>
-              <w:t xml:space="preserve">ortfolio of over </w:t>
-            </w:r>
-            <w:r>
-              <w:rPr>
-                <w:b/>
-                <w:color w:val="6A644E" w:themeColor="accent5"/>
-                <w:sz w:val="22"/>
-                <w:szCs w:val="32"/>
-              </w:rPr>
-              <w:t>60 GitHub repositories</w:t>
+              <w:t xml:space="preserve">Engineer with </w:t>
+            </w:r>
+            <w:r>
+              <w:t xml:space="preserve">over </w:t>
             </w:r>
             <w:r>
               <w:rPr>
@@ -430,10 +408,10 @@
                 <w:color w:val="6A644E" w:themeColor="accent5"/>
                 <w:szCs w:val="28"/>
               </w:rPr>
-              <w:t>,</w:t>
-            </w:r>
-            <w:r>
-              <w:t xml:space="preserve"> which includes several deployed, production-level applications.</w:t>
+              <w:t>60 GitHub repositories</w:t>
+            </w:r>
+            <w:r>
+              <w:t xml:space="preserve"> and OSS contributions; hands-on with React and full-stack</w:t>
             </w:r>
           </w:p>
         </w:tc>
@@ -767,7 +745,7 @@
                 <w:color w:val="6A644E" w:themeColor="accent5"/>
                 <w:szCs w:val="28"/>
               </w:rPr>
-              <w:t>at the AI-ED 2025 Conference (Italy) -</w:t>
+              <w:t>at the AIED 2025 Conference (Italy) -</w:t>
             </w:r>
             <w:r>
               <w:rPr>
@@ -840,7 +818,13 @@
               <w:t>first place</w:t>
             </w:r>
             <w:r>
-              <w:t xml:space="preserve"> in both the prestigious Stytor ACM 2025 </w:t>
+              <w:t xml:space="preserve"> in both the prestigious </w:t>
+            </w:r>
+            <w:r>
+              <w:t xml:space="preserve">SYSTOR </w:t>
+            </w:r>
+            <w:r>
+              <w:t xml:space="preserve">ACM 2025 </w:t>
             </w:r>
             <w:r>
               <w:t>conference</w:t>
@@ -938,7 +922,7 @@
       </w:tr>
       <w:tr>
         <w:trPr>
-          <w:trHeight w:val="18"/>
+          <w:trHeight w:val="3206"/>
         </w:trPr>
         <w:tc>
           <w:tcPr>
@@ -967,13 +951,13 @@
                 <w:noProof/>
               </w:rPr>
               <w:drawing>
-                <wp:anchor distT="0" distB="0" distL="114300" distR="114300" simplePos="0" relativeHeight="251705344" behindDoc="0" locked="0" layoutInCell="1" allowOverlap="1" wp14:anchorId="19F8AC32" wp14:editId="6EE9A646">
+                <wp:anchor distT="0" distB="0" distL="114300" distR="114300" simplePos="0" relativeHeight="251705344" behindDoc="0" locked="0" layoutInCell="1" allowOverlap="1" wp14:anchorId="19F8AC32" wp14:editId="513808F2">
                   <wp:simplePos x="0" y="0"/>
                   <wp:positionH relativeFrom="column">
-                    <wp:posOffset>514824</wp:posOffset>
+                    <wp:posOffset>2830195</wp:posOffset>
                   </wp:positionH>
                   <wp:positionV relativeFrom="paragraph">
-                    <wp:posOffset>526415</wp:posOffset>
+                    <wp:posOffset>171450</wp:posOffset>
                   </wp:positionV>
                   <wp:extent cx="566420" cy="170815"/>
                   <wp:effectExtent l="0" t="0" r="5080" b="635"/>
@@ -1043,13 +1027,13 @@
                 <w:noProof/>
               </w:rPr>
               <w:drawing>
-                <wp:anchor distT="0" distB="0" distL="114300" distR="114300" simplePos="0" relativeHeight="251702272" behindDoc="0" locked="0" layoutInCell="1" allowOverlap="1" wp14:anchorId="35DAF6FC" wp14:editId="0304B319">
+                <wp:anchor distT="0" distB="0" distL="114300" distR="114300" simplePos="0" relativeHeight="251702272" behindDoc="0" locked="0" layoutInCell="1" allowOverlap="1" wp14:anchorId="35DAF6FC" wp14:editId="6BC95263">
                   <wp:simplePos x="0" y="0"/>
                   <wp:positionH relativeFrom="column">
-                    <wp:posOffset>1706350</wp:posOffset>
+                    <wp:posOffset>4004945</wp:posOffset>
                   </wp:positionH>
                   <wp:positionV relativeFrom="paragraph">
-                    <wp:posOffset>539115</wp:posOffset>
+                    <wp:posOffset>180975</wp:posOffset>
                   </wp:positionV>
                   <wp:extent cx="144145" cy="143510"/>
                   <wp:effectExtent l="0" t="0" r="8255" b="8890"/>
@@ -1115,16 +1099,49 @@
                 <w:color w:val="6A644E" w:themeColor="accent5"/>
                 <w:szCs w:val="28"/>
               </w:rPr>
-              <w:t>News Aggregator:</w:t>
-            </w:r>
-            <w:r>
-              <w:t xml:space="preserve">  </w:t>
-            </w:r>
-            <w:r>
-              <w:t>Full-stack news aggregation site pulling data from sources like BBC, NYT, Ynet, and Haaretz. Features dynamic loading, refresh functionality, and responsive card/list layouts. Showcases API integration and modern UI/UX design.</w:t>
-            </w:r>
-            <w:r>
-              <w:br/>
+              <w:t>All News</w:t>
+            </w:r>
+            <w:r>
+              <w:rPr>
+                <w:b/>
+                <w:color w:val="6A644E" w:themeColor="accent5"/>
+                <w:szCs w:val="28"/>
+              </w:rPr>
+              <w:t xml:space="preserve"> </w:t>
+            </w:r>
+            <w:r>
+              <w:rPr>
+                <w:b/>
+                <w:color w:val="6A644E" w:themeColor="accent5"/>
+                <w:szCs w:val="28"/>
+              </w:rPr>
+              <w:t>Aggregato</w:t>
+            </w:r>
+            <w:r>
+              <w:rPr>
+                <w:b/>
+                <w:color w:val="6A644E" w:themeColor="accent5"/>
+                <w:szCs w:val="28"/>
+              </w:rPr>
+              <w:t xml:space="preserve">r </w:t>
+            </w:r>
+            <w:r>
+              <w:t xml:space="preserve">Full-stack news aggregation site pulling data from sources like BBC, NYT and </w:t>
+            </w:r>
+            <w:r>
+              <w:t>Ynet</w:t>
+            </w:r>
+            <w:r>
+              <w:t xml:space="preserve">. Showcases API </w:t>
+            </w:r>
+            <w:r>
+              <w:t>integration</w:t>
+            </w:r>
+            <w:r>
+              <w:t>.</w:t>
+            </w:r>
+            <w:r>
+              <w:t xml:space="preserve"> </w:t>
             </w:r>
             <w:r>
               <w:t xml:space="preserve">Mobile: </w:t>
@@ -1148,13 +1165,13 @@
                 <w:noProof/>
               </w:rPr>
               <w:drawing>
-                <wp:anchor distT="0" distB="0" distL="114300" distR="114300" simplePos="0" relativeHeight="251698176" behindDoc="0" locked="0" layoutInCell="1" allowOverlap="1" wp14:anchorId="140BC948" wp14:editId="5327EF83">
+                <wp:anchor distT="0" distB="0" distL="114300" distR="114300" simplePos="0" relativeHeight="251698176" behindDoc="0" locked="0" layoutInCell="1" allowOverlap="1" wp14:anchorId="140BC948" wp14:editId="40DA6DF7">
                   <wp:simplePos x="0" y="0"/>
                   <wp:positionH relativeFrom="column">
-                    <wp:posOffset>5101590</wp:posOffset>
+                    <wp:posOffset>3298190</wp:posOffset>
                   </wp:positionH>
                   <wp:positionV relativeFrom="paragraph">
-                    <wp:posOffset>179866</wp:posOffset>
+                    <wp:posOffset>179781</wp:posOffset>
                   </wp:positionV>
                   <wp:extent cx="144714" cy="144000"/>
                   <wp:effectExtent l="0" t="0" r="8255" b="8890"/>
@@ -1226,37 +1243,19 @@
               <w:t xml:space="preserve"> </w:t>
             </w:r>
             <w:r>
-              <w:t>MNIST classifier</w:t>
-            </w:r>
-            <w:r>
-              <w:t>.</w:t>
+              <w:t>NumPy-only</w:t>
             </w:r>
             <w:r>
               <w:t xml:space="preserve"> </w:t>
             </w:r>
             <w:r>
-              <w:t>built NumPy-only</w:t>
+              <w:t>Implemented mini-batch SGD + L2 + dropout + early stopping (MSE). 98.41% clean test accuracy.</w:t>
             </w:r>
             <w:r>
               <w:t xml:space="preserve"> </w:t>
             </w:r>
             <w:r>
-              <w:t>trained with mini-batch SGD, L2, dropout, early stopping; MSE</w:t>
-            </w:r>
-            <w:r>
-              <w:t xml:space="preserve">. </w:t>
-            </w:r>
-            <w:r>
-              <w:t>Achieved a clean test accuracy of 98.41</w:t>
-            </w:r>
-            <w:r>
-              <w:t>%</w:t>
-            </w:r>
-            <w:r>
-              <w:t>.</w:t>
-            </w:r>
-            <w:r>
-              <w:t xml:space="preserve">  Live Site:</w:t>
+              <w:t>Live Site:</w:t>
             </w:r>
             <w:r>
               <w:br/>
@@ -1268,13 +1267,13 @@
                 <w:noProof/>
               </w:rPr>
               <w:drawing>
-                <wp:anchor distT="0" distB="0" distL="114300" distR="114300" simplePos="0" relativeHeight="251704320" behindDoc="0" locked="0" layoutInCell="1" allowOverlap="1" wp14:anchorId="07F322E3" wp14:editId="6E5285F3">
+                <wp:anchor distT="0" distB="0" distL="114300" distR="114300" simplePos="0" relativeHeight="251704320" behindDoc="0" locked="0" layoutInCell="1" allowOverlap="1" wp14:anchorId="07F322E3" wp14:editId="4B16CD97">
                   <wp:simplePos x="0" y="0"/>
                   <wp:positionH relativeFrom="column">
-                    <wp:posOffset>4357531</wp:posOffset>
+                    <wp:posOffset>4046220</wp:posOffset>
                   </wp:positionH>
                   <wp:positionV relativeFrom="paragraph">
-                    <wp:posOffset>360680</wp:posOffset>
+                    <wp:posOffset>189230</wp:posOffset>
                   </wp:positionV>
                   <wp:extent cx="144145" cy="143510"/>
                   <wp:effectExtent l="0" t="0" r="8255" b="8890"/>
@@ -1339,15 +1338,15 @@
                 <w:noProof/>
               </w:rPr>
               <w:drawing>
-                <wp:anchor distT="0" distB="0" distL="114300" distR="114300" simplePos="0" relativeHeight="251707392" behindDoc="0" locked="0" layoutInCell="1" allowOverlap="1" wp14:anchorId="5AC68D2C" wp14:editId="149CB3F5">
+                <wp:anchor distT="0" distB="0" distL="114300" distR="114300" simplePos="0" relativeHeight="251707392" behindDoc="0" locked="0" layoutInCell="1" allowOverlap="1" wp14:anchorId="5AC68D2C" wp14:editId="358F2E8F">
                   <wp:simplePos x="0" y="0"/>
                   <wp:positionH relativeFrom="column">
-                    <wp:posOffset>3756660</wp:posOffset>
+                    <wp:posOffset>3456305</wp:posOffset>
                   </wp:positionH>
                   <wp:positionV relativeFrom="paragraph">
-                    <wp:posOffset>349411</wp:posOffset>
+                    <wp:posOffset>178435</wp:posOffset>
                   </wp:positionV>
-                  <wp:extent cx="566592" cy="170993"/>
+                  <wp:extent cx="566420" cy="170815"/>
                   <wp:effectExtent l="0" t="0" r="5080" b="635"/>
                   <wp:wrapNone/>
                   <wp:docPr id="64329831" name="תמונה 1" descr="App Store Google Play PNGs for Free Download">
@@ -1383,7 +1382,7 @@
                         <pic:spPr bwMode="auto">
                           <a:xfrm>
                             <a:off x="0" y="0"/>
-                            <a:ext cx="566592" cy="170993"/>
+                            <a:ext cx="566420" cy="170815"/>
                           </a:xfrm>
                           <a:prstGeom prst="rect">
                             <a:avLst/>
@@ -1422,7 +1421,75 @@
               <w:t xml:space="preserve"> </w:t>
             </w:r>
             <w:r>
-              <w:t>Developed as part of an academic algorithms course, this tool visualizes prerequisite and course dependency graphs. Highlights include data parsing, interactive graph rendering, and real-time data visualization.</w:t>
+              <w:t xml:space="preserve"> Makes complex graph algorithms intuitive by visualizing BFS, DFS, Dijkstra, Bellman–Ford, Topological Sort, SCC, and more.</w:t>
+            </w:r>
+          </w:p>
+          <w:p>
+            <w:pPr>
+              <w:rPr>
+                <w:b/>
+                <w:color w:val="6A644E" w:themeColor="accent5"/>
+                <w:szCs w:val="28"/>
+              </w:rPr>
+            </w:pPr>
+          </w:p>
+          <w:p>
+            <w:r>
+              <w:rPr>
+                <w:b/>
+                <w:color w:val="6A644E" w:themeColor="accent5"/>
+                <w:szCs w:val="28"/>
+              </w:rPr>
+              <w:t>Mail</w:t>
+            </w:r>
+            <w:r>
+              <w:rPr>
+                <w:b/>
+                <w:color w:val="6A644E" w:themeColor="accent5"/>
+                <w:szCs w:val="28"/>
+              </w:rPr>
+              <w:t xml:space="preserve"> </w:t>
+            </w:r>
+            <w:r>
+              <w:rPr>
+                <w:b/>
+                <w:color w:val="6A644E" w:themeColor="accent5"/>
+                <w:szCs w:val="28"/>
+              </w:rPr>
+              <w:t>Saver</w:t>
+            </w:r>
+            <w:r>
+              <w:rPr>
+                <w:b/>
+                <w:color w:val="6A644E" w:themeColor="accent5"/>
+                <w:szCs w:val="28"/>
+              </w:rPr>
+              <w:t xml:space="preserve"> </w:t>
+            </w:r>
+            <w:r>
+              <w:rPr>
+                <w:b/>
+                <w:color w:val="6A644E" w:themeColor="accent5"/>
+                <w:szCs w:val="28"/>
+              </w:rPr>
+              <w:t>Bot</w:t>
+            </w:r>
+            <w:r>
+              <w:rPr>
+                <w:b/>
+                <w:color w:val="6A644E" w:themeColor="accent5"/>
+                <w:szCs w:val="28"/>
+              </w:rPr>
+              <w:t xml:space="preserve"> </w:t>
+            </w:r>
+            <w:r>
+              <w:t>: P</w:t>
+            </w:r>
+            <w:r>
+              <w:t>ython desktop tool that logs into Gmail via IMAP</w:t>
+            </w:r>
+            <w:r>
+              <w:t xml:space="preserve"> helps with cleanup space.</w:t>
             </w:r>
           </w:p>
         </w:tc>
@@ -1461,7 +1528,7 @@
       </w:tr>
       <w:tr>
         <w:trPr>
-          <w:trHeight w:val="18"/>
+          <w:trHeight w:val="175"/>
         </w:trPr>
         <w:tc>
           <w:tcPr>
@@ -5000,7 +5067,6 @@
   <w:style w:type="character" w:default="1" w:styleId="a1">
     <w:name w:val="Default Paragraph Font"/>
     <w:uiPriority w:val="1"/>
-    <w:semiHidden/>
     <w:unhideWhenUsed/>
   </w:style>
   <w:style w:type="table" w:default="1" w:styleId="a2">
@@ -5631,26 +5697,6 @@
 </file>
 
 <file path=customXml/item2.xml><?xml version="1.0" encoding="utf-8"?>
-<p:properties xmlns:p="http://schemas.microsoft.com/office/2006/metadata/properties" xmlns:xsi="http://www.w3.org/2001/XMLSchema-instance" xmlns:pc="http://schemas.microsoft.com/office/infopath/2007/PartnerControls">
-  <documentManagement>
-    <_ip_UnifiedCompliancePolicyUIAction xmlns="http://schemas.microsoft.com/sharepoint/v3" xsi:nil="true"/>
-    <Image xmlns="71af3243-3dd4-4a8d-8c0d-dd76da1f02a5">
-      <Url xsi:nil="true"/>
-      <Description xsi:nil="true"/>
-    </Image>
-    <Status xmlns="71af3243-3dd4-4a8d-8c0d-dd76da1f02a5">Not started</Status>
-    <Background xmlns="71af3243-3dd4-4a8d-8c0d-dd76da1f02a5">false</Background>
-    <_ip_UnifiedCompliancePolicyProperties xmlns="http://schemas.microsoft.com/sharepoint/v3" xsi:nil="true"/>
-    <ImageTagsTaxHTField xmlns="71af3243-3dd4-4a8d-8c0d-dd76da1f02a5">
-      <Terms xmlns="http://schemas.microsoft.com/office/infopath/2007/PartnerControls"/>
-    </ImageTagsTaxHTField>
-    <TaxCatchAll xmlns="230e9df3-be65-4c73-a93b-d1236ebd677e" xsi:nil="true"/>
-    <MediaServiceKeyPoints xmlns="71af3243-3dd4-4a8d-8c0d-dd76da1f02a5" xsi:nil="true"/>
-  </documentManagement>
-</p:properties>
-</file>
-
-<file path=customXml/item3.xml><?xml version="1.0" encoding="utf-8"?>
 <ct:contentTypeSchema xmlns:ct="http://schemas.microsoft.com/office/2006/metadata/contentType" xmlns:ma="http://schemas.microsoft.com/office/2006/metadata/properties/metaAttributes" ct:_="" ma:_="" ma:contentTypeName="Document" ma:contentTypeID="0x01010079F111ED35F8CC479449609E8A0923A6" ma:contentTypeVersion="28" ma:contentTypeDescription="Create a new document." ma:contentTypeScope="" ma:versionID="60f5a4f2d2b0abadcf532d48ebf9cb71">
   <xsd:schema xmlns:xsd="http://www.w3.org/2001/XMLSchema" xmlns:xs="http://www.w3.org/2001/XMLSchema" xmlns:p="http://schemas.microsoft.com/office/2006/metadata/properties" xmlns:ns1="http://schemas.microsoft.com/sharepoint/v3" xmlns:ns2="71af3243-3dd4-4a8d-8c0d-dd76da1f02a5" xmlns:ns3="16c05727-aa75-4e4a-9b5f-8a80a1165891" xmlns:ns4="230e9df3-be65-4c73-a93b-d1236ebd677e" targetNamespace="http://schemas.microsoft.com/office/2006/metadata/properties" ma:root="true" ma:fieldsID="7dd78129e6a1811f84807ad11c651531" ns1:_="" ns2:_="" ns3:_="" ns4:_="">
     <xsd:import namespace="http://schemas.microsoft.com/sharepoint/v3"/>
@@ -5962,6 +6008,26 @@
 </ct:contentTypeSchema>
 </file>
 
+<file path=customXml/item3.xml><?xml version="1.0" encoding="utf-8"?>
+<p:properties xmlns:p="http://schemas.microsoft.com/office/2006/metadata/properties" xmlns:xsi="http://www.w3.org/2001/XMLSchema-instance" xmlns:pc="http://schemas.microsoft.com/office/infopath/2007/PartnerControls">
+  <documentManagement>
+    <_ip_UnifiedCompliancePolicyUIAction xmlns="http://schemas.microsoft.com/sharepoint/v3" xsi:nil="true"/>
+    <Image xmlns="71af3243-3dd4-4a8d-8c0d-dd76da1f02a5">
+      <Url xsi:nil="true"/>
+      <Description xsi:nil="true"/>
+    </Image>
+    <Status xmlns="71af3243-3dd4-4a8d-8c0d-dd76da1f02a5">Not started</Status>
+    <Background xmlns="71af3243-3dd4-4a8d-8c0d-dd76da1f02a5">false</Background>
+    <_ip_UnifiedCompliancePolicyProperties xmlns="http://schemas.microsoft.com/sharepoint/v3" xsi:nil="true"/>
+    <ImageTagsTaxHTField xmlns="71af3243-3dd4-4a8d-8c0d-dd76da1f02a5">
+      <Terms xmlns="http://schemas.microsoft.com/office/infopath/2007/PartnerControls"/>
+    </ImageTagsTaxHTField>
+    <TaxCatchAll xmlns="230e9df3-be65-4c73-a93b-d1236ebd677e" xsi:nil="true"/>
+    <MediaServiceKeyPoints xmlns="71af3243-3dd4-4a8d-8c0d-dd76da1f02a5" xsi:nil="true"/>
+  </documentManagement>
+</p:properties>
+</file>
+
 <file path=customXml/itemProps1.xml><?xml version="1.0" encoding="utf-8"?>
 <ds:datastoreItem xmlns:ds="http://schemas.openxmlformats.org/officeDocument/2006/customXml" ds:itemID="{16C9806D-6FA0-4039-A2F4-D6C733EEB38B}">
   <ds:schemaRefs>
@@ -5971,18 +6037,6 @@
 </file>
 
 <file path=customXml/itemProps2.xml><?xml version="1.0" encoding="utf-8"?>
-<ds:datastoreItem xmlns:ds="http://schemas.openxmlformats.org/officeDocument/2006/customXml" ds:itemID="{13B40C1D-7939-44F4-990C-CB06DFE0EF80}">
-  <ds:schemaRefs>
-    <ds:schemaRef ds:uri="http://schemas.microsoft.com/office/2006/metadata/properties"/>
-    <ds:schemaRef ds:uri="http://schemas.microsoft.com/office/infopath/2007/PartnerControls"/>
-    <ds:schemaRef ds:uri="http://schemas.microsoft.com/sharepoint/v3"/>
-    <ds:schemaRef ds:uri="71af3243-3dd4-4a8d-8c0d-dd76da1f02a5"/>
-    <ds:schemaRef ds:uri="230e9df3-be65-4c73-a93b-d1236ebd677e"/>
-  </ds:schemaRefs>
-</ds:datastoreItem>
-</file>
-
-<file path=customXml/itemProps3.xml><?xml version="1.0" encoding="utf-8"?>
 <ds:datastoreItem xmlns:ds="http://schemas.openxmlformats.org/officeDocument/2006/customXml" ds:itemID="{98FC8582-55FF-4BED-ABF3-70ED2D2AFB76}">
   <ds:schemaRefs>
     <ds:schemaRef ds:uri="http://schemas.microsoft.com/office/2006/metadata/contentType"/>
@@ -6003,6 +6057,18 @@
 </ds:datastoreItem>
 </file>
 
+<file path=customXml/itemProps3.xml><?xml version="1.0" encoding="utf-8"?>
+<ds:datastoreItem xmlns:ds="http://schemas.openxmlformats.org/officeDocument/2006/customXml" ds:itemID="{13B40C1D-7939-44F4-990C-CB06DFE0EF80}">
+  <ds:schemaRefs>
+    <ds:schemaRef ds:uri="http://schemas.microsoft.com/office/2006/metadata/properties"/>
+    <ds:schemaRef ds:uri="http://schemas.microsoft.com/office/infopath/2007/PartnerControls"/>
+    <ds:schemaRef ds:uri="http://schemas.microsoft.com/sharepoint/v3"/>
+    <ds:schemaRef ds:uri="71af3243-3dd4-4a8d-8c0d-dd76da1f02a5"/>
+    <ds:schemaRef ds:uri="230e9df3-be65-4c73-a93b-d1236ebd677e"/>
+  </ds:schemaRefs>
+</ds:datastoreItem>
+</file>
+
 <file path=docMetadata/LabelInfo.xml><?xml version="1.0" encoding="utf-8"?>
 <clbl:labelList xmlns:clbl="http://schemas.microsoft.com/office/2020/mipLabelMetadata"/>
 </file>
</xml_diff>

<commit_message>
about me shorter for ephaszie React and fix projects descptions
</commit_message>
<xml_diff>
--- a/CV-RenanBazinin.docx
+++ b/CV-RenanBazinin.docx
@@ -411,7 +411,19 @@
               <w:t>60 GitHub repositories</w:t>
             </w:r>
             <w:r>
-              <w:t xml:space="preserve"> and OSS contributions; hands-on with React and full-stack</w:t>
+              <w:t xml:space="preserve"> and OSS contributions</w:t>
+            </w:r>
+            <w:r>
+              <w:t>.</w:t>
+            </w:r>
+            <w:r>
+              <w:t xml:space="preserve"> </w:t>
+            </w:r>
+            <w:r>
+              <w:t xml:space="preserve"> </w:t>
+            </w:r>
+            <w:r>
+              <w:t>Experienced with React and full-stack JavaScript</w:t>
             </w:r>
           </w:p>
         </w:tc>
@@ -860,109 +872,21 @@
           <w:p>
             <w:r>
               <w:rPr>
-                <w:b/>
-                <w:color w:val="6A644E" w:themeColor="accent5"/>
-                <w:szCs w:val="28"/>
-              </w:rPr>
-              <w:t>Developed a medical documentation tool</w:t>
-            </w:r>
-            <w:r>
-              <w:t xml:space="preserve"> - U</w:t>
-            </w:r>
-            <w:r>
-              <w:t>sing JavaScript during military service</w:t>
-            </w:r>
-            <w:r>
-              <w:br/>
-              <w:t>Streamlined daily patient registration as a medic, significantly improving documentation efficiency</w:t>
-            </w:r>
-            <w:r>
-              <w:t xml:space="preserve"> -</w:t>
-            </w:r>
-            <w:r>
-              <w:t xml:space="preserve"> </w:t>
-            </w:r>
-            <w:r>
-              <w:t>Won Colonel Award</w:t>
-            </w:r>
-          </w:p>
-        </w:tc>
-      </w:tr>
-      <w:tr>
-        <w:trPr>
-          <w:trHeight w:val="18"/>
-        </w:trPr>
-        <w:tc>
-          <w:tcPr>
-            <w:tcW w:w="11039" w:type="dxa"/>
-            <w:gridSpan w:val="6"/>
-          </w:tcPr>
-          <w:p>
-            <w:pPr>
-              <w:rPr>
-                <w:rFonts w:asciiTheme="majorHAnsi" w:eastAsiaTheme="majorEastAsia" w:hAnsiTheme="majorHAnsi" w:cstheme="majorBidi"/>
-                <w:b/>
-                <w:caps/>
-                <w:color w:val="6A644E" w:themeColor="accent5"/>
-                <w:szCs w:val="20"/>
-              </w:rPr>
-            </w:pPr>
-            <w:r>
-              <w:rPr>
-                <w:rFonts w:asciiTheme="majorHAnsi" w:eastAsiaTheme="majorEastAsia" w:hAnsiTheme="majorHAnsi" w:cstheme="majorBidi"/>
-                <w:b/>
-                <w:caps/>
-                <w:color w:val="6A644E" w:themeColor="accent5"/>
-                <w:szCs w:val="20"/>
-              </w:rPr>
-              <w:t>personal projects</w:t>
-            </w:r>
-          </w:p>
-        </w:tc>
-      </w:tr>
-      <w:tr>
-        <w:trPr>
-          <w:trHeight w:val="3206"/>
-        </w:trPr>
-        <w:tc>
-          <w:tcPr>
-            <w:tcW w:w="1690" w:type="dxa"/>
-          </w:tcPr>
-          <w:p>
-            <w:r>
-              <w:t>201</w:t>
-            </w:r>
-            <w:r>
-              <w:t>7</w:t>
-            </w:r>
-            <w:r>
-              <w:t>-2025</w:t>
-            </w:r>
-          </w:p>
-        </w:tc>
-        <w:tc>
-          <w:tcPr>
-            <w:tcW w:w="9349" w:type="dxa"/>
-            <w:gridSpan w:val="5"/>
-          </w:tcPr>
-          <w:p>
-            <w:r>
-              <w:rPr>
                 <w:noProof/>
               </w:rPr>
               <w:drawing>
-                <wp:anchor distT="0" distB="0" distL="114300" distR="114300" simplePos="0" relativeHeight="251705344" behindDoc="0" locked="0" layoutInCell="1" allowOverlap="1" wp14:anchorId="19F8AC32" wp14:editId="513808F2">
+                <wp:anchor distT="0" distB="0" distL="114300" distR="114300" simplePos="0" relativeHeight="251709440" behindDoc="0" locked="0" layoutInCell="1" allowOverlap="1" wp14:anchorId="2C398995" wp14:editId="1B2F6282">
                   <wp:simplePos x="0" y="0"/>
                   <wp:positionH relativeFrom="column">
-                    <wp:posOffset>2830195</wp:posOffset>
+                    <wp:posOffset>2736850</wp:posOffset>
                   </wp:positionH>
                   <wp:positionV relativeFrom="paragraph">
-                    <wp:posOffset>171450</wp:posOffset>
+                    <wp:posOffset>349885</wp:posOffset>
                   </wp:positionV>
-                  <wp:extent cx="566420" cy="170815"/>
-                  <wp:effectExtent l="0" t="0" r="5080" b="635"/>
+                  <wp:extent cx="144145" cy="143510"/>
+                  <wp:effectExtent l="0" t="0" r="8255" b="8890"/>
                   <wp:wrapNone/>
-                  <wp:docPr id="1443635511" name="תמונה 1" descr="App Store Google Play PNGs for Free Download">
+                  <wp:docPr id="1140009448" name="תמונה 3">
                     <a:hlinkClick xmlns:a="http://schemas.openxmlformats.org/drawingml/2006/main" r:id="rId17"/>
                   </wp:docPr>
                   <wp:cNvGraphicFramePr>
@@ -972,84 +896,8 @@
                     <a:graphicData uri="http://schemas.openxmlformats.org/drawingml/2006/picture">
                       <pic:pic xmlns:pic="http://schemas.openxmlformats.org/drawingml/2006/picture">
                         <pic:nvPicPr>
-                          <pic:cNvPr id="1443635511" name="תמונה 1" descr="App Store Google Play PNGs for Free Download">
+                          <pic:cNvPr id="1140009448" name="תמונה 3">
                             <a:hlinkClick r:id="rId17"/>
-                          </pic:cNvPr>
-                          <pic:cNvPicPr>
-                            <a:picLocks noChangeAspect="1" noChangeArrowheads="1"/>
-                          </pic:cNvPicPr>
-                        </pic:nvPicPr>
-                        <pic:blipFill rotWithShape="1">
-                          <a:blip r:embed="rId18" cstate="hqprint">
-                            <a:extLst>
-                              <a:ext uri="{28A0092B-C50C-407E-A947-70E740481C1C}">
-                                <a14:useLocalDpi xmlns:a14="http://schemas.microsoft.com/office/drawing/2010/main" val="0"/>
-                              </a:ext>
-                            </a:extLst>
-                          </a:blip>
-                          <a:srcRect l="4441" t="2784" r="2164" b="16490"/>
-                          <a:stretch>
-                            <a:fillRect/>
-                          </a:stretch>
-                        </pic:blipFill>
-                        <pic:spPr bwMode="auto">
-                          <a:xfrm>
-                            <a:off x="0" y="0"/>
-                            <a:ext cx="566420" cy="170815"/>
-                          </a:xfrm>
-                          <a:prstGeom prst="rect">
-                            <a:avLst/>
-                          </a:prstGeom>
-                          <a:noFill/>
-                          <a:ln>
-                            <a:noFill/>
-                          </a:ln>
-                          <a:extLst>
-                            <a:ext uri="{53640926-AAD7-44D8-BBD7-CCE9431645EC}">
-                              <a14:shadowObscured xmlns:a14="http://schemas.microsoft.com/office/drawing/2010/main"/>
-                            </a:ext>
-                          </a:extLst>
-                        </pic:spPr>
-                      </pic:pic>
-                    </a:graphicData>
-                  </a:graphic>
-                  <wp14:sizeRelH relativeFrom="page">
-                    <wp14:pctWidth>0</wp14:pctWidth>
-                  </wp14:sizeRelH>
-                  <wp14:sizeRelV relativeFrom="page">
-                    <wp14:pctHeight>0</wp14:pctHeight>
-                  </wp14:sizeRelV>
-                </wp:anchor>
-              </w:drawing>
-            </w:r>
-            <w:r>
-              <w:rPr>
-                <w:noProof/>
-              </w:rPr>
-              <w:drawing>
-                <wp:anchor distT="0" distB="0" distL="114300" distR="114300" simplePos="0" relativeHeight="251702272" behindDoc="0" locked="0" layoutInCell="1" allowOverlap="1" wp14:anchorId="35DAF6FC" wp14:editId="6BC95263">
-                  <wp:simplePos x="0" y="0"/>
-                  <wp:positionH relativeFrom="column">
-                    <wp:posOffset>4004945</wp:posOffset>
-                  </wp:positionH>
-                  <wp:positionV relativeFrom="paragraph">
-                    <wp:posOffset>180975</wp:posOffset>
-                  </wp:positionV>
-                  <wp:extent cx="144145" cy="143510"/>
-                  <wp:effectExtent l="0" t="0" r="8255" b="8890"/>
-                  <wp:wrapNone/>
-                  <wp:docPr id="1301193640" name="תמונה 3">
-                    <a:hlinkClick xmlns:a="http://schemas.openxmlformats.org/drawingml/2006/main" r:id="rId19"/>
-                  </wp:docPr>
-                  <wp:cNvGraphicFramePr>
-                    <a:graphicFrameLocks xmlns:a="http://schemas.openxmlformats.org/drawingml/2006/main" noChangeAspect="1"/>
-                  </wp:cNvGraphicFramePr>
-                  <a:graphic xmlns:a="http://schemas.openxmlformats.org/drawingml/2006/main">
-                    <a:graphicData uri="http://schemas.openxmlformats.org/drawingml/2006/picture">
-                      <pic:pic xmlns:pic="http://schemas.openxmlformats.org/drawingml/2006/picture">
-                        <pic:nvPicPr>
-                          <pic:cNvPr id="1301193640" name="תמונה 3">
-                            <a:hlinkClick r:id="rId19"/>
                           </pic:cNvPr>
                           <pic:cNvPicPr>
                             <a:picLocks noChangeAspect="1" noChangeArrowheads="1"/>
@@ -1099,6 +947,244 @@
                 <w:color w:val="6A644E" w:themeColor="accent5"/>
                 <w:szCs w:val="28"/>
               </w:rPr>
+              <w:t>Developed a medical documentation tool</w:t>
+            </w:r>
+            <w:r>
+              <w:t xml:space="preserve"> - U</w:t>
+            </w:r>
+            <w:r>
+              <w:t>sing JavaScript during military service</w:t>
+            </w:r>
+            <w:r>
+              <w:br/>
+              <w:t>Streamlined daily patient registration as a medic, significantly improving documentation efficiency</w:t>
+            </w:r>
+            <w:r>
+              <w:t xml:space="preserve"> -</w:t>
+            </w:r>
+            <w:r>
+              <w:t xml:space="preserve"> </w:t>
+            </w:r>
+            <w:r>
+              <w:t>Won Colonel Award</w:t>
+            </w:r>
+            <w:r>
+              <w:t>. Demo Site:</w:t>
+            </w:r>
+          </w:p>
+        </w:tc>
+      </w:tr>
+      <w:tr>
+        <w:trPr>
+          <w:trHeight w:val="18"/>
+        </w:trPr>
+        <w:tc>
+          <w:tcPr>
+            <w:tcW w:w="11039" w:type="dxa"/>
+            <w:gridSpan w:val="6"/>
+          </w:tcPr>
+          <w:p>
+            <w:pPr>
+              <w:rPr>
+                <w:rFonts w:asciiTheme="majorHAnsi" w:eastAsiaTheme="majorEastAsia" w:hAnsiTheme="majorHAnsi" w:cstheme="majorBidi"/>
+                <w:b/>
+                <w:caps/>
+                <w:color w:val="6A644E" w:themeColor="accent5"/>
+                <w:szCs w:val="20"/>
+              </w:rPr>
+            </w:pPr>
+            <w:r>
+              <w:rPr>
+                <w:rFonts w:asciiTheme="majorHAnsi" w:eastAsiaTheme="majorEastAsia" w:hAnsiTheme="majorHAnsi" w:cstheme="majorBidi"/>
+                <w:b/>
+                <w:caps/>
+                <w:color w:val="6A644E" w:themeColor="accent5"/>
+                <w:szCs w:val="20"/>
+              </w:rPr>
+              <w:t>personal projects</w:t>
+            </w:r>
+          </w:p>
+        </w:tc>
+      </w:tr>
+      <w:tr>
+        <w:trPr>
+          <w:trHeight w:val="2845"/>
+        </w:trPr>
+        <w:tc>
+          <w:tcPr>
+            <w:tcW w:w="1690" w:type="dxa"/>
+          </w:tcPr>
+          <w:p>
+            <w:r>
+              <w:t>201</w:t>
+            </w:r>
+            <w:r>
+              <w:t>7</w:t>
+            </w:r>
+            <w:r>
+              <w:t>-2025</w:t>
+            </w:r>
+          </w:p>
+        </w:tc>
+        <w:tc>
+          <w:tcPr>
+            <w:tcW w:w="9349" w:type="dxa"/>
+            <w:gridSpan w:val="5"/>
+          </w:tcPr>
+          <w:p>
+            <w:r>
+              <w:rPr>
+                <w:noProof/>
+              </w:rPr>
+              <w:drawing>
+                <wp:anchor distT="0" distB="0" distL="114300" distR="114300" simplePos="0" relativeHeight="251705344" behindDoc="0" locked="0" layoutInCell="1" allowOverlap="1" wp14:anchorId="19F8AC32" wp14:editId="513808F2">
+                  <wp:simplePos x="0" y="0"/>
+                  <wp:positionH relativeFrom="column">
+                    <wp:posOffset>2830195</wp:posOffset>
+                  </wp:positionH>
+                  <wp:positionV relativeFrom="paragraph">
+                    <wp:posOffset>171450</wp:posOffset>
+                  </wp:positionV>
+                  <wp:extent cx="566420" cy="170815"/>
+                  <wp:effectExtent l="0" t="0" r="5080" b="635"/>
+                  <wp:wrapNone/>
+                  <wp:docPr id="1443635511" name="תמונה 1" descr="App Store Google Play PNGs for Free Download">
+                    <a:hlinkClick xmlns:a="http://schemas.openxmlformats.org/drawingml/2006/main" r:id="rId18"/>
+                  </wp:docPr>
+                  <wp:cNvGraphicFramePr>
+                    <a:graphicFrameLocks xmlns:a="http://schemas.openxmlformats.org/drawingml/2006/main" noChangeAspect="1"/>
+                  </wp:cNvGraphicFramePr>
+                  <a:graphic xmlns:a="http://schemas.openxmlformats.org/drawingml/2006/main">
+                    <a:graphicData uri="http://schemas.openxmlformats.org/drawingml/2006/picture">
+                      <pic:pic xmlns:pic="http://schemas.openxmlformats.org/drawingml/2006/picture">
+                        <pic:nvPicPr>
+                          <pic:cNvPr id="1443635511" name="תמונה 1" descr="App Store Google Play PNGs for Free Download">
+                            <a:hlinkClick r:id="rId18"/>
+                          </pic:cNvPr>
+                          <pic:cNvPicPr>
+                            <a:picLocks noChangeAspect="1" noChangeArrowheads="1"/>
+                          </pic:cNvPicPr>
+                        </pic:nvPicPr>
+                        <pic:blipFill rotWithShape="1">
+                          <a:blip r:embed="rId19" cstate="hqprint">
+                            <a:extLst>
+                              <a:ext uri="{28A0092B-C50C-407E-A947-70E740481C1C}">
+                                <a14:useLocalDpi xmlns:a14="http://schemas.microsoft.com/office/drawing/2010/main" val="0"/>
+                              </a:ext>
+                            </a:extLst>
+                          </a:blip>
+                          <a:srcRect l="4441" t="2784" r="2164" b="16490"/>
+                          <a:stretch>
+                            <a:fillRect/>
+                          </a:stretch>
+                        </pic:blipFill>
+                        <pic:spPr bwMode="auto">
+                          <a:xfrm>
+                            <a:off x="0" y="0"/>
+                            <a:ext cx="566420" cy="170815"/>
+                          </a:xfrm>
+                          <a:prstGeom prst="rect">
+                            <a:avLst/>
+                          </a:prstGeom>
+                          <a:noFill/>
+                          <a:ln>
+                            <a:noFill/>
+                          </a:ln>
+                          <a:extLst>
+                            <a:ext uri="{53640926-AAD7-44D8-BBD7-CCE9431645EC}">
+                              <a14:shadowObscured xmlns:a14="http://schemas.microsoft.com/office/drawing/2010/main"/>
+                            </a:ext>
+                          </a:extLst>
+                        </pic:spPr>
+                      </pic:pic>
+                    </a:graphicData>
+                  </a:graphic>
+                  <wp14:sizeRelH relativeFrom="page">
+                    <wp14:pctWidth>0</wp14:pctWidth>
+                  </wp14:sizeRelH>
+                  <wp14:sizeRelV relativeFrom="page">
+                    <wp14:pctHeight>0</wp14:pctHeight>
+                  </wp14:sizeRelV>
+                </wp:anchor>
+              </w:drawing>
+            </w:r>
+            <w:r>
+              <w:rPr>
+                <w:noProof/>
+              </w:rPr>
+              <w:drawing>
+                <wp:anchor distT="0" distB="0" distL="114300" distR="114300" simplePos="0" relativeHeight="251702272" behindDoc="0" locked="0" layoutInCell="1" allowOverlap="1" wp14:anchorId="35DAF6FC" wp14:editId="6BC95263">
+                  <wp:simplePos x="0" y="0"/>
+                  <wp:positionH relativeFrom="column">
+                    <wp:posOffset>4004945</wp:posOffset>
+                  </wp:positionH>
+                  <wp:positionV relativeFrom="paragraph">
+                    <wp:posOffset>180975</wp:posOffset>
+                  </wp:positionV>
+                  <wp:extent cx="144145" cy="143510"/>
+                  <wp:effectExtent l="0" t="0" r="8255" b="8890"/>
+                  <wp:wrapNone/>
+                  <wp:docPr id="1301193640" name="תמונה 3">
+                    <a:hlinkClick xmlns:a="http://schemas.openxmlformats.org/drawingml/2006/main" r:id="rId20"/>
+                  </wp:docPr>
+                  <wp:cNvGraphicFramePr>
+                    <a:graphicFrameLocks xmlns:a="http://schemas.openxmlformats.org/drawingml/2006/main" noChangeAspect="1"/>
+                  </wp:cNvGraphicFramePr>
+                  <a:graphic xmlns:a="http://schemas.openxmlformats.org/drawingml/2006/main">
+                    <a:graphicData uri="http://schemas.openxmlformats.org/drawingml/2006/picture">
+                      <pic:pic xmlns:pic="http://schemas.openxmlformats.org/drawingml/2006/picture">
+                        <pic:nvPicPr>
+                          <pic:cNvPr id="1301193640" name="תמונה 3">
+                            <a:hlinkClick r:id="rId20"/>
+                          </pic:cNvPr>
+                          <pic:cNvPicPr>
+                            <a:picLocks noChangeAspect="1" noChangeArrowheads="1"/>
+                          </pic:cNvPicPr>
+                        </pic:nvPicPr>
+                        <pic:blipFill>
+                          <a:blip r:embed="rId16" cstate="hqprint">
+                            <a:extLst>
+                              <a:ext uri="{28A0092B-C50C-407E-A947-70E740481C1C}">
+                                <a14:useLocalDpi xmlns:a14="http://schemas.microsoft.com/office/drawing/2010/main" val="0"/>
+                              </a:ext>
+                            </a:extLst>
+                          </a:blip>
+                          <a:srcRect/>
+                          <a:stretch>
+                            <a:fillRect/>
+                          </a:stretch>
+                        </pic:blipFill>
+                        <pic:spPr bwMode="auto">
+                          <a:xfrm>
+                            <a:off x="0" y="0"/>
+                            <a:ext cx="144145" cy="143510"/>
+                          </a:xfrm>
+                          <a:prstGeom prst="rect">
+                            <a:avLst/>
+                          </a:prstGeom>
+                          <a:noFill/>
+                          <a:ln>
+                            <a:noFill/>
+                          </a:ln>
+                        </pic:spPr>
+                      </pic:pic>
+                    </a:graphicData>
+                  </a:graphic>
+                  <wp14:sizeRelH relativeFrom="page">
+                    <wp14:pctWidth>0</wp14:pctWidth>
+                  </wp14:sizeRelH>
+                  <wp14:sizeRelV relativeFrom="page">
+                    <wp14:pctHeight>0</wp14:pctHeight>
+                  </wp14:sizeRelV>
+                </wp:anchor>
+              </w:drawing>
+            </w:r>
+            <w:r>
+              <w:rPr>
+                <w:b/>
+                <w:color w:val="6A644E" w:themeColor="accent5"/>
+                <w:szCs w:val="28"/>
+              </w:rPr>
               <w:t>All News</w:t>
             </w:r>
             <w:r>
@@ -1177,7 +1263,7 @@
                   <wp:effectExtent l="0" t="0" r="8255" b="8890"/>
                   <wp:wrapNone/>
                   <wp:docPr id="1376832234" name="תמונה 3">
-                    <a:hlinkClick xmlns:a="http://schemas.openxmlformats.org/drawingml/2006/main" r:id="rId20"/>
+                    <a:hlinkClick xmlns:a="http://schemas.openxmlformats.org/drawingml/2006/main" r:id="rId21"/>
                   </wp:docPr>
                   <wp:cNvGraphicFramePr>
                     <a:graphicFrameLocks xmlns:a="http://schemas.openxmlformats.org/drawingml/2006/main" noChangeAspect="1"/>
@@ -1187,7 +1273,7 @@
                       <pic:pic xmlns:pic="http://schemas.openxmlformats.org/drawingml/2006/picture">
                         <pic:nvPicPr>
                           <pic:cNvPr id="1376832234" name="תמונה 3">
-                            <a:hlinkClick r:id="rId20"/>
+                            <a:hlinkClick r:id="rId21"/>
                           </pic:cNvPr>
                           <pic:cNvPicPr>
                             <a:picLocks noChangeAspect="1" noChangeArrowheads="1"/>
@@ -1279,7 +1365,7 @@
                   <wp:effectExtent l="0" t="0" r="8255" b="8890"/>
                   <wp:wrapNone/>
                   <wp:docPr id="1651156932" name="תמונה 3">
-                    <a:hlinkClick xmlns:a="http://schemas.openxmlformats.org/drawingml/2006/main" r:id="rId21"/>
+                    <a:hlinkClick xmlns:a="http://schemas.openxmlformats.org/drawingml/2006/main" r:id="rId22"/>
                   </wp:docPr>
                   <wp:cNvGraphicFramePr>
                     <a:graphicFrameLocks xmlns:a="http://schemas.openxmlformats.org/drawingml/2006/main" noChangeAspect="1"/>
@@ -1289,7 +1375,7 @@
                       <pic:pic xmlns:pic="http://schemas.openxmlformats.org/drawingml/2006/picture">
                         <pic:nvPicPr>
                           <pic:cNvPr id="1651156932" name="תמונה 3">
-                            <a:hlinkClick r:id="rId21"/>
+                            <a:hlinkClick r:id="rId22"/>
                           </pic:cNvPr>
                           <pic:cNvPicPr>
                             <a:picLocks noChangeAspect="1" noChangeArrowheads="1"/>
@@ -1350,7 +1436,7 @@
                   <wp:effectExtent l="0" t="0" r="5080" b="635"/>
                   <wp:wrapNone/>
                   <wp:docPr id="64329831" name="תמונה 1" descr="App Store Google Play PNGs for Free Download">
-                    <a:hlinkClick xmlns:a="http://schemas.openxmlformats.org/drawingml/2006/main" r:id="rId22"/>
+                    <a:hlinkClick xmlns:a="http://schemas.openxmlformats.org/drawingml/2006/main" r:id="rId23"/>
                   </wp:docPr>
                   <wp:cNvGraphicFramePr>
                     <a:graphicFrameLocks xmlns:a="http://schemas.openxmlformats.org/drawingml/2006/main" noChangeAspect="1"/>
@@ -1360,14 +1446,14 @@
                       <pic:pic xmlns:pic="http://schemas.openxmlformats.org/drawingml/2006/picture">
                         <pic:nvPicPr>
                           <pic:cNvPr id="64329831" name="תמונה 1" descr="App Store Google Play PNGs for Free Download">
-                            <a:hlinkClick r:id="rId22"/>
+                            <a:hlinkClick r:id="rId23"/>
                           </pic:cNvPr>
                           <pic:cNvPicPr>
                             <a:picLocks noChangeAspect="1" noChangeArrowheads="1"/>
                           </pic:cNvPicPr>
                         </pic:nvPicPr>
                         <pic:blipFill rotWithShape="1">
-                          <a:blip r:embed="rId18" cstate="hqprint">
+                          <a:blip r:embed="rId19" cstate="hqprint">
                             <a:extLst>
                               <a:ext uri="{28A0092B-C50C-407E-A947-70E740481C1C}">
                                 <a14:useLocalDpi xmlns:a14="http://schemas.microsoft.com/office/drawing/2010/main" val="0"/>
@@ -1472,15 +1558,7 @@
                 <w:color w:val="6A644E" w:themeColor="accent5"/>
                 <w:szCs w:val="28"/>
               </w:rPr>
-              <w:t>Bot</w:t>
-            </w:r>
-            <w:r>
-              <w:rPr>
-                <w:b/>
-                <w:color w:val="6A644E" w:themeColor="accent5"/>
-                <w:szCs w:val="28"/>
-              </w:rPr>
-              <w:t xml:space="preserve"> </w:t>
+              <w:t xml:space="preserve">Bot </w:t>
             </w:r>
             <w:r>
               <w:t>: P</w:t>
@@ -2105,12 +2183,12 @@
       </w:pPr>
     </w:p>
     <w:sectPr>
-      <w:headerReference w:type="even" r:id="rId23"/>
-      <w:headerReference w:type="default" r:id="rId24"/>
-      <w:footerReference w:type="even" r:id="rId25"/>
-      <w:footerReference w:type="default" r:id="rId26"/>
-      <w:headerReference w:type="first" r:id="rId27"/>
-      <w:footerReference w:type="first" r:id="rId28"/>
+      <w:headerReference w:type="even" r:id="rId24"/>
+      <w:headerReference w:type="default" r:id="rId25"/>
+      <w:footerReference w:type="even" r:id="rId26"/>
+      <w:footerReference w:type="default" r:id="rId27"/>
+      <w:headerReference w:type="first" r:id="rId28"/>
+      <w:footerReference w:type="first" r:id="rId29"/>
       <w:pgSz w:w="12240" w:h="15840"/>
       <w:pgMar w:top="0" w:right="720" w:bottom="720" w:left="794" w:header="0" w:footer="0" w:gutter="0"/>
       <w:cols w:space="720"/>
@@ -5067,6 +5145,7 @@
   <w:style w:type="character" w:default="1" w:styleId="a1">
     <w:name w:val="Default Paragraph Font"/>
     <w:uiPriority w:val="1"/>
+    <w:semiHidden/>
     <w:unhideWhenUsed/>
   </w:style>
   <w:style w:type="table" w:default="1" w:styleId="a2">
@@ -5697,6 +5776,26 @@
 </file>
 
 <file path=customXml/item2.xml><?xml version="1.0" encoding="utf-8"?>
+<p:properties xmlns:p="http://schemas.microsoft.com/office/2006/metadata/properties" xmlns:xsi="http://www.w3.org/2001/XMLSchema-instance" xmlns:pc="http://schemas.microsoft.com/office/infopath/2007/PartnerControls">
+  <documentManagement>
+    <_ip_UnifiedCompliancePolicyUIAction xmlns="http://schemas.microsoft.com/sharepoint/v3" xsi:nil="true"/>
+    <Image xmlns="71af3243-3dd4-4a8d-8c0d-dd76da1f02a5">
+      <Url xsi:nil="true"/>
+      <Description xsi:nil="true"/>
+    </Image>
+    <Status xmlns="71af3243-3dd4-4a8d-8c0d-dd76da1f02a5">Not started</Status>
+    <Background xmlns="71af3243-3dd4-4a8d-8c0d-dd76da1f02a5">false</Background>
+    <_ip_UnifiedCompliancePolicyProperties xmlns="http://schemas.microsoft.com/sharepoint/v3" xsi:nil="true"/>
+    <ImageTagsTaxHTField xmlns="71af3243-3dd4-4a8d-8c0d-dd76da1f02a5">
+      <Terms xmlns="http://schemas.microsoft.com/office/infopath/2007/PartnerControls"/>
+    </ImageTagsTaxHTField>
+    <TaxCatchAll xmlns="230e9df3-be65-4c73-a93b-d1236ebd677e" xsi:nil="true"/>
+    <MediaServiceKeyPoints xmlns="71af3243-3dd4-4a8d-8c0d-dd76da1f02a5" xsi:nil="true"/>
+  </documentManagement>
+</p:properties>
+</file>
+
+<file path=customXml/item3.xml><?xml version="1.0" encoding="utf-8"?>
 <ct:contentTypeSchema xmlns:ct="http://schemas.microsoft.com/office/2006/metadata/contentType" xmlns:ma="http://schemas.microsoft.com/office/2006/metadata/properties/metaAttributes" ct:_="" ma:_="" ma:contentTypeName="Document" ma:contentTypeID="0x01010079F111ED35F8CC479449609E8A0923A6" ma:contentTypeVersion="28" ma:contentTypeDescription="Create a new document." ma:contentTypeScope="" ma:versionID="60f5a4f2d2b0abadcf532d48ebf9cb71">
   <xsd:schema xmlns:xsd="http://www.w3.org/2001/XMLSchema" xmlns:xs="http://www.w3.org/2001/XMLSchema" xmlns:p="http://schemas.microsoft.com/office/2006/metadata/properties" xmlns:ns1="http://schemas.microsoft.com/sharepoint/v3" xmlns:ns2="71af3243-3dd4-4a8d-8c0d-dd76da1f02a5" xmlns:ns3="16c05727-aa75-4e4a-9b5f-8a80a1165891" xmlns:ns4="230e9df3-be65-4c73-a93b-d1236ebd677e" targetNamespace="http://schemas.microsoft.com/office/2006/metadata/properties" ma:root="true" ma:fieldsID="7dd78129e6a1811f84807ad11c651531" ns1:_="" ns2:_="" ns3:_="" ns4:_="">
     <xsd:import namespace="http://schemas.microsoft.com/sharepoint/v3"/>
@@ -6008,26 +6107,6 @@
 </ct:contentTypeSchema>
 </file>
 
-<file path=customXml/item3.xml><?xml version="1.0" encoding="utf-8"?>
-<p:properties xmlns:p="http://schemas.microsoft.com/office/2006/metadata/properties" xmlns:xsi="http://www.w3.org/2001/XMLSchema-instance" xmlns:pc="http://schemas.microsoft.com/office/infopath/2007/PartnerControls">
-  <documentManagement>
-    <_ip_UnifiedCompliancePolicyUIAction xmlns="http://schemas.microsoft.com/sharepoint/v3" xsi:nil="true"/>
-    <Image xmlns="71af3243-3dd4-4a8d-8c0d-dd76da1f02a5">
-      <Url xsi:nil="true"/>
-      <Description xsi:nil="true"/>
-    </Image>
-    <Status xmlns="71af3243-3dd4-4a8d-8c0d-dd76da1f02a5">Not started</Status>
-    <Background xmlns="71af3243-3dd4-4a8d-8c0d-dd76da1f02a5">false</Background>
-    <_ip_UnifiedCompliancePolicyProperties xmlns="http://schemas.microsoft.com/sharepoint/v3" xsi:nil="true"/>
-    <ImageTagsTaxHTField xmlns="71af3243-3dd4-4a8d-8c0d-dd76da1f02a5">
-      <Terms xmlns="http://schemas.microsoft.com/office/infopath/2007/PartnerControls"/>
-    </ImageTagsTaxHTField>
-    <TaxCatchAll xmlns="230e9df3-be65-4c73-a93b-d1236ebd677e" xsi:nil="true"/>
-    <MediaServiceKeyPoints xmlns="71af3243-3dd4-4a8d-8c0d-dd76da1f02a5" xsi:nil="true"/>
-  </documentManagement>
-</p:properties>
-</file>
-
 <file path=customXml/itemProps1.xml><?xml version="1.0" encoding="utf-8"?>
 <ds:datastoreItem xmlns:ds="http://schemas.openxmlformats.org/officeDocument/2006/customXml" ds:itemID="{16C9806D-6FA0-4039-A2F4-D6C733EEB38B}">
   <ds:schemaRefs>
@@ -6037,6 +6116,18 @@
 </file>
 
 <file path=customXml/itemProps2.xml><?xml version="1.0" encoding="utf-8"?>
+<ds:datastoreItem xmlns:ds="http://schemas.openxmlformats.org/officeDocument/2006/customXml" ds:itemID="{13B40C1D-7939-44F4-990C-CB06DFE0EF80}">
+  <ds:schemaRefs>
+    <ds:schemaRef ds:uri="http://schemas.microsoft.com/office/2006/metadata/properties"/>
+    <ds:schemaRef ds:uri="http://schemas.microsoft.com/office/infopath/2007/PartnerControls"/>
+    <ds:schemaRef ds:uri="http://schemas.microsoft.com/sharepoint/v3"/>
+    <ds:schemaRef ds:uri="71af3243-3dd4-4a8d-8c0d-dd76da1f02a5"/>
+    <ds:schemaRef ds:uri="230e9df3-be65-4c73-a93b-d1236ebd677e"/>
+  </ds:schemaRefs>
+</ds:datastoreItem>
+</file>
+
+<file path=customXml/itemProps3.xml><?xml version="1.0" encoding="utf-8"?>
 <ds:datastoreItem xmlns:ds="http://schemas.openxmlformats.org/officeDocument/2006/customXml" ds:itemID="{98FC8582-55FF-4BED-ABF3-70ED2D2AFB76}">
   <ds:schemaRefs>
     <ds:schemaRef ds:uri="http://schemas.microsoft.com/office/2006/metadata/contentType"/>
@@ -6057,18 +6148,6 @@
 </ds:datastoreItem>
 </file>
 
-<file path=customXml/itemProps3.xml><?xml version="1.0" encoding="utf-8"?>
-<ds:datastoreItem xmlns:ds="http://schemas.openxmlformats.org/officeDocument/2006/customXml" ds:itemID="{13B40C1D-7939-44F4-990C-CB06DFE0EF80}">
-  <ds:schemaRefs>
-    <ds:schemaRef ds:uri="http://schemas.microsoft.com/office/2006/metadata/properties"/>
-    <ds:schemaRef ds:uri="http://schemas.microsoft.com/office/infopath/2007/PartnerControls"/>
-    <ds:schemaRef ds:uri="http://schemas.microsoft.com/sharepoint/v3"/>
-    <ds:schemaRef ds:uri="71af3243-3dd4-4a8d-8c0d-dd76da1f02a5"/>
-    <ds:schemaRef ds:uri="230e9df3-be65-4c73-a93b-d1236ebd677e"/>
-  </ds:schemaRefs>
-</ds:datastoreItem>
-</file>
-
 <file path=docMetadata/LabelInfo.xml><?xml version="1.0" encoding="utf-8"?>
 <clbl:labelList xmlns:clbl="http://schemas.microsoft.com/office/2020/mipLabelMetadata"/>
 </file>
</xml_diff>

<commit_message>
fixes chat suggest small fixes
</commit_message>
<xml_diff>
--- a/CV-RenanBazinin.docx
+++ b/CV-RenanBazinin.docx
@@ -128,7 +128,7 @@
                   <wp:effectExtent l="0" t="0" r="0" b="0"/>
                   <wp:wrapNone/>
                   <wp:docPr id="430667612" name="תמונה 1" descr="Github Logo - Free social media icons">
-                    <a:hlinkClick xmlns:a="http://schemas.openxmlformats.org/drawingml/2006/main" r:id="rId10"/>
+                    <a:hlinkClick xmlns:a="http://schemas.openxmlformats.org/drawingml/2006/main" r:id="rId11"/>
                   </wp:docPr>
                   <wp:cNvGraphicFramePr>
                     <a:graphicFrameLocks xmlns:a="http://schemas.openxmlformats.org/drawingml/2006/main" noChangeAspect="1"/>
@@ -138,14 +138,14 @@
                       <pic:pic xmlns:pic="http://schemas.openxmlformats.org/drawingml/2006/picture">
                         <pic:nvPicPr>
                           <pic:cNvPr id="430667612" name="תמונה 1" descr="Github Logo - Free social media icons">
-                            <a:hlinkClick r:id="rId10"/>
+                            <a:hlinkClick r:id="rId11"/>
                           </pic:cNvPr>
                           <pic:cNvPicPr>
                             <a:picLocks noChangeAspect="1" noChangeArrowheads="1"/>
                           </pic:cNvPicPr>
                         </pic:nvPicPr>
                         <pic:blipFill>
-                          <a:blip r:embed="rId11" cstate="hqprint">
+                          <a:blip r:embed="rId12" cstate="hqprint">
                             <a:extLst>
                               <a:ext uri="{28A0092B-C50C-407E-A947-70E740481C1C}">
                                 <a14:useLocalDpi xmlns:a14="http://schemas.microsoft.com/office/drawing/2010/main" val="0"/>
@@ -236,7 +236,7 @@
               </w:rPr>
               <w:t xml:space="preserve">My Portfolio:   </w:t>
             </w:r>
-            <w:hyperlink r:id="rId12" w:history="1">
+            <w:hyperlink r:id="rId13" w:history="1">
               <w:r>
                 <w:rPr>
                   <w:rStyle w:val="Hyperlink"/>
@@ -277,7 +277,7 @@
                   <wp:effectExtent l="0" t="0" r="0" b="0"/>
                   <wp:wrapNone/>
                   <wp:docPr id="1482639506" name="תמונה 2" descr="vecteezy_linkedin-logo-png-linkedin-icon-transparent-png_18930585_835 –  Blake Oliver">
-                    <a:hlinkClick xmlns:a="http://schemas.openxmlformats.org/drawingml/2006/main" r:id="rId13"/>
+                    <a:hlinkClick xmlns:a="http://schemas.openxmlformats.org/drawingml/2006/main" r:id="rId14"/>
                   </wp:docPr>
                   <wp:cNvGraphicFramePr>
                     <a:graphicFrameLocks xmlns:a="http://schemas.openxmlformats.org/drawingml/2006/main" noChangeAspect="1"/>
@@ -287,14 +287,14 @@
                       <pic:pic xmlns:pic="http://schemas.openxmlformats.org/drawingml/2006/picture">
                         <pic:nvPicPr>
                           <pic:cNvPr id="1482639506" name="תמונה 2" descr="vecteezy_linkedin-logo-png-linkedin-icon-transparent-png_18930585_835 –  Blake Oliver">
-                            <a:hlinkClick r:id="rId13"/>
+                            <a:hlinkClick r:id="rId14"/>
                           </pic:cNvPr>
                           <pic:cNvPicPr>
                             <a:picLocks noChangeAspect="1" noChangeArrowheads="1"/>
                           </pic:cNvPicPr>
                         </pic:nvPicPr>
                         <pic:blipFill rotWithShape="1">
-                          <a:blip r:embed="rId14" cstate="hqprint">
+                          <a:blip r:embed="rId15" cstate="hqprint">
                             <a:extLst>
                               <a:ext uri="{28A0092B-C50C-407E-A947-70E740481C1C}">
                                 <a14:useLocalDpi xmlns:a14="http://schemas.microsoft.com/office/drawing/2010/main" val="0"/>
@@ -397,7 +397,25 @@
           </w:tcPr>
           <w:p>
             <w:r>
-              <w:t xml:space="preserve">Engineer with </w:t>
+              <w:t xml:space="preserve">Aspiring </w:t>
+            </w:r>
+            <w:r>
+              <w:t>s</w:t>
+            </w:r>
+            <w:r>
+              <w:t xml:space="preserve">oftware </w:t>
+            </w:r>
+            <w:r>
+              <w:t>e</w:t>
+            </w:r>
+            <w:r>
+              <w:t>ngineer</w:t>
+            </w:r>
+            <w:r>
+              <w:t xml:space="preserve"> </w:t>
+            </w:r>
+            <w:r>
+              <w:t xml:space="preserve">with </w:t>
             </w:r>
             <w:r>
               <w:t xml:space="preserve">over </w:t>
@@ -665,7 +683,7 @@
                   <wp:effectExtent l="0" t="0" r="8255" b="8890"/>
                   <wp:wrapNone/>
                   <wp:docPr id="79867402" name="תמונה 3">
-                    <a:hlinkClick xmlns:a="http://schemas.openxmlformats.org/drawingml/2006/main" r:id="rId15"/>
+                    <a:hlinkClick xmlns:a="http://schemas.openxmlformats.org/drawingml/2006/main" r:id="rId16"/>
                   </wp:docPr>
                   <wp:cNvGraphicFramePr>
                     <a:graphicFrameLocks xmlns:a="http://schemas.openxmlformats.org/drawingml/2006/main" noChangeAspect="1"/>
@@ -675,14 +693,14 @@
                       <pic:pic xmlns:pic="http://schemas.openxmlformats.org/drawingml/2006/picture">
                         <pic:nvPicPr>
                           <pic:cNvPr id="79867402" name="תמונה 3">
-                            <a:hlinkClick r:id="rId15"/>
+                            <a:hlinkClick r:id="rId16"/>
                           </pic:cNvPr>
                           <pic:cNvPicPr>
                             <a:picLocks noChangeAspect="1" noChangeArrowheads="1"/>
                           </pic:cNvPicPr>
                         </pic:nvPicPr>
                         <pic:blipFill>
-                          <a:blip r:embed="rId16" cstate="hqprint">
+                          <a:blip r:embed="rId17" cstate="hqprint">
                             <a:extLst>
                               <a:ext uri="{28A0092B-C50C-407E-A947-70E740481C1C}">
                                 <a14:useLocalDpi xmlns:a14="http://schemas.microsoft.com/office/drawing/2010/main" val="0"/>
@@ -887,7 +905,7 @@
                   <wp:effectExtent l="0" t="0" r="8255" b="8890"/>
                   <wp:wrapNone/>
                   <wp:docPr id="1140009448" name="תמונה 3">
-                    <a:hlinkClick xmlns:a="http://schemas.openxmlformats.org/drawingml/2006/main" r:id="rId17"/>
+                    <a:hlinkClick xmlns:a="http://schemas.openxmlformats.org/drawingml/2006/main" r:id="rId18"/>
                   </wp:docPr>
                   <wp:cNvGraphicFramePr>
                     <a:graphicFrameLocks xmlns:a="http://schemas.openxmlformats.org/drawingml/2006/main" noChangeAspect="1"/>
@@ -897,14 +915,14 @@
                       <pic:pic xmlns:pic="http://schemas.openxmlformats.org/drawingml/2006/picture">
                         <pic:nvPicPr>
                           <pic:cNvPr id="1140009448" name="תמונה 3">
-                            <a:hlinkClick r:id="rId17"/>
+                            <a:hlinkClick r:id="rId18"/>
                           </pic:cNvPr>
                           <pic:cNvPicPr>
                             <a:picLocks noChangeAspect="1" noChangeArrowheads="1"/>
                           </pic:cNvPicPr>
                         </pic:nvPicPr>
                         <pic:blipFill>
-                          <a:blip r:embed="rId16" cstate="hqprint">
+                          <a:blip r:embed="rId17" cstate="hqprint">
                             <a:extLst>
                               <a:ext uri="{28A0092B-C50C-407E-A947-70E740481C1C}">
                                 <a14:useLocalDpi xmlns:a14="http://schemas.microsoft.com/office/drawing/2010/main" val="0"/>
@@ -1049,7 +1067,7 @@
                   <wp:effectExtent l="0" t="0" r="5080" b="635"/>
                   <wp:wrapNone/>
                   <wp:docPr id="1443635511" name="תמונה 1" descr="App Store Google Play PNGs for Free Download">
-                    <a:hlinkClick xmlns:a="http://schemas.openxmlformats.org/drawingml/2006/main" r:id="rId18"/>
+                    <a:hlinkClick xmlns:a="http://schemas.openxmlformats.org/drawingml/2006/main" r:id="rId19"/>
                   </wp:docPr>
                   <wp:cNvGraphicFramePr>
                     <a:graphicFrameLocks xmlns:a="http://schemas.openxmlformats.org/drawingml/2006/main" noChangeAspect="1"/>
@@ -1059,14 +1077,14 @@
                       <pic:pic xmlns:pic="http://schemas.openxmlformats.org/drawingml/2006/picture">
                         <pic:nvPicPr>
                           <pic:cNvPr id="1443635511" name="תמונה 1" descr="App Store Google Play PNGs for Free Download">
-                            <a:hlinkClick r:id="rId18"/>
+                            <a:hlinkClick r:id="rId19"/>
                           </pic:cNvPr>
                           <pic:cNvPicPr>
                             <a:picLocks noChangeAspect="1" noChangeArrowheads="1"/>
                           </pic:cNvPicPr>
                         </pic:nvPicPr>
                         <pic:blipFill rotWithShape="1">
-                          <a:blip r:embed="rId19" cstate="hqprint">
+                          <a:blip r:embed="rId20" cstate="hqprint">
                             <a:extLst>
                               <a:ext uri="{28A0092B-C50C-407E-A947-70E740481C1C}">
                                 <a14:useLocalDpi xmlns:a14="http://schemas.microsoft.com/office/drawing/2010/main" val="0"/>
@@ -1125,7 +1143,7 @@
                   <wp:effectExtent l="0" t="0" r="8255" b="8890"/>
                   <wp:wrapNone/>
                   <wp:docPr id="1301193640" name="תמונה 3">
-                    <a:hlinkClick xmlns:a="http://schemas.openxmlformats.org/drawingml/2006/main" r:id="rId20"/>
+                    <a:hlinkClick xmlns:a="http://schemas.openxmlformats.org/drawingml/2006/main" r:id="rId21"/>
                   </wp:docPr>
                   <wp:cNvGraphicFramePr>
                     <a:graphicFrameLocks xmlns:a="http://schemas.openxmlformats.org/drawingml/2006/main" noChangeAspect="1"/>
@@ -1135,14 +1153,14 @@
                       <pic:pic xmlns:pic="http://schemas.openxmlformats.org/drawingml/2006/picture">
                         <pic:nvPicPr>
                           <pic:cNvPr id="1301193640" name="תמונה 3">
-                            <a:hlinkClick r:id="rId20"/>
+                            <a:hlinkClick r:id="rId21"/>
                           </pic:cNvPr>
                           <pic:cNvPicPr>
                             <a:picLocks noChangeAspect="1" noChangeArrowheads="1"/>
                           </pic:cNvPicPr>
                         </pic:nvPicPr>
                         <pic:blipFill>
-                          <a:blip r:embed="rId16" cstate="hqprint">
+                          <a:blip r:embed="rId17" cstate="hqprint">
                             <a:extLst>
                               <a:ext uri="{28A0092B-C50C-407E-A947-70E740481C1C}">
                                 <a14:useLocalDpi xmlns:a14="http://schemas.microsoft.com/office/drawing/2010/main" val="0"/>
@@ -1263,7 +1281,7 @@
                   <wp:effectExtent l="0" t="0" r="8255" b="8890"/>
                   <wp:wrapNone/>
                   <wp:docPr id="1376832234" name="תמונה 3">
-                    <a:hlinkClick xmlns:a="http://schemas.openxmlformats.org/drawingml/2006/main" r:id="rId21"/>
+                    <a:hlinkClick xmlns:a="http://schemas.openxmlformats.org/drawingml/2006/main" r:id="rId22"/>
                   </wp:docPr>
                   <wp:cNvGraphicFramePr>
                     <a:graphicFrameLocks xmlns:a="http://schemas.openxmlformats.org/drawingml/2006/main" noChangeAspect="1"/>
@@ -1273,14 +1291,14 @@
                       <pic:pic xmlns:pic="http://schemas.openxmlformats.org/drawingml/2006/picture">
                         <pic:nvPicPr>
                           <pic:cNvPr id="1376832234" name="תמונה 3">
-                            <a:hlinkClick r:id="rId21"/>
+                            <a:hlinkClick r:id="rId22"/>
                           </pic:cNvPr>
                           <pic:cNvPicPr>
                             <a:picLocks noChangeAspect="1" noChangeArrowheads="1"/>
                           </pic:cNvPicPr>
                         </pic:nvPicPr>
                         <pic:blipFill>
-                          <a:blip r:embed="rId16" cstate="hqprint">
+                          <a:blip r:embed="rId17" cstate="hqprint">
                             <a:extLst>
                               <a:ext uri="{28A0092B-C50C-407E-A947-70E740481C1C}">
                                 <a14:useLocalDpi xmlns:a14="http://schemas.microsoft.com/office/drawing/2010/main" val="0"/>
@@ -1365,7 +1383,7 @@
                   <wp:effectExtent l="0" t="0" r="8255" b="8890"/>
                   <wp:wrapNone/>
                   <wp:docPr id="1651156932" name="תמונה 3">
-                    <a:hlinkClick xmlns:a="http://schemas.openxmlformats.org/drawingml/2006/main" r:id="rId22"/>
+                    <a:hlinkClick xmlns:a="http://schemas.openxmlformats.org/drawingml/2006/main" r:id="rId23"/>
                   </wp:docPr>
                   <wp:cNvGraphicFramePr>
                     <a:graphicFrameLocks xmlns:a="http://schemas.openxmlformats.org/drawingml/2006/main" noChangeAspect="1"/>
@@ -1375,14 +1393,14 @@
                       <pic:pic xmlns:pic="http://schemas.openxmlformats.org/drawingml/2006/picture">
                         <pic:nvPicPr>
                           <pic:cNvPr id="1651156932" name="תמונה 3">
-                            <a:hlinkClick r:id="rId22"/>
+                            <a:hlinkClick r:id="rId23"/>
                           </pic:cNvPr>
                           <pic:cNvPicPr>
                             <a:picLocks noChangeAspect="1" noChangeArrowheads="1"/>
                           </pic:cNvPicPr>
                         </pic:nvPicPr>
                         <pic:blipFill>
-                          <a:blip r:embed="rId16" cstate="hqprint">
+                          <a:blip r:embed="rId17" cstate="hqprint">
                             <a:extLst>
                               <a:ext uri="{28A0092B-C50C-407E-A947-70E740481C1C}">
                                 <a14:useLocalDpi xmlns:a14="http://schemas.microsoft.com/office/drawing/2010/main" val="0"/>
@@ -1436,7 +1454,7 @@
                   <wp:effectExtent l="0" t="0" r="5080" b="635"/>
                   <wp:wrapNone/>
                   <wp:docPr id="64329831" name="תמונה 1" descr="App Store Google Play PNGs for Free Download">
-                    <a:hlinkClick xmlns:a="http://schemas.openxmlformats.org/drawingml/2006/main" r:id="rId23"/>
+                    <a:hlinkClick xmlns:a="http://schemas.openxmlformats.org/drawingml/2006/main" r:id="rId24"/>
                   </wp:docPr>
                   <wp:cNvGraphicFramePr>
                     <a:graphicFrameLocks xmlns:a="http://schemas.openxmlformats.org/drawingml/2006/main" noChangeAspect="1"/>
@@ -1446,14 +1464,14 @@
                       <pic:pic xmlns:pic="http://schemas.openxmlformats.org/drawingml/2006/picture">
                         <pic:nvPicPr>
                           <pic:cNvPr id="64329831" name="תמונה 1" descr="App Store Google Play PNGs for Free Download">
-                            <a:hlinkClick r:id="rId23"/>
+                            <a:hlinkClick r:id="rId24"/>
                           </pic:cNvPr>
                           <pic:cNvPicPr>
                             <a:picLocks noChangeAspect="1" noChangeArrowheads="1"/>
                           </pic:cNvPicPr>
                         </pic:nvPicPr>
                         <pic:blipFill rotWithShape="1">
-                          <a:blip r:embed="rId19" cstate="hqprint">
+                          <a:blip r:embed="rId20" cstate="hqprint">
                             <a:extLst>
                               <a:ext uri="{28A0092B-C50C-407E-A947-70E740481C1C}">
                                 <a14:useLocalDpi xmlns:a14="http://schemas.microsoft.com/office/drawing/2010/main" val="0"/>
@@ -1599,7 +1617,7 @@
                 <w:color w:val="6A644E" w:themeColor="accent5"/>
                 <w:sz w:val="18"/>
               </w:rPr>
-              <w:t xml:space="preserve">Other </w:t>
+              <w:t>Competitions &amp; Volunteering</w:t>
             </w:r>
           </w:p>
         </w:tc>
@@ -2183,12 +2201,12 @@
       </w:pPr>
     </w:p>
     <w:sectPr>
-      <w:headerReference w:type="even" r:id="rId24"/>
-      <w:headerReference w:type="default" r:id="rId25"/>
-      <w:footerReference w:type="even" r:id="rId26"/>
-      <w:footerReference w:type="default" r:id="rId27"/>
-      <w:headerReference w:type="first" r:id="rId28"/>
-      <w:footerReference w:type="first" r:id="rId29"/>
+      <w:headerReference w:type="even" r:id="rId25"/>
+      <w:headerReference w:type="default" r:id="rId26"/>
+      <w:footerReference w:type="even" r:id="rId27"/>
+      <w:footerReference w:type="default" r:id="rId28"/>
+      <w:headerReference w:type="first" r:id="rId29"/>
+      <w:footerReference w:type="first" r:id="rId30"/>
       <w:pgSz w:w="12240" w:h="15840"/>
       <w:pgMar w:top="0" w:right="720" w:bottom="720" w:left="794" w:header="0" w:footer="0" w:gutter="0"/>
       <w:cols w:space="720"/>
@@ -5145,7 +5163,6 @@
   <w:style w:type="character" w:default="1" w:styleId="a1">
     <w:name w:val="Default Paragraph Font"/>
     <w:uiPriority w:val="1"/>
-    <w:semiHidden/>
     <w:unhideWhenUsed/>
   </w:style>
   <w:style w:type="table" w:default="1" w:styleId="a2">
@@ -5776,26 +5793,6 @@
 </file>
 
 <file path=customXml/item2.xml><?xml version="1.0" encoding="utf-8"?>
-<p:properties xmlns:p="http://schemas.microsoft.com/office/2006/metadata/properties" xmlns:xsi="http://www.w3.org/2001/XMLSchema-instance" xmlns:pc="http://schemas.microsoft.com/office/infopath/2007/PartnerControls">
-  <documentManagement>
-    <_ip_UnifiedCompliancePolicyUIAction xmlns="http://schemas.microsoft.com/sharepoint/v3" xsi:nil="true"/>
-    <Image xmlns="71af3243-3dd4-4a8d-8c0d-dd76da1f02a5">
-      <Url xsi:nil="true"/>
-      <Description xsi:nil="true"/>
-    </Image>
-    <Status xmlns="71af3243-3dd4-4a8d-8c0d-dd76da1f02a5">Not started</Status>
-    <Background xmlns="71af3243-3dd4-4a8d-8c0d-dd76da1f02a5">false</Background>
-    <_ip_UnifiedCompliancePolicyProperties xmlns="http://schemas.microsoft.com/sharepoint/v3" xsi:nil="true"/>
-    <ImageTagsTaxHTField xmlns="71af3243-3dd4-4a8d-8c0d-dd76da1f02a5">
-      <Terms xmlns="http://schemas.microsoft.com/office/infopath/2007/PartnerControls"/>
-    </ImageTagsTaxHTField>
-    <TaxCatchAll xmlns="230e9df3-be65-4c73-a93b-d1236ebd677e" xsi:nil="true"/>
-    <MediaServiceKeyPoints xmlns="71af3243-3dd4-4a8d-8c0d-dd76da1f02a5" xsi:nil="true"/>
-  </documentManagement>
-</p:properties>
-</file>
-
-<file path=customXml/item3.xml><?xml version="1.0" encoding="utf-8"?>
 <ct:contentTypeSchema xmlns:ct="http://schemas.microsoft.com/office/2006/metadata/contentType" xmlns:ma="http://schemas.microsoft.com/office/2006/metadata/properties/metaAttributes" ct:_="" ma:_="" ma:contentTypeName="Document" ma:contentTypeID="0x01010079F111ED35F8CC479449609E8A0923A6" ma:contentTypeVersion="28" ma:contentTypeDescription="Create a new document." ma:contentTypeScope="" ma:versionID="60f5a4f2d2b0abadcf532d48ebf9cb71">
   <xsd:schema xmlns:xsd="http://www.w3.org/2001/XMLSchema" xmlns:xs="http://www.w3.org/2001/XMLSchema" xmlns:p="http://schemas.microsoft.com/office/2006/metadata/properties" xmlns:ns1="http://schemas.microsoft.com/sharepoint/v3" xmlns:ns2="71af3243-3dd4-4a8d-8c0d-dd76da1f02a5" xmlns:ns3="16c05727-aa75-4e4a-9b5f-8a80a1165891" xmlns:ns4="230e9df3-be65-4c73-a93b-d1236ebd677e" targetNamespace="http://schemas.microsoft.com/office/2006/metadata/properties" ma:root="true" ma:fieldsID="7dd78129e6a1811f84807ad11c651531" ns1:_="" ns2:_="" ns3:_="" ns4:_="">
     <xsd:import namespace="http://schemas.microsoft.com/sharepoint/v3"/>
@@ -6107,6 +6104,30 @@
 </ct:contentTypeSchema>
 </file>
 
+<file path=customXml/item3.xml><?xml version="1.0" encoding="utf-8"?>
+<p:properties xmlns:p="http://schemas.microsoft.com/office/2006/metadata/properties" xmlns:xsi="http://www.w3.org/2001/XMLSchema-instance" xmlns:pc="http://schemas.microsoft.com/office/infopath/2007/PartnerControls">
+  <documentManagement>
+    <_ip_UnifiedCompliancePolicyUIAction xmlns="http://schemas.microsoft.com/sharepoint/v3" xsi:nil="true"/>
+    <Image xmlns="71af3243-3dd4-4a8d-8c0d-dd76da1f02a5">
+      <Url xsi:nil="true"/>
+      <Description xsi:nil="true"/>
+    </Image>
+    <Status xmlns="71af3243-3dd4-4a8d-8c0d-dd76da1f02a5">Not started</Status>
+    <Background xmlns="71af3243-3dd4-4a8d-8c0d-dd76da1f02a5">false</Background>
+    <_ip_UnifiedCompliancePolicyProperties xmlns="http://schemas.microsoft.com/sharepoint/v3" xsi:nil="true"/>
+    <ImageTagsTaxHTField xmlns="71af3243-3dd4-4a8d-8c0d-dd76da1f02a5">
+      <Terms xmlns="http://schemas.microsoft.com/office/infopath/2007/PartnerControls"/>
+    </ImageTagsTaxHTField>
+    <TaxCatchAll xmlns="230e9df3-be65-4c73-a93b-d1236ebd677e" xsi:nil="true"/>
+    <MediaServiceKeyPoints xmlns="71af3243-3dd4-4a8d-8c0d-dd76da1f02a5" xsi:nil="true"/>
+  </documentManagement>
+</p:properties>
+</file>
+
+<file path=customXml/item4.xml><?xml version="1.0" encoding="utf-8"?>
+<b:Sources xmlns:b="http://schemas.openxmlformats.org/officeDocument/2006/bibliography" xmlns="http://schemas.openxmlformats.org/officeDocument/2006/bibliography" SelectedStyle="\APASixthEditionOfficeOnline.xsl" StyleName="APA" Version="6"/>
+</file>
+
 <file path=customXml/itemProps1.xml><?xml version="1.0" encoding="utf-8"?>
 <ds:datastoreItem xmlns:ds="http://schemas.openxmlformats.org/officeDocument/2006/customXml" ds:itemID="{16C9806D-6FA0-4039-A2F4-D6C733EEB38B}">
   <ds:schemaRefs>
@@ -6116,18 +6137,6 @@
 </file>
 
 <file path=customXml/itemProps2.xml><?xml version="1.0" encoding="utf-8"?>
-<ds:datastoreItem xmlns:ds="http://schemas.openxmlformats.org/officeDocument/2006/customXml" ds:itemID="{13B40C1D-7939-44F4-990C-CB06DFE0EF80}">
-  <ds:schemaRefs>
-    <ds:schemaRef ds:uri="http://schemas.microsoft.com/office/2006/metadata/properties"/>
-    <ds:schemaRef ds:uri="http://schemas.microsoft.com/office/infopath/2007/PartnerControls"/>
-    <ds:schemaRef ds:uri="http://schemas.microsoft.com/sharepoint/v3"/>
-    <ds:schemaRef ds:uri="71af3243-3dd4-4a8d-8c0d-dd76da1f02a5"/>
-    <ds:schemaRef ds:uri="230e9df3-be65-4c73-a93b-d1236ebd677e"/>
-  </ds:schemaRefs>
-</ds:datastoreItem>
-</file>
-
-<file path=customXml/itemProps3.xml><?xml version="1.0" encoding="utf-8"?>
 <ds:datastoreItem xmlns:ds="http://schemas.openxmlformats.org/officeDocument/2006/customXml" ds:itemID="{98FC8582-55FF-4BED-ABF3-70ED2D2AFB76}">
   <ds:schemaRefs>
     <ds:schemaRef ds:uri="http://schemas.microsoft.com/office/2006/metadata/contentType"/>
@@ -6148,6 +6157,26 @@
 </ds:datastoreItem>
 </file>
 
+<file path=customXml/itemProps3.xml><?xml version="1.0" encoding="utf-8"?>
+<ds:datastoreItem xmlns:ds="http://schemas.openxmlformats.org/officeDocument/2006/customXml" ds:itemID="{13B40C1D-7939-44F4-990C-CB06DFE0EF80}">
+  <ds:schemaRefs>
+    <ds:schemaRef ds:uri="http://schemas.microsoft.com/office/2006/metadata/properties"/>
+    <ds:schemaRef ds:uri="http://schemas.microsoft.com/office/infopath/2007/PartnerControls"/>
+    <ds:schemaRef ds:uri="http://schemas.microsoft.com/sharepoint/v3"/>
+    <ds:schemaRef ds:uri="71af3243-3dd4-4a8d-8c0d-dd76da1f02a5"/>
+    <ds:schemaRef ds:uri="230e9df3-be65-4c73-a93b-d1236ebd677e"/>
+  </ds:schemaRefs>
+</ds:datastoreItem>
+</file>
+
+<file path=customXml/itemProps4.xml><?xml version="1.0" encoding="utf-8"?>
+<ds:datastoreItem xmlns:ds="http://schemas.openxmlformats.org/officeDocument/2006/customXml" ds:itemID="{FACE20B0-D6EE-471D-98A5-A78385091934}">
+  <ds:schemaRefs>
+    <ds:schemaRef ds:uri="http://schemas.openxmlformats.org/officeDocument/2006/bibliography"/>
+  </ds:schemaRefs>
+</ds:datastoreItem>
+</file>
+
 <file path=docMetadata/LabelInfo.xml><?xml version="1.0" encoding="utf-8"?>
 <clbl:labelList xmlns:clbl="http://schemas.microsoft.com/office/2020/mipLabelMetadata"/>
 </file>
</xml_diff>

<commit_message>
fixes links and titles
</commit_message>
<xml_diff>
--- a/CV-RenanBazinin.docx
+++ b/CV-RenanBazinin.docx
@@ -304,7 +304,27 @@
                                 <w:sz w:val="22"/>
                                 <w:szCs w:val="20"/>
                               </w:rPr>
-                              <w:t>Student of BS.c in Computer Science, looking for a student position in software development</w:t>
+                              <w:t xml:space="preserve">Student of </w:t>
+                            </w:r>
+                            <w:proofErr w:type="spellStart"/>
+                            <w:r>
+                              <w:rPr>
+                                <w:b/>
+                                <w:bCs/>
+                                <w:sz w:val="22"/>
+                                <w:szCs w:val="20"/>
+                              </w:rPr>
+                              <w:t>BS.c</w:t>
+                            </w:r>
+                            <w:proofErr w:type="spellEnd"/>
+                            <w:r>
+                              <w:rPr>
+                                <w:b/>
+                                <w:bCs/>
+                                <w:sz w:val="22"/>
+                                <w:szCs w:val="20"/>
+                              </w:rPr>
+                              <w:t xml:space="preserve"> in Computer Science, looking for a student position in software development</w:t>
                             </w:r>
                           </w:p>
                         </w:txbxContent>
@@ -349,7 +369,27 @@
                           <w:sz w:val="22"/>
                           <w:szCs w:val="20"/>
                         </w:rPr>
-                        <w:t>Student of BS.c in Computer Science, looking for a student position in software development</w:t>
+                        <w:t xml:space="preserve">Student of </w:t>
+                      </w:r>
+                      <w:proofErr w:type="spellStart"/>
+                      <w:r>
+                        <w:rPr>
+                          <w:b/>
+                          <w:bCs/>
+                          <w:sz w:val="22"/>
+                          <w:szCs w:val="20"/>
+                        </w:rPr>
+                        <w:t>BS.c</w:t>
+                      </w:r>
+                      <w:proofErr w:type="spellEnd"/>
+                      <w:r>
+                        <w:rPr>
+                          <w:b/>
+                          <w:bCs/>
+                          <w:sz w:val="22"/>
+                          <w:szCs w:val="20"/>
+                        </w:rPr>
+                        <w:t xml:space="preserve"> in Computer Science, looking for a student position in software development</w:t>
                       </w:r>
                     </w:p>
                   </w:txbxContent>
@@ -409,8 +449,8 @@
                               <w:rPr>
                                 <w:noProof/>
                                 <w:color w:val="156082" w:themeColor="accent1"/>
-                                <w:sz w:val="32"/>
-                                <w:szCs w:val="32"/>
+                                <w:sz w:val="27"/>
+                                <w:szCs w:val="27"/>
                                 <w14:shadow w14:blurRad="38100" w14:dist="25400" w14:dir="5400000" w14:sx="100000" w14:sy="100000" w14:kx="0" w14:ky="0" w14:algn="ctr">
                                   <w14:srgbClr w14:val="6E747A">
                                     <w14:alpha w14:val="57000"/>
@@ -427,8 +467,8 @@
                               <w:rPr>
                                 <w:noProof/>
                                 <w:color w:val="156082" w:themeColor="accent1"/>
-                                <w:sz w:val="32"/>
-                                <w:szCs w:val="32"/>
+                                <w:sz w:val="27"/>
+                                <w:szCs w:val="27"/>
                                 <w:lang w:bidi="he-IL"/>
                                 <w14:shadow w14:blurRad="38100" w14:dist="25400" w14:dir="5400000" w14:sx="100000" w14:sy="100000" w14:kx="0" w14:ky="0" w14:algn="ctr">
                                   <w14:srgbClr w14:val="6E747A">
@@ -469,8 +509,8 @@
                         <w:rPr>
                           <w:noProof/>
                           <w:color w:val="156082" w:themeColor="accent1"/>
-                          <w:sz w:val="32"/>
-                          <w:szCs w:val="32"/>
+                          <w:sz w:val="27"/>
+                          <w:szCs w:val="27"/>
                           <w14:shadow w14:blurRad="38100" w14:dist="25400" w14:dir="5400000" w14:sx="100000" w14:sy="100000" w14:kx="0" w14:ky="0" w14:algn="ctr">
                             <w14:srgbClr w14:val="6E747A">
                               <w14:alpha w14:val="57000"/>
@@ -487,8 +527,8 @@
                         <w:rPr>
                           <w:noProof/>
                           <w:color w:val="156082" w:themeColor="accent1"/>
-                          <w:sz w:val="32"/>
-                          <w:szCs w:val="32"/>
+                          <w:sz w:val="27"/>
+                          <w:szCs w:val="27"/>
                           <w:lang w:bidi="he-IL"/>
                           <w14:shadow w14:blurRad="38100" w14:dist="25400" w14:dir="5400000" w14:sx="100000" w14:sy="100000" w14:kx="0" w14:ky="0" w14:algn="ctr">
                             <w14:srgbClr w14:val="6E747A">
@@ -574,7 +614,7 @@
           </mc:Choice>
           <mc:Fallback>
             <w:pict>
-              <v:line w14:anchorId="6845A181" id="מחבר ישר 1" o:spid="_x0000_s1026" style="position:absolute;left:0;text-align:left;z-index:251660288;visibility:visible;mso-wrap-style:square;mso-wrap-distance-left:9pt;mso-wrap-distance-top:0;mso-wrap-distance-right:9pt;mso-wrap-distance-bottom:0;mso-position-horizontal:absolute;mso-position-horizontal-relative:text;mso-position-vertical:absolute;mso-position-vertical-relative:text" from=".05pt,12.4pt" to="513.05pt,12.4pt" o:gfxdata="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" strokecolor="black [3213]" strokeweight="1.5pt">
+              <v:line w14:anchorId="33A1BDCF" id="מחבר ישר 1" o:spid="_x0000_s1026" style="position:absolute;left:0;text-align:left;z-index:251660288;visibility:visible;mso-wrap-style:square;mso-wrap-distance-left:9pt;mso-wrap-distance-top:0;mso-wrap-distance-right:9pt;mso-wrap-distance-bottom:0;mso-position-horizontal:absolute;mso-position-horizontal-relative:text;mso-position-vertical:absolute;mso-position-vertical-relative:text" from=".05pt,12.4pt" to="513.05pt,12.4pt" o:gfxdata="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" strokecolor="black [3213]" strokeweight="1.5pt">
                 <v:stroke joinstyle="miter"/>
               </v:line>
             </w:pict>
@@ -1426,8 +1466,8 @@
                               <w:rPr>
                                 <w:noProof/>
                                 <w:color w:val="156082" w:themeColor="accent1"/>
-                                <w:sz w:val="32"/>
-                                <w:szCs w:val="32"/>
+                                <w:sz w:val="27"/>
+                                <w:szCs w:val="27"/>
                                 <w14:shadow w14:blurRad="38100" w14:dist="25400" w14:dir="5400000" w14:sx="100000" w14:sy="100000" w14:kx="0" w14:ky="0" w14:algn="ctr">
                                   <w14:srgbClr w14:val="6E747A">
                                     <w14:alpha w14:val="57000"/>
@@ -1444,8 +1484,8 @@
                               <w:rPr>
                                 <w:noProof/>
                                 <w:color w:val="156082" w:themeColor="accent1"/>
-                                <w:sz w:val="32"/>
-                                <w:szCs w:val="32"/>
+                                <w:sz w:val="27"/>
+                                <w:szCs w:val="27"/>
                                 <w:lang w:bidi="he-IL"/>
                                 <w14:shadow w14:blurRad="38100" w14:dist="25400" w14:dir="5400000" w14:sx="100000" w14:sy="100000" w14:kx="0" w14:ky="0" w14:algn="ctr">
                                   <w14:srgbClr w14:val="6E747A">
@@ -1489,8 +1529,8 @@
                         <w:rPr>
                           <w:noProof/>
                           <w:color w:val="156082" w:themeColor="accent1"/>
-                          <w:sz w:val="32"/>
-                          <w:szCs w:val="32"/>
+                          <w:sz w:val="27"/>
+                          <w:szCs w:val="27"/>
                           <w14:shadow w14:blurRad="38100" w14:dist="25400" w14:dir="5400000" w14:sx="100000" w14:sy="100000" w14:kx="0" w14:ky="0" w14:algn="ctr">
                             <w14:srgbClr w14:val="6E747A">
                               <w14:alpha w14:val="57000"/>
@@ -1507,8 +1547,8 @@
                         <w:rPr>
                           <w:noProof/>
                           <w:color w:val="156082" w:themeColor="accent1"/>
-                          <w:sz w:val="32"/>
-                          <w:szCs w:val="32"/>
+                          <w:sz w:val="27"/>
+                          <w:szCs w:val="27"/>
                           <w:lang w:bidi="he-IL"/>
                           <w14:shadow w14:blurRad="38100" w14:dist="25400" w14:dir="5400000" w14:sx="100000" w14:sy="100000" w14:kx="0" w14:ky="0" w14:algn="ctr">
                             <w14:srgbClr w14:val="6E747A">
@@ -1594,7 +1634,7 @@
           </mc:Choice>
           <mc:Fallback>
             <w:pict>
-              <v:line w14:anchorId="057937B0" id="מחבר ישר 1" o:spid="_x0000_s1026" style="position:absolute;left:0;text-align:left;z-index:251672576;visibility:visible;mso-wrap-style:square;mso-wrap-distance-left:9pt;mso-wrap-distance-top:0;mso-wrap-distance-right:9pt;mso-wrap-distance-bottom:0;mso-position-horizontal:absolute;mso-position-horizontal-relative:text;mso-position-vertical:absolute;mso-position-vertical-relative:text" from="1.55pt,147.05pt" to="514.55pt,147.05pt" o:gfxdata="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" strokecolor="black [3213]" strokeweight="1.5pt">
+              <v:line w14:anchorId="3289FD01" id="מחבר ישר 1" o:spid="_x0000_s1026" style="position:absolute;left:0;text-align:left;z-index:251672576;visibility:visible;mso-wrap-style:square;mso-wrap-distance-left:9pt;mso-wrap-distance-top:0;mso-wrap-distance-right:9pt;mso-wrap-distance-bottom:0;mso-position-horizontal:absolute;mso-position-horizontal-relative:text;mso-position-vertical:absolute;mso-position-vertical-relative:text" from="1.55pt,147.05pt" to="514.55pt,147.05pt" o:gfxdata="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" strokecolor="black [3213]" strokeweight="1.5pt">
                 <v:stroke joinstyle="miter"/>
               </v:line>
             </w:pict>
@@ -1649,30 +1689,81 @@
                       <wps:txbx>
                         <w:txbxContent>
                           <w:p>
+                            <w:proofErr w:type="spellStart"/>
                             <w:r>
                               <w:rPr>
                                 <w:b/>
                                 <w:bCs/>
                               </w:rPr>
-                              <w:t>FocusFlow (AI video learning platform)</w:t>
+                              <w:t>FocusFlow</w:t>
+                            </w:r>
+                            <w:proofErr w:type="spellEnd"/>
+                            <w:r>
+                              <w:rPr>
+                                <w:b/>
+                                <w:bCs/>
+                              </w:rPr>
+                              <w:t xml:space="preserve"> (AI video learning platform)</w:t>
                             </w:r>
                           </w:p>
                           <w:p>
-                            <w:r>
-                              <w:t xml:space="preserve">Live Link </w:t>
+                            <w:pPr>
+                              <w:ind w:left="720" w:hanging="720"/>
+                            </w:pPr>
+                            <w:hyperlink r:id="rId13" w:history="1">
+                              <w:r>
+                                <w:rPr>
+                                  <w:rStyle w:val="Hyperlink"/>
+                                </w:rPr>
+                                <w:t>Live Link</w:t>
+                              </w:r>
+                            </w:hyperlink>
+                            <w:r>
+                              <w:t xml:space="preserve"> </w:t>
                             </w:r>
                             <w:r>
                               <w:t>•</w:t>
                             </w:r>
                             <w:r>
-                              <w:t xml:space="preserve"> GitHub </w:t>
+                              <w:t xml:space="preserve"> </w:t>
+                            </w:r>
+                            <w:hyperlink r:id="rId14" w:history="1">
+                              <w:r>
+                                <w:rPr>
+                                  <w:rStyle w:val="Hyperlink"/>
+                                </w:rPr>
+                                <w:t>G</w:t>
+                              </w:r>
+                              <w:r>
+                                <w:rPr>
+                                  <w:rStyle w:val="Hyperlink"/>
+                                </w:rPr>
+                                <w:t>i</w:t>
+                              </w:r>
+                              <w:r>
+                                <w:rPr>
+                                  <w:rStyle w:val="Hyperlink"/>
+                                </w:rPr>
+                                <w:t>tHub</w:t>
+                              </w:r>
+                            </w:hyperlink>
+                            <w:r>
+                              <w:t xml:space="preserve"> </w:t>
                             </w:r>
                             <w:r>
                               <w:t>•</w:t>
                             </w:r>
                             <w:r>
-                              <w:t xml:space="preserve"> Video</w:t>
-                            </w:r>
+                              <w:t xml:space="preserve"> </w:t>
+                            </w:r>
+                            <w:hyperlink r:id="rId15" w:history="1">
+                              <w:r>
+                                <w:rPr>
+                                  <w:rStyle w:val="Hyperlink"/>
+                                </w:rPr>
+                                <w:t>Video</w:t>
+                              </w:r>
+                            </w:hyperlink>
                           </w:p>
                           <w:p>
                             <w:pPr>
@@ -1792,30 +1883,81 @@
                 <v:textbox>
                   <w:txbxContent>
                     <w:p>
+                      <w:proofErr w:type="spellStart"/>
                       <w:r>
                         <w:rPr>
                           <w:b/>
                           <w:bCs/>
                         </w:rPr>
-                        <w:t>FocusFlow (AI video learning platform)</w:t>
+                        <w:t>FocusFlow</w:t>
+                      </w:r>
+                      <w:proofErr w:type="spellEnd"/>
+                      <w:r>
+                        <w:rPr>
+                          <w:b/>
+                          <w:bCs/>
+                        </w:rPr>
+                        <w:t xml:space="preserve"> (AI video learning platform)</w:t>
                       </w:r>
                     </w:p>
                     <w:p>
-                      <w:r>
-                        <w:t xml:space="preserve">Live Link </w:t>
+                      <w:pPr>
+                        <w:ind w:left="720" w:hanging="720"/>
+                      </w:pPr>
+                      <w:hyperlink r:id="rId16" w:history="1">
+                        <w:r>
+                          <w:rPr>
+                            <w:rStyle w:val="Hyperlink"/>
+                          </w:rPr>
+                          <w:t>Live Link</w:t>
+                        </w:r>
+                      </w:hyperlink>
+                      <w:r>
+                        <w:t xml:space="preserve"> </w:t>
                       </w:r>
                       <w:r>
                         <w:t>•</w:t>
                       </w:r>
                       <w:r>
-                        <w:t xml:space="preserve"> GitHub </w:t>
+                        <w:t xml:space="preserve"> </w:t>
+                      </w:r>
+                      <w:hyperlink r:id="rId17" w:history="1">
+                        <w:r>
+                          <w:rPr>
+                            <w:rStyle w:val="Hyperlink"/>
+                          </w:rPr>
+                          <w:t>G</w:t>
+                        </w:r>
+                        <w:r>
+                          <w:rPr>
+                            <w:rStyle w:val="Hyperlink"/>
+                          </w:rPr>
+                          <w:t>i</w:t>
+                        </w:r>
+                        <w:r>
+                          <w:rPr>
+                            <w:rStyle w:val="Hyperlink"/>
+                          </w:rPr>
+                          <w:t>tHub</w:t>
+                        </w:r>
+                      </w:hyperlink>
+                      <w:r>
+                        <w:t xml:space="preserve"> </w:t>
                       </w:r>
                       <w:r>
                         <w:t>•</w:t>
                       </w:r>
                       <w:r>
-                        <w:t xml:space="preserve"> Video</w:t>
-                      </w:r>
+                        <w:t xml:space="preserve"> </w:t>
+                      </w:r>
+                      <w:hyperlink r:id="rId18" w:history="1">
+                        <w:r>
+                          <w:rPr>
+                            <w:rStyle w:val="Hyperlink"/>
+                          </w:rPr>
+                          <w:t>Video</w:t>
+                        </w:r>
+                      </w:hyperlink>
                     </w:p>
                     <w:p>
                       <w:pPr>
@@ -1966,14 +2108,33 @@
                             </w:r>
                           </w:p>
                           <w:p>
-                            <w:r>
-                              <w:t xml:space="preserve">Live Link </w:t>
+                            <w:hyperlink r:id="rId19" w:history="1">
+                              <w:r>
+                                <w:rPr>
+                                  <w:rStyle w:val="Hyperlink"/>
+                                </w:rPr>
+                                <w:t>Live Link</w:t>
+                              </w:r>
+                            </w:hyperlink>
+                            <w:r>
+                              <w:t xml:space="preserve"> </w:t>
                             </w:r>
                             <w:r>
                               <w:t>•</w:t>
                             </w:r>
                             <w:r>
-                              <w:t xml:space="preserve"> GitHub </w:t>
+                              <w:t xml:space="preserve"> </w:t>
+                            </w:r>
+                            <w:hyperlink r:id="rId20" w:history="1">
+                              <w:r>
+                                <w:rPr>
+                                  <w:rStyle w:val="Hyperlink"/>
+                                </w:rPr>
+                                <w:t>GitHub</w:t>
+                              </w:r>
+                            </w:hyperlink>
+                            <w:r>
+                              <w:t xml:space="preserve"> </w:t>
                             </w:r>
                             <w:r>
                               <w:t>•</w:t>
@@ -1981,9 +2142,14 @@
                             <w:r>
                               <w:t xml:space="preserve"> </w:t>
                             </w:r>
-                            <w:r>
-                              <w:t>Mobile</w:t>
-                            </w:r>
+                            <w:hyperlink r:id="rId21" w:history="1">
+                              <w:r>
+                                <w:rPr>
+                                  <w:rStyle w:val="Hyperlink"/>
+                                </w:rPr>
+                                <w:t>Mobile</w:t>
+                              </w:r>
+                            </w:hyperlink>
                           </w:p>
                           <w:p>
                             <w:pPr>
@@ -2062,14 +2228,33 @@
                       </w:r>
                     </w:p>
                     <w:p>
-                      <w:r>
-                        <w:t xml:space="preserve">Live Link </w:t>
+                      <w:hyperlink r:id="rId22" w:history="1">
+                        <w:r>
+                          <w:rPr>
+                            <w:rStyle w:val="Hyperlink"/>
+                          </w:rPr>
+                          <w:t>Live Link</w:t>
+                        </w:r>
+                      </w:hyperlink>
+                      <w:r>
+                        <w:t xml:space="preserve"> </w:t>
                       </w:r>
                       <w:r>
                         <w:t>•</w:t>
                       </w:r>
                       <w:r>
-                        <w:t xml:space="preserve"> GitHub </w:t>
+                        <w:t xml:space="preserve"> </w:t>
+                      </w:r>
+                      <w:hyperlink r:id="rId23" w:history="1">
+                        <w:r>
+                          <w:rPr>
+                            <w:rStyle w:val="Hyperlink"/>
+                          </w:rPr>
+                          <w:t>GitHub</w:t>
+                        </w:r>
+                      </w:hyperlink>
+                      <w:r>
+                        <w:t xml:space="preserve"> </w:t>
                       </w:r>
                       <w:r>
                         <w:t>•</w:t>
@@ -2077,9 +2262,14 @@
                       <w:r>
                         <w:t xml:space="preserve"> </w:t>
                       </w:r>
-                      <w:r>
-                        <w:t>Mobile</w:t>
-                      </w:r>
+                      <w:hyperlink r:id="rId24" w:history="1">
+                        <w:r>
+                          <w:rPr>
+                            <w:rStyle w:val="Hyperlink"/>
+                          </w:rPr>
+                          <w:t>Mobile</w:t>
+                        </w:r>
+                      </w:hyperlink>
                     </w:p>
                     <w:p>
                       <w:pPr>
@@ -2180,14 +2370,33 @@
                             </w:r>
                           </w:p>
                           <w:p>
-                            <w:r>
-                              <w:t xml:space="preserve">Live Link </w:t>
+                            <w:hyperlink r:id="rId25" w:history="1">
+                              <w:r>
+                                <w:rPr>
+                                  <w:rStyle w:val="Hyperlink"/>
+                                </w:rPr>
+                                <w:t>Live Link</w:t>
+                              </w:r>
+                            </w:hyperlink>
+                            <w:r>
+                              <w:t xml:space="preserve"> </w:t>
                             </w:r>
                             <w:r>
                               <w:t>•</w:t>
                             </w:r>
                             <w:r>
-                              <w:t xml:space="preserve"> GitHub </w:t>
+                              <w:t xml:space="preserve"> </w:t>
+                            </w:r>
+                            <w:hyperlink r:id="rId26" w:history="1">
+                              <w:r>
+                                <w:rPr>
+                                  <w:rStyle w:val="Hyperlink"/>
+                                </w:rPr>
+                                <w:t>GitHub</w:t>
+                              </w:r>
+                            </w:hyperlink>
+                            <w:r>
+                              <w:t xml:space="preserve"> </w:t>
                             </w:r>
                             <w:r>
                               <w:t>•</w:t>
@@ -2195,9 +2404,14 @@
                             <w:r>
                               <w:t xml:space="preserve"> </w:t>
                             </w:r>
-                            <w:r>
-                              <w:t>Mobile</w:t>
-                            </w:r>
+                            <w:hyperlink r:id="rId27" w:history="1">
+                              <w:r>
+                                <w:rPr>
+                                  <w:rStyle w:val="Hyperlink"/>
+                                </w:rPr>
+                                <w:t>Mobile</w:t>
+                              </w:r>
+                            </w:hyperlink>
                           </w:p>
                           <w:p>
                             <w:pPr>
@@ -2285,14 +2499,33 @@
                       </w:r>
                     </w:p>
                     <w:p>
-                      <w:r>
-                        <w:t xml:space="preserve">Live Link </w:t>
+                      <w:hyperlink r:id="rId28" w:history="1">
+                        <w:r>
+                          <w:rPr>
+                            <w:rStyle w:val="Hyperlink"/>
+                          </w:rPr>
+                          <w:t>Live Link</w:t>
+                        </w:r>
+                      </w:hyperlink>
+                      <w:r>
+                        <w:t xml:space="preserve"> </w:t>
                       </w:r>
                       <w:r>
                         <w:t>•</w:t>
                       </w:r>
                       <w:r>
-                        <w:t xml:space="preserve"> GitHub </w:t>
+                        <w:t xml:space="preserve"> </w:t>
+                      </w:r>
+                      <w:hyperlink r:id="rId29" w:history="1">
+                        <w:r>
+                          <w:rPr>
+                            <w:rStyle w:val="Hyperlink"/>
+                          </w:rPr>
+                          <w:t>GitHub</w:t>
+                        </w:r>
+                      </w:hyperlink>
+                      <w:r>
+                        <w:t xml:space="preserve"> </w:t>
                       </w:r>
                       <w:r>
                         <w:t>•</w:t>
@@ -2300,9 +2533,14 @@
                       <w:r>
                         <w:t xml:space="preserve"> </w:t>
                       </w:r>
-                      <w:r>
-                        <w:t>Mobile</w:t>
-                      </w:r>
+                      <w:hyperlink r:id="rId30" w:history="1">
+                        <w:r>
+                          <w:rPr>
+                            <w:rStyle w:val="Hyperlink"/>
+                          </w:rPr>
+                          <w:t>Mobile</w:t>
+                        </w:r>
+                      </w:hyperlink>
                     </w:p>
                     <w:p>
                       <w:pPr>
@@ -2412,21 +2650,48 @@
                             </w:r>
                           </w:p>
                           <w:p>
-                            <w:r>
-                              <w:t xml:space="preserve">Live Link </w:t>
+                            <w:hyperlink r:id="rId31" w:history="1">
+                              <w:r>
+                                <w:rPr>
+                                  <w:rStyle w:val="Hyperlink"/>
+                                </w:rPr>
+                                <w:t>Live Link</w:t>
+                              </w:r>
+                            </w:hyperlink>
+                            <w:r>
+                              <w:t xml:space="preserve"> </w:t>
                             </w:r>
                             <w:r>
                               <w:t>•</w:t>
                             </w:r>
                             <w:r>
-                              <w:t xml:space="preserve"> GitHub </w:t>
+                              <w:t xml:space="preserve"> </w:t>
+                            </w:r>
+                            <w:hyperlink r:id="rId32" w:history="1">
+                              <w:r>
+                                <w:rPr>
+                                  <w:rStyle w:val="Hyperlink"/>
+                                </w:rPr>
+                                <w:t>GitHub</w:t>
+                              </w:r>
+                            </w:hyperlink>
+                            <w:r>
+                              <w:t xml:space="preserve"> </w:t>
                             </w:r>
                             <w:r>
                               <w:t>•</w:t>
                             </w:r>
                             <w:r>
-                              <w:t xml:space="preserve"> Video</w:t>
-                            </w:r>
+                              <w:t xml:space="preserve"> </w:t>
+                            </w:r>
+                            <w:hyperlink r:id="rId33" w:history="1">
+                              <w:r>
+                                <w:rPr>
+                                  <w:rStyle w:val="Hyperlink"/>
+                                </w:rPr>
+                                <w:t>Video</w:t>
+                              </w:r>
+                            </w:hyperlink>
                           </w:p>
                           <w:p>
                             <w:pPr>
@@ -2518,21 +2783,48 @@
                       </w:r>
                     </w:p>
                     <w:p>
-                      <w:r>
-                        <w:t xml:space="preserve">Live Link </w:t>
+                      <w:hyperlink r:id="rId34" w:history="1">
+                        <w:r>
+                          <w:rPr>
+                            <w:rStyle w:val="Hyperlink"/>
+                          </w:rPr>
+                          <w:t>Live Link</w:t>
+                        </w:r>
+                      </w:hyperlink>
+                      <w:r>
+                        <w:t xml:space="preserve"> </w:t>
                       </w:r>
                       <w:r>
                         <w:t>•</w:t>
                       </w:r>
                       <w:r>
-                        <w:t xml:space="preserve"> GitHub </w:t>
+                        <w:t xml:space="preserve"> </w:t>
+                      </w:r>
+                      <w:hyperlink r:id="rId35" w:history="1">
+                        <w:r>
+                          <w:rPr>
+                            <w:rStyle w:val="Hyperlink"/>
+                          </w:rPr>
+                          <w:t>GitHub</w:t>
+                        </w:r>
+                      </w:hyperlink>
+                      <w:r>
+                        <w:t xml:space="preserve"> </w:t>
                       </w:r>
                       <w:r>
                         <w:t>•</w:t>
                       </w:r>
                       <w:r>
-                        <w:t xml:space="preserve"> Video</w:t>
-                      </w:r>
+                        <w:t xml:space="preserve"> </w:t>
+                      </w:r>
+                      <w:hyperlink r:id="rId36" w:history="1">
+                        <w:r>
+                          <w:rPr>
+                            <w:rStyle w:val="Hyperlink"/>
+                          </w:rPr>
+                          <w:t>Video</w:t>
+                        </w:r>
+                      </w:hyperlink>
                     </w:p>
                     <w:p>
                       <w:pPr>
@@ -2842,12 +3134,164 @@
       <w:r>
         <w:rPr>
           <w:noProof/>
+        </w:rPr>
+        <mc:AlternateContent>
+          <mc:Choice Requires="wps">
+            <w:drawing>
+              <wp:anchor distT="0" distB="0" distL="114300" distR="114300" simplePos="0" relativeHeight="251687936" behindDoc="0" locked="0" layoutInCell="1" allowOverlap="1" wp14:anchorId="34AFFF7A" wp14:editId="037EBC57">
+                <wp:simplePos x="0" y="0"/>
+                <wp:positionH relativeFrom="column">
+                  <wp:posOffset>-104140</wp:posOffset>
+                </wp:positionH>
+                <wp:positionV relativeFrom="paragraph">
+                  <wp:posOffset>131445</wp:posOffset>
+                </wp:positionV>
+                <wp:extent cx="6515100" cy="400050"/>
+                <wp:effectExtent l="0" t="0" r="0" b="0"/>
+                <wp:wrapNone/>
+                <wp:docPr id="383950576" name="תיבת טקסט 1"/>
+                <wp:cNvGraphicFramePr/>
+                <a:graphic xmlns:a="http://schemas.openxmlformats.org/drawingml/2006/main">
+                  <a:graphicData uri="http://schemas.microsoft.com/office/word/2010/wordprocessingShape">
+                    <wps:wsp>
+                      <wps:cNvSpPr txBox="1"/>
+                      <wps:spPr>
+                        <a:xfrm>
+                          <a:off x="0" y="0"/>
+                          <a:ext cx="6515100" cy="400050"/>
+                        </a:xfrm>
+                        <a:prstGeom prst="rect">
+                          <a:avLst/>
+                        </a:prstGeom>
+                        <a:noFill/>
+                        <a:ln>
+                          <a:noFill/>
+                        </a:ln>
+                      </wps:spPr>
+                      <wps:txbx>
+                        <w:txbxContent>
+                          <w:p>
+                            <w:pPr>
+                              <w:jc w:val="center"/>
+                              <w:rPr>
+                                <w:noProof/>
+                                <w:color w:val="156082" w:themeColor="accent1"/>
+                                <w:sz w:val="27"/>
+                                <w:szCs w:val="27"/>
+                                <w:lang w:bidi="he-IL"/>
+                                <w14:shadow w14:blurRad="38100" w14:dist="25400" w14:dir="5400000" w14:sx="100000" w14:sy="100000" w14:kx="0" w14:ky="0" w14:algn="ctr">
+                                  <w14:srgbClr w14:val="6E747A">
+                                    <w14:alpha w14:val="57000"/>
+                                  </w14:srgbClr>
+                                </w14:shadow>
+                                <w14:textOutline w14:w="0" w14:cap="flat" w14:cmpd="sng" w14:algn="ctr">
+                                  <w14:noFill/>
+                                  <w14:prstDash w14:val="solid"/>
+                                  <w14:round/>
+                                </w14:textOutline>
+                              </w:rPr>
+                            </w:pPr>
+                            <w:r>
+                              <w:rPr>
+                                <w:noProof/>
+                                <w:color w:val="156082" w:themeColor="accent1"/>
+                                <w:sz w:val="27"/>
+                                <w:szCs w:val="27"/>
+                                <w:lang w:bidi="he-IL"/>
+                                <w14:shadow w14:blurRad="38100" w14:dist="25400" w14:dir="5400000" w14:sx="100000" w14:sy="100000" w14:kx="0" w14:ky="0" w14:algn="ctr">
+                                  <w14:srgbClr w14:val="6E747A">
+                                    <w14:alpha w14:val="57000"/>
+                                  </w14:srgbClr>
+                                </w14:shadow>
+                                <w14:textOutline w14:w="0" w14:cap="flat" w14:cmpd="sng" w14:algn="ctr">
+                                  <w14:noFill/>
+                                  <w14:prstDash w14:val="solid"/>
+                                  <w14:round/>
+                                </w14:textOutline>
+                              </w:rPr>
+                              <w:t>Skills</w:t>
+                            </w:r>
+                          </w:p>
+                        </w:txbxContent>
+                      </wps:txbx>
+                      <wps:bodyPr rot="0" spcFirstLastPara="0" vertOverflow="overflow" horzOverflow="overflow" vert="horz" wrap="none" lIns="91440" tIns="45720" rIns="91440" bIns="45720" numCol="1" spcCol="0" rtlCol="1" fromWordArt="0" anchor="t" anchorCtr="0" forceAA="0" compatLnSpc="1">
+                        <a:prstTxWarp prst="textNoShape">
+                          <a:avLst/>
+                        </a:prstTxWarp>
+                        <a:noAutofit/>
+                      </wps:bodyPr>
+                    </wps:wsp>
+                  </a:graphicData>
+                </a:graphic>
+                <wp14:sizeRelV relativeFrom="margin">
+                  <wp14:pctHeight>0</wp14:pctHeight>
+                </wp14:sizeRelV>
+              </wp:anchor>
+            </w:drawing>
+          </mc:Choice>
+          <mc:Fallback>
+            <w:pict>
+              <v:shape w14:anchorId="34AFFF7A" id="_x0000_s1038" type="#_x0000_t202" style="position:absolute;margin-left:-8.2pt;margin-top:10.35pt;width:513pt;height:31.5pt;z-index:251687936;visibility:visible;mso-wrap-style:none;mso-height-percent:0;mso-wrap-distance-left:9pt;mso-wrap-distance-top:0;mso-wrap-distance-right:9pt;mso-wrap-distance-bottom:0;mso-position-horizontal:absolute;mso-position-horizontal-relative:text;mso-position-vertical:absolute;mso-position-vertical-relative:text;mso-height-percent:0;mso-height-relative:margin;v-text-anchor:top" o:gfxdata="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" filled="f" stroked="f">
+                <v:textbox>
+                  <w:txbxContent>
+                    <w:p>
+                      <w:pPr>
+                        <w:jc w:val="center"/>
+                        <w:rPr>
+                          <w:noProof/>
+                          <w:color w:val="156082" w:themeColor="accent1"/>
+                          <w:sz w:val="27"/>
+                          <w:szCs w:val="27"/>
+                          <w:lang w:bidi="he-IL"/>
+                          <w14:shadow w14:blurRad="38100" w14:dist="25400" w14:dir="5400000" w14:sx="100000" w14:sy="100000" w14:kx="0" w14:ky="0" w14:algn="ctr">
+                            <w14:srgbClr w14:val="6E747A">
+                              <w14:alpha w14:val="57000"/>
+                            </w14:srgbClr>
+                          </w14:shadow>
+                          <w14:textOutline w14:w="0" w14:cap="flat" w14:cmpd="sng" w14:algn="ctr">
+                            <w14:noFill/>
+                            <w14:prstDash w14:val="solid"/>
+                            <w14:round/>
+                          </w14:textOutline>
+                        </w:rPr>
+                      </w:pPr>
+                      <w:r>
+                        <w:rPr>
+                          <w:noProof/>
+                          <w:color w:val="156082" w:themeColor="accent1"/>
+                          <w:sz w:val="27"/>
+                          <w:szCs w:val="27"/>
+                          <w:lang w:bidi="he-IL"/>
+                          <w14:shadow w14:blurRad="38100" w14:dist="25400" w14:dir="5400000" w14:sx="100000" w14:sy="100000" w14:kx="0" w14:ky="0" w14:algn="ctr">
+                            <w14:srgbClr w14:val="6E747A">
+                              <w14:alpha w14:val="57000"/>
+                            </w14:srgbClr>
+                          </w14:shadow>
+                          <w14:textOutline w14:w="0" w14:cap="flat" w14:cmpd="sng" w14:algn="ctr">
+                            <w14:noFill/>
+                            <w14:prstDash w14:val="solid"/>
+                            <w14:round/>
+                          </w14:textOutline>
+                        </w:rPr>
+                        <w:t>Skills</w:t>
+                      </w:r>
+                    </w:p>
+                  </w:txbxContent>
+                </v:textbox>
+              </v:shape>
+            </w:pict>
+          </mc:Fallback>
+        </mc:AlternateContent>
+      </w:r>
+      <w:r>
+        <w:rPr>
+          <w:noProof/>
           <w14:ligatures w14:val="standardContextual"/>
         </w:rPr>
         <mc:AlternateContent>
           <mc:Choice Requires="wps">
             <w:drawing>
-              <wp:anchor distT="0" distB="0" distL="114300" distR="114300" simplePos="0" relativeHeight="251691008" behindDoc="0" locked="0" layoutInCell="1" allowOverlap="1" wp14:anchorId="5745C9C3" wp14:editId="38C108E2">
+              <wp:anchor distT="0" distB="0" distL="114300" distR="114300" simplePos="0" relativeHeight="251691008" behindDoc="0" locked="0" layoutInCell="1" allowOverlap="1" wp14:anchorId="5745C9C3" wp14:editId="1A558446">
                 <wp:simplePos x="0" y="0"/>
                 <wp:positionH relativeFrom="column">
                   <wp:posOffset>1115060</wp:posOffset>
@@ -3102,7 +3546,7 @@
           </mc:Choice>
           <mc:Fallback>
             <w:pict>
-              <v:shape w14:anchorId="5745C9C3" id="_x0000_s1038" type="#_x0000_t202" style="position:absolute;margin-left:87.8pt;margin-top:15.6pt;width:429.75pt;height:65.25pt;z-index:251691008;visibility:visible;mso-wrap-style:square;mso-wrap-distance-left:9pt;mso-wrap-distance-top:0;mso-wrap-distance-right:9pt;mso-wrap-distance-bottom:0;mso-position-horizontal:absolute;mso-position-horizontal-relative:text;mso-position-vertical:absolute;mso-position-vertical-relative:text;v-text-anchor:top" o:gfxdata="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" filled="f" stroked="f" strokeweight=".5pt">
+              <v:shape w14:anchorId="5745C9C3" id="_x0000_s1039" type="#_x0000_t202" style="position:absolute;margin-left:87.8pt;margin-top:15.6pt;width:429.75pt;height:65.25pt;z-index:251691008;visibility:visible;mso-wrap-style:square;mso-wrap-distance-left:9pt;mso-wrap-distance-top:0;mso-wrap-distance-right:9pt;mso-wrap-distance-bottom:0;mso-position-horizontal:absolute;mso-position-horizontal-relative:text;mso-position-vertical:absolute;mso-position-vertical-relative:text;v-text-anchor:top" o:gfxdata="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" filled="f" stroked="f" strokeweight=".5pt">
                 <v:textbox>
                   <w:txbxContent>
                     <w:tbl>
@@ -3311,156 +3755,6 @@
                       <w:pPr>
                         <w:pStyle w:val="a9"/>
                       </w:pPr>
-                    </w:p>
-                  </w:txbxContent>
-                </v:textbox>
-              </v:shape>
-            </w:pict>
-          </mc:Fallback>
-        </mc:AlternateContent>
-      </w:r>
-      <w:r>
-        <w:rPr>
-          <w:noProof/>
-        </w:rPr>
-        <mc:AlternateContent>
-          <mc:Choice Requires="wps">
-            <w:drawing>
-              <wp:anchor distT="0" distB="0" distL="114300" distR="114300" simplePos="0" relativeHeight="251687936" behindDoc="0" locked="0" layoutInCell="1" allowOverlap="1" wp14:anchorId="34AFFF7A" wp14:editId="2C89B2C0">
-                <wp:simplePos x="0" y="0"/>
-                <wp:positionH relativeFrom="column">
-                  <wp:posOffset>-104140</wp:posOffset>
-                </wp:positionH>
-                <wp:positionV relativeFrom="paragraph">
-                  <wp:posOffset>74295</wp:posOffset>
-                </wp:positionV>
-                <wp:extent cx="6515100" cy="400050"/>
-                <wp:effectExtent l="0" t="0" r="0" b="0"/>
-                <wp:wrapNone/>
-                <wp:docPr id="383950576" name="תיבת טקסט 1"/>
-                <wp:cNvGraphicFramePr/>
-                <a:graphic xmlns:a="http://schemas.openxmlformats.org/drawingml/2006/main">
-                  <a:graphicData uri="http://schemas.microsoft.com/office/word/2010/wordprocessingShape">
-                    <wps:wsp>
-                      <wps:cNvSpPr txBox="1"/>
-                      <wps:spPr>
-                        <a:xfrm>
-                          <a:off x="0" y="0"/>
-                          <a:ext cx="6515100" cy="400050"/>
-                        </a:xfrm>
-                        <a:prstGeom prst="rect">
-                          <a:avLst/>
-                        </a:prstGeom>
-                        <a:noFill/>
-                        <a:ln>
-                          <a:noFill/>
-                        </a:ln>
-                      </wps:spPr>
-                      <wps:txbx>
-                        <w:txbxContent>
-                          <w:p>
-                            <w:pPr>
-                              <w:jc w:val="center"/>
-                              <w:rPr>
-                                <w:noProof/>
-                                <w:color w:val="156082" w:themeColor="accent1"/>
-                                <w:sz w:val="32"/>
-                                <w:szCs w:val="32"/>
-                                <w14:shadow w14:blurRad="38100" w14:dist="25400" w14:dir="5400000" w14:sx="100000" w14:sy="100000" w14:kx="0" w14:ky="0" w14:algn="ctr">
-                                  <w14:srgbClr w14:val="6E747A">
-                                    <w14:alpha w14:val="57000"/>
-                                  </w14:srgbClr>
-                                </w14:shadow>
-                                <w14:textOutline w14:w="0" w14:cap="flat" w14:cmpd="sng" w14:algn="ctr">
-                                  <w14:noFill/>
-                                  <w14:prstDash w14:val="solid"/>
-                                  <w14:round/>
-                                </w14:textOutline>
-                              </w:rPr>
-                            </w:pPr>
-                            <w:r>
-                              <w:rPr>
-                                <w:noProof/>
-                                <w:color w:val="156082" w:themeColor="accent1"/>
-                                <w:sz w:val="32"/>
-                                <w:szCs w:val="32"/>
-                                <w:lang w:bidi="he-IL"/>
-                                <w14:shadow w14:blurRad="38100" w14:dist="25400" w14:dir="5400000" w14:sx="100000" w14:sy="100000" w14:kx="0" w14:ky="0" w14:algn="ctr">
-                                  <w14:srgbClr w14:val="6E747A">
-                                    <w14:alpha w14:val="57000"/>
-                                  </w14:srgbClr>
-                                </w14:shadow>
-                                <w14:textOutline w14:w="0" w14:cap="flat" w14:cmpd="sng" w14:algn="ctr">
-                                  <w14:noFill/>
-                                  <w14:prstDash w14:val="solid"/>
-                                  <w14:round/>
-                                </w14:textOutline>
-                              </w:rPr>
-                              <w:t>Skills</w:t>
-                            </w:r>
-                          </w:p>
-                        </w:txbxContent>
-                      </wps:txbx>
-                      <wps:bodyPr rot="0" spcFirstLastPara="0" vertOverflow="overflow" horzOverflow="overflow" vert="horz" wrap="none" lIns="91440" tIns="45720" rIns="91440" bIns="45720" numCol="1" spcCol="0" rtlCol="1" fromWordArt="0" anchor="t" anchorCtr="0" forceAA="0" compatLnSpc="1">
-                        <a:prstTxWarp prst="textNoShape">
-                          <a:avLst/>
-                        </a:prstTxWarp>
-                        <a:noAutofit/>
-                      </wps:bodyPr>
-                    </wps:wsp>
-                  </a:graphicData>
-                </a:graphic>
-                <wp14:sizeRelV relativeFrom="margin">
-                  <wp14:pctHeight>0</wp14:pctHeight>
-                </wp14:sizeRelV>
-              </wp:anchor>
-            </w:drawing>
-          </mc:Choice>
-          <mc:Fallback>
-            <w:pict>
-              <v:shape w14:anchorId="34AFFF7A" id="_x0000_s1039" type="#_x0000_t202" style="position:absolute;margin-left:-8.2pt;margin-top:5.85pt;width:513pt;height:31.5pt;z-index:251687936;visibility:visible;mso-wrap-style:none;mso-height-percent:0;mso-wrap-distance-left:9pt;mso-wrap-distance-top:0;mso-wrap-distance-right:9pt;mso-wrap-distance-bottom:0;mso-position-horizontal:absolute;mso-position-horizontal-relative:text;mso-position-vertical:absolute;mso-position-vertical-relative:text;mso-height-percent:0;mso-height-relative:margin;v-text-anchor:top" o:gfxdata="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" filled="f" stroked="f">
-                <v:textbox>
-                  <w:txbxContent>
-                    <w:p>
-                      <w:pPr>
-                        <w:jc w:val="center"/>
-                        <w:rPr>
-                          <w:noProof/>
-                          <w:color w:val="156082" w:themeColor="accent1"/>
-                          <w:sz w:val="32"/>
-                          <w:szCs w:val="32"/>
-                          <w14:shadow w14:blurRad="38100" w14:dist="25400" w14:dir="5400000" w14:sx="100000" w14:sy="100000" w14:kx="0" w14:ky="0" w14:algn="ctr">
-                            <w14:srgbClr w14:val="6E747A">
-                              <w14:alpha w14:val="57000"/>
-                            </w14:srgbClr>
-                          </w14:shadow>
-                          <w14:textOutline w14:w="0" w14:cap="flat" w14:cmpd="sng" w14:algn="ctr">
-                            <w14:noFill/>
-                            <w14:prstDash w14:val="solid"/>
-                            <w14:round/>
-                          </w14:textOutline>
-                        </w:rPr>
-                      </w:pPr>
-                      <w:r>
-                        <w:rPr>
-                          <w:noProof/>
-                          <w:color w:val="156082" w:themeColor="accent1"/>
-                          <w:sz w:val="32"/>
-                          <w:szCs w:val="32"/>
-                          <w:lang w:bidi="he-IL"/>
-                          <w14:shadow w14:blurRad="38100" w14:dist="25400" w14:dir="5400000" w14:sx="100000" w14:sy="100000" w14:kx="0" w14:ky="0" w14:algn="ctr">
-                            <w14:srgbClr w14:val="6E747A">
-                              <w14:alpha w14:val="57000"/>
-                            </w14:srgbClr>
-                          </w14:shadow>
-                          <w14:textOutline w14:w="0" w14:cap="flat" w14:cmpd="sng" w14:algn="ctr">
-                            <w14:noFill/>
-                            <w14:prstDash w14:val="solid"/>
-                            <w14:round/>
-                          </w14:textOutline>
-                        </w:rPr>
-                        <w:t>Skills</w:t>
-                      </w:r>
                     </w:p>
                   </w:txbxContent>
                 </v:textbox>
@@ -3532,7 +3826,7 @@
           </mc:Choice>
           <mc:Fallback>
             <w:pict>
-              <v:line w14:anchorId="58DF22B7" id="מחבר ישר 1" o:spid="_x0000_s1026" style="position:absolute;left:0;text-align:left;z-index:251685888;visibility:visible;mso-wrap-style:square;mso-wrap-distance-left:9pt;mso-wrap-distance-top:0;mso-wrap-distance-right:9pt;mso-wrap-distance-bottom:0;mso-position-horizontal:absolute;mso-position-horizontal-relative:text;mso-position-vertical:absolute;mso-position-vertical-relative:text" from="2.3pt,12.6pt" to="515.3pt,12.6pt" o:gfxdata="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" strokecolor="black [3213]" strokeweight="1.5pt">
+              <v:line w14:anchorId="50E6108F" id="מחבר ישר 1" o:spid="_x0000_s1026" style="position:absolute;left:0;text-align:left;z-index:251685888;visibility:visible;mso-wrap-style:square;mso-wrap-distance-left:9pt;mso-wrap-distance-top:0;mso-wrap-distance-right:9pt;mso-wrap-distance-bottom:0;mso-position-horizontal:absolute;mso-position-horizontal-relative:text;mso-position-vertical:absolute;mso-position-vertical-relative:text" from="2.3pt,12.6pt" to="515.3pt,12.6pt" o:gfxdata="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" strokecolor="black [3213]" strokeweight="1.5pt">
                 <v:stroke joinstyle="miter"/>
               </v:line>
             </w:pict>
@@ -3584,8 +3878,8 @@
                               <w:rPr>
                                 <w:noProof/>
                                 <w:color w:val="156082" w:themeColor="accent1"/>
-                                <w:sz w:val="32"/>
-                                <w:szCs w:val="32"/>
+                                <w:sz w:val="27"/>
+                                <w:szCs w:val="27"/>
                                 <w14:shadow w14:blurRad="38100" w14:dist="25400" w14:dir="5400000" w14:sx="100000" w14:sy="100000" w14:kx="0" w14:ky="0" w14:algn="ctr">
                                   <w14:srgbClr w14:val="6E747A">
                                     <w14:alpha w14:val="57000"/>
@@ -3602,8 +3896,8 @@
                               <w:rPr>
                                 <w:noProof/>
                                 <w:color w:val="156082" w:themeColor="accent1"/>
-                                <w:sz w:val="32"/>
-                                <w:szCs w:val="32"/>
+                                <w:sz w:val="27"/>
+                                <w:szCs w:val="27"/>
                                 <w:lang w:bidi="he-IL"/>
                                 <w14:shadow w14:blurRad="38100" w14:dist="25400" w14:dir="5400000" w14:sx="100000" w14:sy="100000" w14:kx="0" w14:ky="0" w14:algn="ctr">
                                   <w14:srgbClr w14:val="6E747A">
@@ -3647,8 +3941,8 @@
                         <w:rPr>
                           <w:noProof/>
                           <w:color w:val="156082" w:themeColor="accent1"/>
-                          <w:sz w:val="32"/>
-                          <w:szCs w:val="32"/>
+                          <w:sz w:val="27"/>
+                          <w:szCs w:val="27"/>
                           <w14:shadow w14:blurRad="38100" w14:dist="25400" w14:dir="5400000" w14:sx="100000" w14:sy="100000" w14:kx="0" w14:ky="0" w14:algn="ctr">
                             <w14:srgbClr w14:val="6E747A">
                               <w14:alpha w14:val="57000"/>
@@ -3665,8 +3959,8 @@
                         <w:rPr>
                           <w:noProof/>
                           <w:color w:val="156082" w:themeColor="accent1"/>
-                          <w:sz w:val="32"/>
-                          <w:szCs w:val="32"/>
+                          <w:sz w:val="27"/>
+                          <w:szCs w:val="27"/>
                           <w:lang w:bidi="he-IL"/>
                           <w14:shadow w14:blurRad="38100" w14:dist="25400" w14:dir="5400000" w14:sx="100000" w14:sy="100000" w14:kx="0" w14:ky="0" w14:algn="ctr">
                             <w14:srgbClr w14:val="6E747A">
@@ -3755,7 +4049,7 @@
           </mc:Choice>
           <mc:Fallback>
             <w:pict>
-              <v:line w14:anchorId="376CBF29" id="מחבר ישר 1" o:spid="_x0000_s1026" style="position:absolute;left:0;text-align:left;z-index:251695104;visibility:visible;mso-wrap-style:square;mso-width-percent:0;mso-wrap-distance-left:9pt;mso-wrap-distance-top:0;mso-wrap-distance-right:9pt;mso-wrap-distance-bottom:0;mso-position-horizontal:absolute;mso-position-horizontal-relative:text;mso-position-vertical:absolute;mso-position-vertical-relative:text;mso-width-percent:0;mso-width-relative:margin" from="2.3pt,52.35pt" to="518.2pt,52.35pt" o:gfxdata="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" strokecolor="black [3213]" strokeweight="1.5pt">
+              <v:line w14:anchorId="34E7B902" id="מחבר ישר 1" o:spid="_x0000_s1026" style="position:absolute;left:0;text-align:left;z-index:251695104;visibility:visible;mso-wrap-style:square;mso-width-percent:0;mso-wrap-distance-left:9pt;mso-wrap-distance-top:0;mso-wrap-distance-right:9pt;mso-wrap-distance-bottom:0;mso-position-horizontal:absolute;mso-position-horizontal-relative:text;mso-position-vertical:absolute;mso-position-vertical-relative:text;mso-width-percent:0;mso-width-relative:margin" from="2.3pt,52.35pt" to="518.2pt,52.35pt" o:gfxdata="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" strokecolor="black [3213]" strokeweight="1.5pt">
                 <v:stroke joinstyle="miter"/>
               </v:line>
             </w:pict>
@@ -3985,8 +4279,8 @@
                               <w:rPr>
                                 <w:noProof/>
                                 <w:color w:val="156082" w:themeColor="accent1"/>
-                                <w:sz w:val="32"/>
-                                <w:szCs w:val="32"/>
+                                <w:sz w:val="27"/>
+                                <w:szCs w:val="27"/>
                                 <w14:shadow w14:blurRad="38100" w14:dist="25400" w14:dir="5400000" w14:sx="100000" w14:sy="100000" w14:kx="0" w14:ky="0" w14:algn="ctr">
                                   <w14:srgbClr w14:val="6E747A">
                                     <w14:alpha w14:val="57000"/>
@@ -4003,8 +4297,8 @@
                               <w:rPr>
                                 <w:noProof/>
                                 <w:color w:val="156082" w:themeColor="accent1"/>
-                                <w:sz w:val="32"/>
-                                <w:szCs w:val="32"/>
+                                <w:sz w:val="27"/>
+                                <w:szCs w:val="27"/>
                                 <w:lang w:bidi="he-IL"/>
                                 <w14:shadow w14:blurRad="38100" w14:dist="25400" w14:dir="5400000" w14:sx="100000" w14:sy="100000" w14:kx="0" w14:ky="0" w14:algn="ctr">
                                   <w14:srgbClr w14:val="6E747A">
@@ -4017,7 +4311,7 @@
                                   <w14:round/>
                                 </w14:textOutline>
                               </w:rPr>
-                              <w:t>Military Service</w:t>
+                              <w:t>Languages</w:t>
                             </w:r>
                           </w:p>
                         </w:txbxContent>
@@ -4048,8 +4342,8 @@
                         <w:rPr>
                           <w:noProof/>
                           <w:color w:val="156082" w:themeColor="accent1"/>
-                          <w:sz w:val="32"/>
-                          <w:szCs w:val="32"/>
+                          <w:sz w:val="27"/>
+                          <w:szCs w:val="27"/>
                           <w14:shadow w14:blurRad="38100" w14:dist="25400" w14:dir="5400000" w14:sx="100000" w14:sy="100000" w14:kx="0" w14:ky="0" w14:algn="ctr">
                             <w14:srgbClr w14:val="6E747A">
                               <w14:alpha w14:val="57000"/>
@@ -4066,8 +4360,8 @@
                         <w:rPr>
                           <w:noProof/>
                           <w:color w:val="156082" w:themeColor="accent1"/>
-                          <w:sz w:val="32"/>
-                          <w:szCs w:val="32"/>
+                          <w:sz w:val="27"/>
+                          <w:szCs w:val="27"/>
                           <w:lang w:bidi="he-IL"/>
                           <w14:shadow w14:blurRad="38100" w14:dist="25400" w14:dir="5400000" w14:sx="100000" w14:sy="100000" w14:kx="0" w14:ky="0" w14:algn="ctr">
                             <w14:srgbClr w14:val="6E747A">
@@ -4080,7 +4374,7 @@
                             <w14:round/>
                           </w14:textOutline>
                         </w:rPr>
-                        <w:t>Military Service</w:t>
+                        <w:t>Languages</w:t>
                       </w:r>
                     </w:p>
                   </w:txbxContent>
@@ -4189,6 +4483,12 @@
                               </w:rPr>
                               <w:t>Made program for writing medical records</w:t>
                             </w:r>
+                            <w:r>
+                              <w:rPr>
+                                <w:bCs/>
+                              </w:rPr>
+                              <w:t xml:space="preserve"> (Made in JavaScript) </w:t>
+                            </w:r>
                           </w:p>
                           <w:p>
                             <w:pPr>
@@ -4314,6 +4614,12 @@
                           <w:bCs/>
                         </w:rPr>
                         <w:t>Made program for writing medical records</w:t>
+                      </w:r>
+                      <w:r>
+                        <w:rPr>
+                          <w:bCs/>
+                        </w:rPr>
+                        <w:t xml:space="preserve"> (Made in JavaScript) </w:t>
                       </w:r>
                     </w:p>
                     <w:p>
@@ -4430,7 +4736,7 @@
           </mc:Choice>
           <mc:Fallback>
             <w:pict>
-              <v:line w14:anchorId="50E0F3D4" id="מחבר ישר 1" o:spid="_x0000_s1026" style="position:absolute;left:0;text-align:left;z-index:251699200;visibility:visible;mso-wrap-style:square;mso-width-percent:0;mso-wrap-distance-left:9pt;mso-wrap-distance-top:0;mso-wrap-distance-right:9pt;mso-wrap-distance-bottom:0;mso-position-horizontal:absolute;mso-position-horizontal-relative:text;mso-position-vertical:absolute;mso-position-vertical-relative:text;mso-width-percent:0;mso-width-relative:margin" from="3.8pt,93.7pt" to="519.7pt,93.7pt" o:gfxdata="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" strokecolor="black [3213]" strokeweight="1.5pt">
+              <v:line w14:anchorId="42504C27" id="מחבר ישר 1" o:spid="_x0000_s1026" style="position:absolute;left:0;text-align:left;z-index:251699200;visibility:visible;mso-wrap-style:square;mso-width-percent:0;mso-wrap-distance-left:9pt;mso-wrap-distance-top:0;mso-wrap-distance-right:9pt;mso-wrap-distance-bottom:0;mso-position-horizontal:absolute;mso-position-horizontal-relative:text;mso-position-vertical:absolute;mso-position-vertical-relative:text;mso-width-percent:0;mso-width-relative:margin" from="3.8pt,93.7pt" to="519.7pt,93.7pt" o:gfxdata="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" strokecolor="black [3213]" strokeweight="1.5pt">
                 <v:stroke joinstyle="miter"/>
               </v:line>
             </w:pict>
@@ -4624,12 +4930,12 @@
       </w:r>
     </w:p>
     <w:sectPr>
-      <w:headerReference w:type="even" r:id="rId13"/>
-      <w:headerReference w:type="default" r:id="rId14"/>
-      <w:footerReference w:type="even" r:id="rId15"/>
-      <w:footerReference w:type="default" r:id="rId16"/>
-      <w:headerReference w:type="first" r:id="rId17"/>
-      <w:footerReference w:type="first" r:id="rId18"/>
+      <w:headerReference w:type="even" r:id="rId37"/>
+      <w:headerReference w:type="default" r:id="rId38"/>
+      <w:footerReference w:type="even" r:id="rId39"/>
+      <w:footerReference w:type="default" r:id="rId40"/>
+      <w:headerReference w:type="first" r:id="rId41"/>
+      <w:footerReference w:type="first" r:id="rId42"/>
       <w:pgSz w:w="12240" w:h="15840"/>
       <w:pgMar w:top="0" w:right="720" w:bottom="720" w:left="794" w:header="0" w:footer="0" w:gutter="0"/>
       <w:cols w:space="720"/>
@@ -6826,6 +7132,18 @@
       </w:tblBorders>
     </w:tblPr>
   </w:style>
+  <w:style w:type="character" w:styleId="FollowedHyperlink">
+    <w:name w:val="FollowedHyperlink"/>
+    <w:basedOn w:val="a0"/>
+    <w:uiPriority w:val="99"/>
+    <w:semiHidden/>
+    <w:unhideWhenUsed/>
+    <w:rsid w:val="000724FA"/>
+    <w:rPr>
+      <w:color w:val="96607D" w:themeColor="followedHyperlink"/>
+      <w:u w:val="single"/>
+    </w:rPr>
+  </w:style>
 </w:styles>
 </file>
 

</xml_diff>

<commit_message>
new cleaner link for linkdean
</commit_message>
<xml_diff>
--- a/CV-RenanBazinin.docx
+++ b/CV-RenanBazinin.docx
@@ -265,7 +265,7 @@
                 <w:noProof/>
               </w:rPr>
               <w:drawing>
-                <wp:anchor distT="0" distB="0" distL="114300" distR="114300" simplePos="0" relativeHeight="251685888" behindDoc="0" locked="0" layoutInCell="1" allowOverlap="1" wp14:anchorId="42E52E50" wp14:editId="413ED3E9">
+                <wp:anchor distT="0" distB="0" distL="114300" distR="114300" simplePos="0" relativeHeight="251685888" behindDoc="0" locked="0" layoutInCell="1" allowOverlap="1" wp14:anchorId="42E52E50" wp14:editId="59898588">
                   <wp:simplePos x="0" y="0"/>
                   <wp:positionH relativeFrom="column">
                     <wp:posOffset>2187739</wp:posOffset>
@@ -5163,6 +5163,7 @@
   <w:style w:type="character" w:default="1" w:styleId="a1">
     <w:name w:val="Default Paragraph Font"/>
     <w:uiPriority w:val="1"/>
+    <w:semiHidden/>
     <w:unhideWhenUsed/>
   </w:style>
   <w:style w:type="table" w:default="1" w:styleId="a2">
@@ -5793,6 +5794,30 @@
 </file>
 
 <file path=customXml/item2.xml><?xml version="1.0" encoding="utf-8"?>
+<b:Sources xmlns:b="http://schemas.openxmlformats.org/officeDocument/2006/bibliography" xmlns="http://schemas.openxmlformats.org/officeDocument/2006/bibliography" SelectedStyle="\APASixthEditionOfficeOnline.xsl" StyleName="APA" Version="6"/>
+</file>
+
+<file path=customXml/item3.xml><?xml version="1.0" encoding="utf-8"?>
+<p:properties xmlns:p="http://schemas.microsoft.com/office/2006/metadata/properties" xmlns:xsi="http://www.w3.org/2001/XMLSchema-instance" xmlns:pc="http://schemas.microsoft.com/office/infopath/2007/PartnerControls">
+  <documentManagement>
+    <_ip_UnifiedCompliancePolicyUIAction xmlns="http://schemas.microsoft.com/sharepoint/v3" xsi:nil="true"/>
+    <Image xmlns="71af3243-3dd4-4a8d-8c0d-dd76da1f02a5">
+      <Url xsi:nil="true"/>
+      <Description xsi:nil="true"/>
+    </Image>
+    <Status xmlns="71af3243-3dd4-4a8d-8c0d-dd76da1f02a5">Not started</Status>
+    <Background xmlns="71af3243-3dd4-4a8d-8c0d-dd76da1f02a5">false</Background>
+    <_ip_UnifiedCompliancePolicyProperties xmlns="http://schemas.microsoft.com/sharepoint/v3" xsi:nil="true"/>
+    <ImageTagsTaxHTField xmlns="71af3243-3dd4-4a8d-8c0d-dd76da1f02a5">
+      <Terms xmlns="http://schemas.microsoft.com/office/infopath/2007/PartnerControls"/>
+    </ImageTagsTaxHTField>
+    <TaxCatchAll xmlns="230e9df3-be65-4c73-a93b-d1236ebd677e" xsi:nil="true"/>
+    <MediaServiceKeyPoints xmlns="71af3243-3dd4-4a8d-8c0d-dd76da1f02a5" xsi:nil="true"/>
+  </documentManagement>
+</p:properties>
+</file>
+
+<file path=customXml/item4.xml><?xml version="1.0" encoding="utf-8"?>
 <ct:contentTypeSchema xmlns:ct="http://schemas.microsoft.com/office/2006/metadata/contentType" xmlns:ma="http://schemas.microsoft.com/office/2006/metadata/properties/metaAttributes" ct:_="" ma:_="" ma:contentTypeName="Document" ma:contentTypeID="0x01010079F111ED35F8CC479449609E8A0923A6" ma:contentTypeVersion="28" ma:contentTypeDescription="Create a new document." ma:contentTypeScope="" ma:versionID="60f5a4f2d2b0abadcf532d48ebf9cb71">
   <xsd:schema xmlns:xsd="http://www.w3.org/2001/XMLSchema" xmlns:xs="http://www.w3.org/2001/XMLSchema" xmlns:p="http://schemas.microsoft.com/office/2006/metadata/properties" xmlns:ns1="http://schemas.microsoft.com/sharepoint/v3" xmlns:ns2="71af3243-3dd4-4a8d-8c0d-dd76da1f02a5" xmlns:ns3="16c05727-aa75-4e4a-9b5f-8a80a1165891" xmlns:ns4="230e9df3-be65-4c73-a93b-d1236ebd677e" targetNamespace="http://schemas.microsoft.com/office/2006/metadata/properties" ma:root="true" ma:fieldsID="7dd78129e6a1811f84807ad11c651531" ns1:_="" ns2:_="" ns3:_="" ns4:_="">
     <xsd:import namespace="http://schemas.microsoft.com/sharepoint/v3"/>
@@ -6104,30 +6129,6 @@
 </ct:contentTypeSchema>
 </file>
 
-<file path=customXml/item3.xml><?xml version="1.0" encoding="utf-8"?>
-<p:properties xmlns:p="http://schemas.microsoft.com/office/2006/metadata/properties" xmlns:xsi="http://www.w3.org/2001/XMLSchema-instance" xmlns:pc="http://schemas.microsoft.com/office/infopath/2007/PartnerControls">
-  <documentManagement>
-    <_ip_UnifiedCompliancePolicyUIAction xmlns="http://schemas.microsoft.com/sharepoint/v3" xsi:nil="true"/>
-    <Image xmlns="71af3243-3dd4-4a8d-8c0d-dd76da1f02a5">
-      <Url xsi:nil="true"/>
-      <Description xsi:nil="true"/>
-    </Image>
-    <Status xmlns="71af3243-3dd4-4a8d-8c0d-dd76da1f02a5">Not started</Status>
-    <Background xmlns="71af3243-3dd4-4a8d-8c0d-dd76da1f02a5">false</Background>
-    <_ip_UnifiedCompliancePolicyProperties xmlns="http://schemas.microsoft.com/sharepoint/v3" xsi:nil="true"/>
-    <ImageTagsTaxHTField xmlns="71af3243-3dd4-4a8d-8c0d-dd76da1f02a5">
-      <Terms xmlns="http://schemas.microsoft.com/office/infopath/2007/PartnerControls"/>
-    </ImageTagsTaxHTField>
-    <TaxCatchAll xmlns="230e9df3-be65-4c73-a93b-d1236ebd677e" xsi:nil="true"/>
-    <MediaServiceKeyPoints xmlns="71af3243-3dd4-4a8d-8c0d-dd76da1f02a5" xsi:nil="true"/>
-  </documentManagement>
-</p:properties>
-</file>
-
-<file path=customXml/item4.xml><?xml version="1.0" encoding="utf-8"?>
-<b:Sources xmlns:b="http://schemas.openxmlformats.org/officeDocument/2006/bibliography" xmlns="http://schemas.openxmlformats.org/officeDocument/2006/bibliography" SelectedStyle="\APASixthEditionOfficeOnline.xsl" StyleName="APA" Version="6"/>
-</file>
-
 <file path=customXml/itemProps1.xml><?xml version="1.0" encoding="utf-8"?>
 <ds:datastoreItem xmlns:ds="http://schemas.openxmlformats.org/officeDocument/2006/customXml" ds:itemID="{16C9806D-6FA0-4039-A2F4-D6C733EEB38B}">
   <ds:schemaRefs>
@@ -6137,6 +6138,26 @@
 </file>
 
 <file path=customXml/itemProps2.xml><?xml version="1.0" encoding="utf-8"?>
+<ds:datastoreItem xmlns:ds="http://schemas.openxmlformats.org/officeDocument/2006/customXml" ds:itemID="{FACE20B0-D6EE-471D-98A5-A78385091934}">
+  <ds:schemaRefs>
+    <ds:schemaRef ds:uri="http://schemas.openxmlformats.org/officeDocument/2006/bibliography"/>
+  </ds:schemaRefs>
+</ds:datastoreItem>
+</file>
+
+<file path=customXml/itemProps3.xml><?xml version="1.0" encoding="utf-8"?>
+<ds:datastoreItem xmlns:ds="http://schemas.openxmlformats.org/officeDocument/2006/customXml" ds:itemID="{13B40C1D-7939-44F4-990C-CB06DFE0EF80}">
+  <ds:schemaRefs>
+    <ds:schemaRef ds:uri="http://schemas.microsoft.com/office/2006/metadata/properties"/>
+    <ds:schemaRef ds:uri="http://schemas.microsoft.com/office/infopath/2007/PartnerControls"/>
+    <ds:schemaRef ds:uri="http://schemas.microsoft.com/sharepoint/v3"/>
+    <ds:schemaRef ds:uri="71af3243-3dd4-4a8d-8c0d-dd76da1f02a5"/>
+    <ds:schemaRef ds:uri="230e9df3-be65-4c73-a93b-d1236ebd677e"/>
+  </ds:schemaRefs>
+</ds:datastoreItem>
+</file>
+
+<file path=customXml/itemProps4.xml><?xml version="1.0" encoding="utf-8"?>
 <ds:datastoreItem xmlns:ds="http://schemas.openxmlformats.org/officeDocument/2006/customXml" ds:itemID="{98FC8582-55FF-4BED-ABF3-70ED2D2AFB76}">
   <ds:schemaRefs>
     <ds:schemaRef ds:uri="http://schemas.microsoft.com/office/2006/metadata/contentType"/>
@@ -6157,26 +6178,6 @@
 </ds:datastoreItem>
 </file>
 
-<file path=customXml/itemProps3.xml><?xml version="1.0" encoding="utf-8"?>
-<ds:datastoreItem xmlns:ds="http://schemas.openxmlformats.org/officeDocument/2006/customXml" ds:itemID="{13B40C1D-7939-44F4-990C-CB06DFE0EF80}">
-  <ds:schemaRefs>
-    <ds:schemaRef ds:uri="http://schemas.microsoft.com/office/2006/metadata/properties"/>
-    <ds:schemaRef ds:uri="http://schemas.microsoft.com/office/infopath/2007/PartnerControls"/>
-    <ds:schemaRef ds:uri="http://schemas.microsoft.com/sharepoint/v3"/>
-    <ds:schemaRef ds:uri="71af3243-3dd4-4a8d-8c0d-dd76da1f02a5"/>
-    <ds:schemaRef ds:uri="230e9df3-be65-4c73-a93b-d1236ebd677e"/>
-  </ds:schemaRefs>
-</ds:datastoreItem>
-</file>
-
-<file path=customXml/itemProps4.xml><?xml version="1.0" encoding="utf-8"?>
-<ds:datastoreItem xmlns:ds="http://schemas.openxmlformats.org/officeDocument/2006/customXml" ds:itemID="{FACE20B0-D6EE-471D-98A5-A78385091934}">
-  <ds:schemaRefs>
-    <ds:schemaRef ds:uri="http://schemas.openxmlformats.org/officeDocument/2006/bibliography"/>
-  </ds:schemaRefs>
-</ds:datastoreItem>
-</file>
-
 <file path=docMetadata/LabelInfo.xml><?xml version="1.0" encoding="utf-8"?>
 <clbl:labelList xmlns:clbl="http://schemas.microsoft.com/office/2020/mipLabelMetadata"/>
 </file>
</xml_diff>

<commit_message>
fix linkdean new link without numbers
</commit_message>
<xml_diff>
--- a/CV-RenanBazinin.docx
+++ b/CV-RenanBazinin.docx
@@ -351,7 +351,7 @@
           </mc:Choice>
           <mc:Fallback>
             <w:pict>
-              <v:line w14:anchorId="0EBC2040" id="Straight Connector 2" o:spid="_x0000_s1026" style="position:absolute;left:0;text-align:left;flip:y;z-index:251659264;visibility:visible;mso-wrap-style:square;mso-wrap-distance-left:9pt;mso-wrap-distance-top:0;mso-wrap-distance-right:9pt;mso-wrap-distance-bottom:0;mso-position-horizontal:absolute;mso-position-horizontal-relative:text;mso-position-vertical:absolute;mso-position-vertical-relative:text" from="1.2pt,-.05pt" to="452.4pt,1.15pt" o:gfxdata="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" strokecolor="#4472c4 [3204]" strokeweight=".5pt">
+              <v:line w14:anchorId="407CA16D" id="Straight Connector 2" o:spid="_x0000_s1026" style="position:absolute;left:0;text-align:left;flip:y;z-index:251659264;visibility:visible;mso-wrap-style:square;mso-wrap-distance-left:9pt;mso-wrap-distance-top:0;mso-wrap-distance-right:9pt;mso-wrap-distance-bottom:0;mso-position-horizontal:absolute;mso-position-horizontal-relative:text;mso-position-vertical:absolute;mso-position-vertical-relative:text" from="1.2pt,-.05pt" to="452.4pt,1.15pt" o:gfxdata="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" strokecolor="#4472c4 [3204]" strokeweight=".5pt">
                 <v:stroke joinstyle="miter"/>
               </v:line>
             </w:pict>
@@ -886,7 +886,7 @@
           </mc:Choice>
           <mc:Fallback>
             <w:pict>
-              <v:line w14:anchorId="5CEE5116" id="Straight Connector 8" o:spid="_x0000_s1026" style="position:absolute;left:0;text-align:left;flip:y;z-index:251672576;visibility:visible;mso-wrap-style:square;mso-wrap-distance-left:9pt;mso-wrap-distance-top:0;mso-wrap-distance-right:9pt;mso-wrap-distance-bottom:0;mso-position-horizontal:absolute;mso-position-horizontal-relative:text;mso-position-vertical:absolute;mso-position-vertical-relative:text" from="0,2.2pt" to="451.2pt,3.4pt" o:gfxdata="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" strokecolor="#4472c4 [3204]" strokeweight=".5pt">
+              <v:line w14:anchorId="34D3DFF0" id="Straight Connector 8" o:spid="_x0000_s1026" style="position:absolute;left:0;text-align:left;flip:y;z-index:251672576;visibility:visible;mso-wrap-style:square;mso-wrap-distance-left:9pt;mso-wrap-distance-top:0;mso-wrap-distance-right:9pt;mso-wrap-distance-bottom:0;mso-position-horizontal:absolute;mso-position-horizontal-relative:text;mso-position-vertical:absolute;mso-position-vertical-relative:text" from="0,2.2pt" to="451.2pt,3.4pt" o:gfxdata="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" strokecolor="#4472c4 [3204]" strokeweight=".5pt">
                 <v:stroke joinstyle="miter"/>
               </v:line>
             </w:pict>
@@ -1506,7 +1506,7 @@
           </mc:Choice>
           <mc:Fallback>
             <w:pict>
-              <v:line w14:anchorId="20CB8CCD" id="Straight Connector 5" o:spid="_x0000_s1026" style="position:absolute;left:0;text-align:left;flip:y;z-index:251678720;visibility:visible;mso-wrap-style:square;mso-wrap-distance-left:9pt;mso-wrap-distance-top:0;mso-wrap-distance-right:9pt;mso-wrap-distance-bottom:0;mso-position-horizontal:absolute;mso-position-horizontal-relative:text;mso-position-vertical:absolute;mso-position-vertical-relative:text" from="0,10.8pt" to="451.2pt,12pt" o:gfxdata="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" strokecolor="#4472c4 [3204]" strokeweight=".5pt">
+              <v:line w14:anchorId="6AC54683" id="Straight Connector 5" o:spid="_x0000_s1026" style="position:absolute;left:0;text-align:left;flip:y;z-index:251678720;visibility:visible;mso-wrap-style:square;mso-wrap-distance-left:9pt;mso-wrap-distance-top:0;mso-wrap-distance-right:9pt;mso-wrap-distance-bottom:0;mso-position-horizontal:absolute;mso-position-horizontal-relative:text;mso-position-vertical:absolute;mso-position-vertical-relative:text" from="0,10.8pt" to="451.2pt,12pt" o:gfxdata="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" strokecolor="#4472c4 [3204]" strokeweight=".5pt">
                 <v:stroke joinstyle="miter"/>
               </v:line>
             </w:pict>
@@ -2091,7 +2091,7 @@
           </mc:Choice>
           <mc:Fallback>
             <w:pict>
-              <v:line w14:anchorId="508665B6" id="Straight Connector 10" o:spid="_x0000_s1026" style="position:absolute;left:0;text-align:left;flip:y;z-index:251676672;visibility:visible;mso-wrap-style:square;mso-wrap-distance-left:9pt;mso-wrap-distance-top:0;mso-wrap-distance-right:9pt;mso-wrap-distance-bottom:0;mso-position-horizontal:absolute;mso-position-horizontal-relative:text;mso-position-vertical:absolute;mso-position-vertical-relative:text" from="0,-.05pt" to="451.2pt,1.15pt" o:gfxdata="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" strokecolor="#4472c4 [3204]" strokeweight=".5pt">
+              <v:line w14:anchorId="4E28B6E3" id="Straight Connector 10" o:spid="_x0000_s1026" style="position:absolute;left:0;text-align:left;flip:y;z-index:251676672;visibility:visible;mso-wrap-style:square;mso-wrap-distance-left:9pt;mso-wrap-distance-top:0;mso-wrap-distance-right:9pt;mso-wrap-distance-bottom:0;mso-position-horizontal:absolute;mso-position-horizontal-relative:text;mso-position-vertical:absolute;mso-position-vertical-relative:text" from="0,-.05pt" to="451.2pt,1.15pt" o:gfxdata="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" strokecolor="#4472c4 [3204]" strokeweight=".5pt">
                 <v:stroke joinstyle="miter"/>
               </v:line>
             </w:pict>

</xml_diff>

<commit_message>
mother tongue to native.....
</commit_message>
<xml_diff>
--- a/CV-RenanBazinin.docx
+++ b/CV-RenanBazinin.docx
@@ -391,15 +391,13 @@
           <w:numId w:val="1"/>
         </w:numPr>
       </w:pPr>
-      <w:proofErr w:type="spellStart"/>
-      <w:r>
-        <w:rPr>
-          <w:b/>
-          <w:bCs/>
-        </w:rPr>
-        <w:t>FocusFlow</w:t>
-      </w:r>
-      <w:proofErr w:type="spellEnd"/>
+      <w:r>
+        <w:rPr>
+          <w:b/>
+          <w:bCs/>
+        </w:rPr>
+        <w:t xml:space="preserve">FocusFlow </w:t>
+      </w:r>
       <w:r>
         <w:rPr>
           <w:b/>
@@ -409,31 +407,18 @@
       </w:r>
       <w:r>
         <w:rPr>
-          <w:b/>
-          <w:bCs/>
+          <w:rFonts w:cstheme="minorHAnsi"/>
+        </w:rPr>
+        <w:t>–</w:t>
+      </w:r>
+      <w:r>
+        <w:rPr>
+          <w:rFonts w:cstheme="minorHAnsi"/>
         </w:rPr>
         <w:t xml:space="preserve"> </w:t>
       </w:r>
       <w:r>
-        <w:rPr>
-          <w:rFonts w:cstheme="minorHAnsi"/>
-        </w:rPr>
-        <w:t>–</w:t>
-      </w:r>
-      <w:r>
-        <w:rPr>
-          <w:rFonts w:cstheme="minorHAnsi"/>
-        </w:rPr>
-        <w:t xml:space="preserve"> </w:t>
-      </w:r>
-      <w:r>
-        <w:t xml:space="preserve">Full Stack </w:t>
-      </w:r>
-      <w:r>
-        <w:t>AI video learning platfor</w:t>
-      </w:r>
-      <w:r>
-        <w:t>m</w:t>
+        <w:t>Full Stack AI video learning platform</w:t>
       </w:r>
     </w:p>
     <w:p>
@@ -496,10 +481,7 @@
         <w:t>Client side: w</w:t>
       </w:r>
       <w:r>
-        <w:t xml:space="preserve">orked </w:t>
-      </w:r>
-      <w:r>
-        <w:t>with React, ONNX.</w:t>
+        <w:t>orked with React, ONNX.</w:t>
       </w:r>
     </w:p>
     <w:p>
@@ -512,15 +494,7 @@
         <w:spacing w:after="0" w:line="276" w:lineRule="auto"/>
       </w:pPr>
       <w:r>
-        <w:t xml:space="preserve">Used Google's </w:t>
-      </w:r>
-      <w:proofErr w:type="spellStart"/>
-      <w:r>
-        <w:t>MediaPipe</w:t>
-      </w:r>
-      <w:proofErr w:type="spellEnd"/>
-      <w:r>
-        <w:t xml:space="preserve"> in the client to extract landmarks in real </w:t>
+        <w:t xml:space="preserve">Used Google's MediaPipe in the client to extract landmarks in real </w:t>
       </w:r>
       <w:r>
         <w:t>time</w:t>
@@ -594,19 +568,7 @@
         <w:rPr>
           <w:rFonts w:cstheme="minorHAnsi"/>
         </w:rPr>
-        <w:t xml:space="preserve"> logs watch events and </w:t>
-      </w:r>
-      <w:r>
-        <w:rPr>
-          <w:rFonts w:cstheme="minorHAnsi"/>
-        </w:rPr>
-        <w:t>serve</w:t>
-      </w:r>
-      <w:r>
-        <w:rPr>
-          <w:rFonts w:cstheme="minorHAnsi"/>
-        </w:rPr>
-        <w:t xml:space="preserve"> generated quizzes/summaries for analytics.</w:t>
+        <w:t xml:space="preserve"> logs watch events and serve generated quizzes/summaries for analytics.</w:t>
       </w:r>
     </w:p>
     <w:p>
@@ -811,10 +773,7 @@
         </w:rPr>
       </w:pPr>
       <w:r>
-        <w:t xml:space="preserve">Responsive and shipped </w:t>
-      </w:r>
-      <w:r>
-        <w:t>on Google Play.</w:t>
+        <w:t>Responsive and shipped on Google Play.</w:t>
       </w:r>
     </w:p>
     <w:p>
@@ -1176,7 +1135,11 @@
           </mc:Choice>
           <mc:Fallback>
             <w:pict>
-              <v:shape w14:anchorId="42CD17ED" id="_x0000_s1027" type="#_x0000_t202" style="position:absolute;margin-left:-13.5pt;margin-top:12.2pt;width:429.75pt;height:65.25pt;z-index:251682816;visibility:visible;mso-wrap-style:square;mso-wrap-distance-left:9pt;mso-wrap-distance-top:0;mso-wrap-distance-right:9pt;mso-wrap-distance-bottom:0;mso-position-horizontal:absolute;mso-position-horizontal-relative:text;mso-position-vertical:absolute;mso-position-vertical-relative:text;v-text-anchor:top" o:gfxdata="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" filled="f" stroked="f" strokeweight=".5pt">
+              <v:shapetype w14:anchorId="42CD17ED" id="_x0000_t202" coordsize="21600,21600" o:spt="202" path="m,l,21600r21600,l21600,xe">
+                <v:stroke joinstyle="miter"/>
+                <v:path gradientshapeok="t" o:connecttype="rect"/>
+              </v:shapetype>
+              <v:shape id="_x0000_s1027" type="#_x0000_t202" style="position:absolute;margin-left:-13.5pt;margin-top:12.2pt;width:429.75pt;height:65.25pt;z-index:251682816;visibility:visible;mso-wrap-style:square;mso-wrap-distance-left:9pt;mso-wrap-distance-top:0;mso-wrap-distance-right:9pt;mso-wrap-distance-bottom:0;mso-position-horizontal:absolute;mso-position-horizontal-relative:text;mso-position-vertical:absolute;mso-position-vertical-relative:text;v-text-anchor:top" o:gfxdata="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" filled="f" stroked="f" strokeweight=".5pt">
                 <v:textbox>
                   <w:txbxContent>
                     <w:tbl>
@@ -2725,7 +2688,13 @@
         <w:rPr>
           <w:rFonts w:cstheme="minorHAnsi"/>
         </w:rPr>
-        <w:t>Hebrew – mother tongue</w:t>
+        <w:t xml:space="preserve">Hebrew – </w:t>
+      </w:r>
+      <w:r>
+        <w:rPr>
+          <w:rFonts w:cstheme="minorHAnsi"/>
+        </w:rPr>
+        <w:t>Native</w:t>
       </w:r>
     </w:p>
     <w:p>
@@ -3757,6 +3726,7 @@
   <w:style w:type="character" w:default="1" w:styleId="a0">
     <w:name w:val="Default Paragraph Font"/>
     <w:uiPriority w:val="1"/>
+    <w:semiHidden/>
     <w:unhideWhenUsed/>
   </w:style>
   <w:style w:type="table" w:default="1" w:styleId="a1">

</xml_diff>

<commit_message>
after call changes: more buzzwords!
</commit_message>
<xml_diff>
--- a/CV-RenanBazinin.docx
+++ b/CV-RenanBazinin.docx
@@ -391,12 +391,21 @@
           <w:numId w:val="1"/>
         </w:numPr>
       </w:pPr>
+      <w:proofErr w:type="spellStart"/>
       <w:r>
         <w:rPr>
           <w:b/>
           <w:bCs/>
         </w:rPr>
-        <w:t xml:space="preserve">FocusFlow </w:t>
+        <w:t>FocusFlow</w:t>
+      </w:r>
+      <w:proofErr w:type="spellEnd"/>
+      <w:r>
+        <w:rPr>
+          <w:b/>
+          <w:bCs/>
+        </w:rPr>
+        <w:t xml:space="preserve"> </w:t>
       </w:r>
       <w:r>
         <w:rPr>
@@ -475,29 +484,33 @@
           <w:ilvl w:val="1"/>
           <w:numId w:val="1"/>
         </w:numPr>
-        <w:spacing w:after="0" w:line="276" w:lineRule="auto"/>
-      </w:pPr>
-      <w:r>
-        <w:t>Client side: w</w:t>
-      </w:r>
-      <w:r>
-        <w:t>orked with React, ONNX.</w:t>
-      </w:r>
-    </w:p>
-    <w:p>
-      <w:pPr>
-        <w:pStyle w:val="a4"/>
-        <w:numPr>
-          <w:ilvl w:val="1"/>
-          <w:numId w:val="1"/>
-        </w:numPr>
-        <w:spacing w:after="0" w:line="276" w:lineRule="auto"/>
-      </w:pPr>
-      <w:r>
-        <w:t xml:space="preserve">Used Google's MediaPipe in the client to extract landmarks in real </w:t>
-      </w:r>
-      <w:r>
-        <w:t>time</w:t>
+        <w:spacing w:after="0" w:line="240" w:lineRule="auto"/>
+        <w:rPr>
+          <w:rFonts w:cstheme="minorHAnsi"/>
+        </w:rPr>
+      </w:pPr>
+      <w:r>
+        <w:t>On client worked on</w:t>
+      </w:r>
+      <w:r>
+        <w:t>:</w:t>
+      </w:r>
+      <w:r>
+        <w:t xml:space="preserve"> React</w:t>
+      </w:r>
+      <w:r>
+        <w:t>, Redux and</w:t>
+      </w:r>
+      <w:r>
+        <w:t xml:space="preserve"> </w:t>
+      </w:r>
+      <w:proofErr w:type="spellStart"/>
+      <w:r>
+        <w:t>MediaPipe</w:t>
+      </w:r>
+      <w:proofErr w:type="spellEnd"/>
+      <w:r>
+        <w:t xml:space="preserve"> to extract landmarks in real time</w:t>
       </w:r>
       <w:r>
         <w:t>.</w:t>
@@ -519,25 +532,31 @@
         <w:rPr>
           <w:rFonts w:cstheme="minorHAnsi"/>
         </w:rPr>
-        <w:t>Server side W</w:t>
-      </w:r>
-      <w:r>
-        <w:rPr>
-          <w:rFonts w:cstheme="minorHAnsi"/>
-        </w:rPr>
-        <w:t xml:space="preserve">orked </w:t>
-      </w:r>
-      <w:r>
-        <w:rPr>
-          <w:rFonts w:cstheme="minorHAnsi"/>
-        </w:rPr>
-        <w:t xml:space="preserve">with </w:t>
-      </w:r>
-      <w:r>
-        <w:rPr>
-          <w:rFonts w:cstheme="minorHAnsi"/>
-        </w:rPr>
-        <w:t>Python, Flask.</w:t>
+        <w:t xml:space="preserve">On server worked on: Built a Flask REST service, used Gemini </w:t>
+      </w:r>
+      <w:r>
+        <w:rPr>
+          <w:rFonts w:cstheme="minorHAnsi"/>
+        </w:rPr>
+        <w:t xml:space="preserve">API </w:t>
+      </w:r>
+      <w:r>
+        <w:rPr>
+          <w:rFonts w:cstheme="minorHAnsi"/>
+        </w:rPr>
+        <w:t>to create quizzes/summaries, and Docker</w:t>
+      </w:r>
+      <w:r>
+        <w:rPr>
+          <w:rFonts w:cstheme="minorHAnsi"/>
+        </w:rPr>
+        <w:t xml:space="preserve"> </w:t>
+      </w:r>
+      <w:r>
+        <w:rPr>
+          <w:rFonts w:cstheme="minorHAnsi"/>
+        </w:rPr>
+        <w:t>packaged for GCP production.</w:t>
       </w:r>
     </w:p>
     <w:p>
@@ -556,57 +575,7 @@
         <w:rPr>
           <w:rFonts w:cstheme="minorHAnsi"/>
         </w:rPr>
-        <w:t>REST API for auth/videos/playlists</w:t>
-      </w:r>
-      <w:r>
-        <w:rPr>
-          <w:rFonts w:cstheme="minorHAnsi"/>
-        </w:rPr>
-        <w:t>.</w:t>
-      </w:r>
-      <w:r>
-        <w:rPr>
-          <w:rFonts w:cstheme="minorHAnsi"/>
-        </w:rPr>
-        <w:t xml:space="preserve"> logs watch events and serve generated quizzes/summaries for analytics.</w:t>
-      </w:r>
-    </w:p>
-    <w:p>
-      <w:pPr>
-        <w:pStyle w:val="a4"/>
-        <w:numPr>
-          <w:ilvl w:val="1"/>
-          <w:numId w:val="1"/>
-        </w:numPr>
-        <w:spacing w:after="0" w:line="240" w:lineRule="auto"/>
-        <w:rPr>
-          <w:rFonts w:cstheme="minorHAnsi"/>
-        </w:rPr>
-      </w:pPr>
-      <w:r>
-        <w:rPr>
-          <w:rFonts w:cstheme="minorHAnsi"/>
-        </w:rPr>
-        <w:t>Trained models to detect Engagement levels</w:t>
-      </w:r>
-    </w:p>
-    <w:p>
-      <w:pPr>
-        <w:pStyle w:val="a4"/>
-        <w:numPr>
-          <w:ilvl w:val="1"/>
-          <w:numId w:val="1"/>
-        </w:numPr>
-        <w:spacing w:after="0" w:line="240" w:lineRule="auto"/>
-        <w:rPr>
-          <w:rFonts w:cstheme="minorHAnsi"/>
-        </w:rPr>
-      </w:pPr>
-      <w:r>
-        <w:rPr>
-          <w:rFonts w:cstheme="minorHAnsi"/>
-        </w:rPr>
-        <w:t>Honors</w:t>
+        <w:t>Recognition</w:t>
       </w:r>
       <w:r>
         <w:rPr>
@@ -617,16 +586,40 @@
       <w:r>
         <w:rPr>
           <w:rFonts w:cstheme="minorHAnsi"/>
+        </w:rPr>
+        <w:t xml:space="preserve">AIED 2025 </w:t>
+      </w:r>
+      <w:r>
+        <w:rPr>
+          <w:rFonts w:cstheme="minorHAnsi"/>
+        </w:rPr>
+        <w:t xml:space="preserve">published </w:t>
+      </w:r>
+      <w:r>
+        <w:rPr>
+          <w:rFonts w:cstheme="minorHAnsi"/>
+        </w:rPr>
+        <w:t>paper + demo</w:t>
+      </w:r>
+      <w:r>
+        <w:rPr>
+          <w:rFonts w:cstheme="minorHAnsi"/>
+        </w:rPr>
+        <w:t xml:space="preserve">. </w:t>
+      </w:r>
+      <w:r>
+        <w:rPr>
+          <w:rFonts w:cstheme="minorHAnsi"/>
+        </w:rPr>
+        <w:br/>
+      </w:r>
+      <w:r>
+        <w:rPr>
+          <w:rFonts w:cstheme="minorHAnsi"/>
           <w:b/>
           <w:bCs/>
         </w:rPr>
-        <w:t>First place</w:t>
-      </w:r>
-      <w:r>
-        <w:rPr>
-          <w:rFonts w:cstheme="minorHAnsi"/>
-        </w:rPr>
-        <w:t xml:space="preserve"> at </w:t>
+        <w:t>1</w:t>
       </w:r>
       <w:r>
         <w:rPr>
@@ -634,21 +627,13 @@
           <w:b/>
           <w:bCs/>
         </w:rPr>
-        <w:t>SYSTOR 2025 (ACM)</w:t>
-      </w:r>
-      <w:r>
-        <w:rPr>
-          <w:rFonts w:cstheme="minorHAnsi"/>
-        </w:rPr>
-        <w:t xml:space="preserve"> and </w:t>
-      </w:r>
-      <w:r>
-        <w:rPr>
-          <w:rFonts w:cstheme="minorHAnsi"/>
-          <w:b/>
-          <w:bCs/>
-        </w:rPr>
-        <w:t>MTA Final Project Exhibition</w:t>
+        <w:t>st place</w:t>
+      </w:r>
+      <w:r>
+        <w:rPr>
+          <w:rFonts w:cstheme="minorHAnsi"/>
+        </w:rPr>
+        <w:t xml:space="preserve"> at SYSTOR 2025 (ACM) and MTA Final Project Exhibition.</w:t>
       </w:r>
     </w:p>
     <w:p>
@@ -775,6 +760,22 @@
       <w:r>
         <w:t>Responsive and shipped on Google Play.</w:t>
       </w:r>
+    </w:p>
+    <w:p>
+      <w:pPr>
+        <w:spacing w:after="0" w:line="240" w:lineRule="auto"/>
+        <w:rPr>
+          <w:rFonts w:cstheme="minorHAnsi"/>
+        </w:rPr>
+      </w:pPr>
+    </w:p>
+    <w:p>
+      <w:pPr>
+        <w:spacing w:after="0" w:line="240" w:lineRule="auto"/>
+        <w:rPr>
+          <w:rFonts w:cstheme="minorHAnsi"/>
+        </w:rPr>
+      </w:pPr>
     </w:p>
     <w:p>
       <w:pPr>
@@ -1135,11 +1136,7 @@
           </mc:Choice>
           <mc:Fallback>
             <w:pict>
-              <v:shapetype w14:anchorId="42CD17ED" id="_x0000_t202" coordsize="21600,21600" o:spt="202" path="m,l,21600r21600,l21600,xe">
-                <v:stroke joinstyle="miter"/>
-                <v:path gradientshapeok="t" o:connecttype="rect"/>
-              </v:shapetype>
-              <v:shape id="_x0000_s1027" type="#_x0000_t202" style="position:absolute;margin-left:-13.5pt;margin-top:12.2pt;width:429.75pt;height:65.25pt;z-index:251682816;visibility:visible;mso-wrap-style:square;mso-wrap-distance-left:9pt;mso-wrap-distance-top:0;mso-wrap-distance-right:9pt;mso-wrap-distance-bottom:0;mso-position-horizontal:absolute;mso-position-horizontal-relative:text;mso-position-vertical:absolute;mso-position-vertical-relative:text;v-text-anchor:top" o:gfxdata="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" filled="f" stroked="f" strokeweight=".5pt">
+              <v:shape w14:anchorId="42CD17ED" id="_x0000_s1027" type="#_x0000_t202" style="position:absolute;margin-left:-13.5pt;margin-top:12.2pt;width:429.75pt;height:65.25pt;z-index:251682816;visibility:visible;mso-wrap-style:square;mso-wrap-distance-left:9pt;mso-wrap-distance-top:0;mso-wrap-distance-right:9pt;mso-wrap-distance-bottom:0;mso-position-horizontal:absolute;mso-position-horizontal-relative:text;mso-position-vertical:absolute;mso-position-vertical-relative:text;v-text-anchor:top" o:gfxdata="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" filled="f" stroked="f" strokeweight=".5pt">
                 <v:textbox>
                   <w:txbxContent>
                     <w:tbl>
@@ -1978,18 +1975,22 @@
     </w:p>
     <w:p>
       <w:pPr>
-        <w:rPr>
-          <w:rFonts w:cstheme="minorHAnsi"/>
-        </w:rPr>
-      </w:pPr>
-    </w:p>
-    <w:p>
-      <w:pPr>
         <w:spacing w:after="0" w:line="240" w:lineRule="auto"/>
         <w:rPr>
           <w:rFonts w:cstheme="minorHAnsi"/>
+        </w:rPr>
+      </w:pPr>
+    </w:p>
+    <w:p>
+      <w:pPr>
+        <w:spacing w:after="0" w:line="240" w:lineRule="auto"/>
+        <w:rPr>
+          <w:rFonts w:asciiTheme="minorBidi" w:hAnsiTheme="minorBidi"/>
           <w:b/>
           <w:bCs/>
+          <w:color w:val="2F5496" w:themeColor="accent1" w:themeShade="BF"/>
+          <w:sz w:val="28"/>
+          <w:szCs w:val="28"/>
         </w:rPr>
       </w:pPr>
       <w:r>
@@ -2491,19 +2492,6 @@
           </mc:Fallback>
         </mc:AlternateContent>
       </w:r>
-    </w:p>
-    <w:p>
-      <w:pPr>
-        <w:spacing w:after="0" w:line="240" w:lineRule="auto"/>
-        <w:rPr>
-          <w:rFonts w:asciiTheme="minorBidi" w:hAnsiTheme="minorBidi"/>
-          <w:b/>
-          <w:bCs/>
-          <w:color w:val="2F5496" w:themeColor="accent1" w:themeShade="BF"/>
-          <w:sz w:val="28"/>
-          <w:szCs w:val="28"/>
-        </w:rPr>
-      </w:pPr>
     </w:p>
     <w:p>
       <w:pPr>
@@ -3726,7 +3714,6 @@
   <w:style w:type="character" w:default="1" w:styleId="a0">
     <w:name w:val="Default Paragraph Font"/>
     <w:uiPriority w:val="1"/>
-    <w:semiHidden/>
     <w:unhideWhenUsed/>
   </w:style>
   <w:style w:type="table" w:default="1" w:styleId="a1">

</xml_diff>

<commit_message>
more changes on focusflow.. points
</commit_message>
<xml_diff>
--- a/CV-RenanBazinin.docx
+++ b/CV-RenanBazinin.docx
@@ -519,44 +519,41 @@
     <w:p>
       <w:pPr>
         <w:pStyle w:val="a4"/>
-        <w:numPr>
-          <w:ilvl w:val="1"/>
-          <w:numId w:val="1"/>
-        </w:numPr>
         <w:spacing w:after="0" w:line="240" w:lineRule="auto"/>
-        <w:rPr>
-          <w:rFonts w:cstheme="minorHAnsi"/>
-        </w:rPr>
-      </w:pPr>
-      <w:r>
-        <w:rPr>
-          <w:rFonts w:cstheme="minorHAnsi"/>
-        </w:rPr>
-        <w:t xml:space="preserve">On server worked on: Built a Flask REST service, used Gemini </w:t>
-      </w:r>
-      <w:r>
-        <w:rPr>
-          <w:rFonts w:cstheme="minorHAnsi"/>
-        </w:rPr>
-        <w:t xml:space="preserve">API </w:t>
-      </w:r>
-      <w:r>
-        <w:rPr>
-          <w:rFonts w:cstheme="minorHAnsi"/>
-        </w:rPr>
-        <w:t>to create quizzes/summaries, and Docker</w:t>
-      </w:r>
-      <w:r>
-        <w:rPr>
-          <w:rFonts w:cstheme="minorHAnsi"/>
-        </w:rPr>
-        <w:t xml:space="preserve"> </w:t>
-      </w:r>
-      <w:r>
-        <w:rPr>
-          <w:rFonts w:cstheme="minorHAnsi"/>
-        </w:rPr>
-        <w:t>packaged for GCP production.</w:t>
+        <w:ind w:left="1440"/>
+        <w:rPr>
+          <w:rFonts w:cstheme="minorHAnsi"/>
+        </w:rPr>
+      </w:pPr>
+      <w:r>
+        <w:rPr>
+          <w:rFonts w:cstheme="minorHAnsi"/>
+        </w:rPr>
+        <w:t xml:space="preserve">Used </w:t>
+      </w:r>
+      <w:r>
+        <w:rPr>
+          <w:rFonts w:cstheme="minorHAnsi"/>
+        </w:rPr>
+        <w:t>ONNX Runtime Web</w:t>
+      </w:r>
+      <w:r>
+        <w:rPr>
+          <w:rFonts w:cstheme="minorHAnsi"/>
+        </w:rPr>
+        <w:t xml:space="preserve"> for predict </w:t>
+      </w:r>
+      <w:r>
+        <w:rPr>
+          <w:rFonts w:cstheme="minorHAnsi"/>
+        </w:rPr>
+        <w:t>engagement</w:t>
+      </w:r>
+      <w:r>
+        <w:rPr>
+          <w:rFonts w:cstheme="minorHAnsi"/>
+        </w:rPr>
+        <w:t xml:space="preserve"> on device.</w:t>
       </w:r>
     </w:p>
     <w:p>
@@ -575,6 +572,61 @@
         <w:rPr>
           <w:rFonts w:cstheme="minorHAnsi"/>
         </w:rPr>
+        <w:t>On server worked on: Flask REST</w:t>
+      </w:r>
+      <w:r>
+        <w:rPr>
+          <w:rFonts w:cstheme="minorHAnsi"/>
+        </w:rPr>
+        <w:t xml:space="preserve"> API</w:t>
+      </w:r>
+      <w:r>
+        <w:rPr>
+          <w:rFonts w:cstheme="minorHAnsi"/>
+        </w:rPr>
+        <w:t xml:space="preserve"> service, used Gemini </w:t>
+      </w:r>
+      <w:r>
+        <w:rPr>
+          <w:rFonts w:cstheme="minorHAnsi"/>
+        </w:rPr>
+        <w:t xml:space="preserve">API </w:t>
+      </w:r>
+      <w:r>
+        <w:rPr>
+          <w:rFonts w:cstheme="minorHAnsi"/>
+        </w:rPr>
+        <w:t>to create quizzes/summaries, and Docker</w:t>
+      </w:r>
+      <w:r>
+        <w:rPr>
+          <w:rFonts w:cstheme="minorHAnsi"/>
+        </w:rPr>
+        <w:t xml:space="preserve"> </w:t>
+      </w:r>
+      <w:r>
+        <w:rPr>
+          <w:rFonts w:cstheme="minorHAnsi"/>
+        </w:rPr>
+        <w:t>packaged for GCP production.</w:t>
+      </w:r>
+    </w:p>
+    <w:p>
+      <w:pPr>
+        <w:pStyle w:val="a4"/>
+        <w:numPr>
+          <w:ilvl w:val="1"/>
+          <w:numId w:val="1"/>
+        </w:numPr>
+        <w:spacing w:after="0" w:line="240" w:lineRule="auto"/>
+        <w:rPr>
+          <w:rFonts w:cstheme="minorHAnsi"/>
+        </w:rPr>
+      </w:pPr>
+      <w:r>
+        <w:rPr>
+          <w:rFonts w:cstheme="minorHAnsi"/>
+        </w:rPr>
         <w:t>Recognition</w:t>
       </w:r>
       <w:r>
@@ -606,6 +658,49 @@
           <w:rFonts w:cstheme="minorHAnsi"/>
         </w:rPr>
         <w:t xml:space="preserve">. </w:t>
+      </w:r>
+    </w:p>
+    <w:p>
+      <w:pPr>
+        <w:pStyle w:val="a4"/>
+        <w:numPr>
+          <w:ilvl w:val="1"/>
+          <w:numId w:val="1"/>
+        </w:numPr>
+        <w:spacing w:after="0" w:line="240" w:lineRule="auto"/>
+        <w:rPr>
+          <w:rFonts w:cstheme="minorHAnsi"/>
+        </w:rPr>
+      </w:pPr>
+      <w:r>
+        <w:rPr>
+          <w:rFonts w:cstheme="minorHAnsi"/>
+        </w:rPr>
+        <w:t>Trained</w:t>
+      </w:r>
+      <w:r>
+        <w:rPr>
+          <w:rFonts w:cstheme="minorHAnsi"/>
+        </w:rPr>
+        <w:t xml:space="preserve"> an engagement </w:t>
+      </w:r>
+      <w:r>
+        <w:rPr>
+          <w:rFonts w:cstheme="minorHAnsi"/>
+        </w:rPr>
+        <w:t>classifier model</w:t>
+      </w:r>
+      <w:r>
+        <w:rPr>
+          <w:rFonts w:cstheme="minorHAnsi"/>
+        </w:rPr>
+        <w:t xml:space="preserve"> on landmark features</w:t>
+      </w:r>
+      <w:r>
+        <w:rPr>
+          <w:rFonts w:cstheme="minorHAnsi"/>
+        </w:rPr>
+        <w:t>.</w:t>
       </w:r>
       <w:r>
         <w:rPr>
@@ -732,15 +827,13 @@
         <w:spacing w:after="0" w:line="240" w:lineRule="auto"/>
         <w:rPr>
           <w:rFonts w:cstheme="minorHAnsi"/>
-          <w:b/>
-          <w:bCs/>
-        </w:rPr>
-      </w:pPr>
-      <w:r>
-        <w:rPr>
-          <w:rFonts w:cstheme="minorHAnsi"/>
-        </w:rPr>
-        <w:t>Showcases API integration.</w:t>
+        </w:rPr>
+      </w:pPr>
+      <w:r>
+        <w:rPr>
+          <w:rFonts w:cstheme="minorHAnsi"/>
+        </w:rPr>
+        <w:t>Server: Node.js (Express) REST AP</w:t>
       </w:r>
     </w:p>
     <w:p>
@@ -753,21 +846,11 @@
         <w:spacing w:after="0" w:line="240" w:lineRule="auto"/>
         <w:rPr>
           <w:rFonts w:cstheme="minorHAnsi"/>
-          <w:b/>
-          <w:bCs/>
-        </w:rPr>
-      </w:pPr>
-      <w:r>
-        <w:t>Responsive and shipped on Google Play.</w:t>
-      </w:r>
-    </w:p>
-    <w:p>
-      <w:pPr>
-        <w:spacing w:after="0" w:line="240" w:lineRule="auto"/>
-        <w:rPr>
-          <w:rFonts w:cstheme="minorHAnsi"/>
-        </w:rPr>
-      </w:pPr>
+        </w:rPr>
+      </w:pPr>
+      <w:r>
+        <w:t>Mobile: Android app published on Google Play.</w:t>
+      </w:r>
     </w:p>
     <w:p>
       <w:pPr>

</xml_diff>

<commit_message>
forgot i and API
</commit_message>
<xml_diff>
--- a/CV-RenanBazinin.docx
+++ b/CV-RenanBazinin.docx
@@ -391,21 +391,12 @@
           <w:numId w:val="1"/>
         </w:numPr>
       </w:pPr>
-      <w:proofErr w:type="spellStart"/>
       <w:r>
         <w:rPr>
           <w:b/>
           <w:bCs/>
         </w:rPr>
-        <w:t>FocusFlow</w:t>
-      </w:r>
-      <w:proofErr w:type="spellEnd"/>
-      <w:r>
-        <w:rPr>
-          <w:b/>
-          <w:bCs/>
-        </w:rPr>
-        <w:t xml:space="preserve"> </w:t>
+        <w:t xml:space="preserve">FocusFlow </w:t>
       </w:r>
       <w:r>
         <w:rPr>
@@ -512,15 +503,7 @@
         <w:t>, Redux and</w:t>
       </w:r>
       <w:r>
-        <w:t xml:space="preserve"> </w:t>
-      </w:r>
-      <w:proofErr w:type="spellStart"/>
-      <w:r>
-        <w:t>MediaPipe</w:t>
-      </w:r>
-      <w:proofErr w:type="spellEnd"/>
-      <w:r>
-        <w:t xml:space="preserve"> to extract landmarks in real time</w:t>
+        <w:t xml:space="preserve"> MediaPipe to extract landmarks in real time</w:t>
       </w:r>
       <w:r>
         <w:t>.</w:t>
@@ -904,6 +887,12 @@
           <w:rFonts w:cstheme="minorHAnsi"/>
         </w:rPr>
         <w:t>Server: Node.js (Express) REST AP</w:t>
+      </w:r>
+      <w:r>
+        <w:rPr>
+          <w:rFonts w:cstheme="minorHAnsi"/>
+        </w:rPr>
+        <w:t>I</w:t>
       </w:r>
     </w:p>
     <w:p>

</xml_diff>

<commit_message>
Spcaces ,Caps Lock bolding
</commit_message>
<xml_diff>
--- a/CV-RenanBazinin.docx
+++ b/CV-RenanBazinin.docx
@@ -273,7 +273,7 @@
         <w:rPr>
           <w:rFonts w:cstheme="minorHAnsi"/>
         </w:rPr>
-        <w:t xml:space="preserve"> and OSS contributions.  Experienced with React and full-stack JavaScript</w:t>
+        <w:t xml:space="preserve"> and OSS contributions. Experienced with React and full-stack JavaScript</w:t>
       </w:r>
     </w:p>
     <w:bookmarkEnd w:id="0"/>
@@ -391,12 +391,21 @@
           <w:numId w:val="1"/>
         </w:numPr>
       </w:pPr>
-      <w:r>
-        <w:rPr>
-          <w:b/>
-          <w:bCs/>
-        </w:rPr>
-        <w:t xml:space="preserve">FocusFlow </w:t>
+      <w:proofErr w:type="spellStart"/>
+      <w:r>
+        <w:rPr>
+          <w:b/>
+          <w:bCs/>
+        </w:rPr>
+        <w:t>FocusFlow</w:t>
+      </w:r>
+      <w:proofErr w:type="spellEnd"/>
+      <w:r>
+        <w:rPr>
+          <w:b/>
+          <w:bCs/>
+        </w:rPr>
+        <w:t xml:space="preserve"> </w:t>
       </w:r>
       <w:r>
         <w:rPr>
@@ -503,7 +512,15 @@
         <w:t>, Redux and</w:t>
       </w:r>
       <w:r>
-        <w:t xml:space="preserve"> MediaPipe to extract landmarks in real time</w:t>
+        <w:t xml:space="preserve"> </w:t>
+      </w:r>
+      <w:proofErr w:type="spellStart"/>
+      <w:r>
+        <w:t>MediaPipe</w:t>
+      </w:r>
+      <w:proofErr w:type="spellEnd"/>
+      <w:r>
+        <w:t xml:space="preserve"> to extract landmarks in real time</w:t>
       </w:r>
       <w:r>
         <w:t>.</w:t>
@@ -684,11 +701,19 @@
           <w:rFonts w:cstheme="minorHAnsi"/>
         </w:rPr>
       </w:pPr>
-      <w:r>
-        <w:rPr>
-          <w:rFonts w:cstheme="minorHAnsi"/>
-        </w:rPr>
-        <w:t xml:space="preserve">Trained </w:t>
+      <w:proofErr w:type="gramStart"/>
+      <w:r>
+        <w:rPr>
+          <w:rFonts w:cstheme="minorHAnsi"/>
+        </w:rPr>
+        <w:t>Trained</w:t>
+      </w:r>
+      <w:proofErr w:type="gramEnd"/>
+      <w:r>
+        <w:rPr>
+          <w:rFonts w:cstheme="minorHAnsi"/>
+        </w:rPr>
+        <w:t xml:space="preserve"> </w:t>
       </w:r>
       <w:r>
         <w:rPr>
@@ -736,26 +761,30 @@
       <w:r>
         <w:rPr>
           <w:rFonts w:cstheme="minorHAnsi"/>
-        </w:rPr>
-        <w:t xml:space="preserve">: </w:t>
-      </w:r>
-      <w:r>
-        <w:rPr>
-          <w:rFonts w:cstheme="minorHAnsi"/>
-        </w:rPr>
-        <w:t xml:space="preserve">AIED 2025 </w:t>
-      </w:r>
-      <w:r>
-        <w:rPr>
-          <w:rFonts w:cstheme="minorHAnsi"/>
-        </w:rPr>
-        <w:t xml:space="preserve">published </w:t>
-      </w:r>
-      <w:r>
-        <w:rPr>
-          <w:rFonts w:cstheme="minorHAnsi"/>
-        </w:rPr>
-        <w:t>paper + demo</w:t>
+          <w:b/>
+          <w:bCs/>
+        </w:rPr>
+        <w:t>: AIED 2025</w:t>
+      </w:r>
+      <w:r>
+        <w:rPr>
+          <w:rFonts w:cstheme="minorHAnsi"/>
+        </w:rPr>
+        <w:t xml:space="preserve"> </w:t>
+      </w:r>
+      <w:r>
+        <w:rPr>
+          <w:rFonts w:cstheme="minorHAnsi"/>
+          <w:b/>
+          <w:bCs/>
+        </w:rPr>
+        <w:t>published paper</w:t>
+      </w:r>
+      <w:r>
+        <w:rPr>
+          <w:rFonts w:cstheme="minorHAnsi"/>
+        </w:rPr>
+        <w:t xml:space="preserve"> + demo</w:t>
       </w:r>
       <w:r>
         <w:rPr>
@@ -1133,7 +1162,10 @@
                                     <w:spacing w:line="276" w:lineRule="auto"/>
                                   </w:pPr>
                                   <w:r>
-                                    <w:t>JAVA</w:t>
+                                    <w:t>J</w:t>
+                                  </w:r>
+                                  <w:r>
+                                    <w:t>ava</w:t>
                                   </w:r>
                                 </w:p>
                               </w:tc>
@@ -1278,11 +1310,7 @@
           </mc:Choice>
           <mc:Fallback>
             <w:pict>
-              <v:shapetype w14:anchorId="42CD17ED" id="_x0000_t202" coordsize="21600,21600" o:spt="202" path="m,l,21600r21600,l21600,xe">
-                <v:stroke joinstyle="miter"/>
-                <v:path gradientshapeok="t" o:connecttype="rect"/>
-              </v:shapetype>
-              <v:shape id="_x0000_s1027" type="#_x0000_t202" style="position:absolute;margin-left:-13.5pt;margin-top:12.2pt;width:429.75pt;height:65.25pt;z-index:251682816;visibility:visible;mso-wrap-style:square;mso-wrap-distance-left:9pt;mso-wrap-distance-top:0;mso-wrap-distance-right:9pt;mso-wrap-distance-bottom:0;mso-position-horizontal:absolute;mso-position-horizontal-relative:text;mso-position-vertical:absolute;mso-position-vertical-relative:text;v-text-anchor:top" o:gfxdata="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" filled="f" stroked="f" strokeweight=".5pt">
+              <v:shape w14:anchorId="42CD17ED" id="_x0000_s1027" type="#_x0000_t202" style="position:absolute;margin-left:-13.5pt;margin-top:12.2pt;width:429.75pt;height:65.25pt;z-index:251682816;visibility:visible;mso-wrap-style:square;mso-wrap-distance-left:9pt;mso-wrap-distance-top:0;mso-wrap-distance-right:9pt;mso-wrap-distance-bottom:0;mso-position-horizontal:absolute;mso-position-horizontal-relative:text;mso-position-vertical:absolute;mso-position-vertical-relative:text;v-text-anchor:top" o:gfxdata="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" filled="f" stroked="f" strokeweight=".5pt">
                 <v:textbox>
                   <w:txbxContent>
                     <w:tbl>
@@ -1370,7 +1398,10 @@
                               <w:spacing w:line="276" w:lineRule="auto"/>
                             </w:pPr>
                             <w:r>
-                              <w:t>JAVA</w:t>
+                              <w:t>J</w:t>
+                            </w:r>
+                            <w:r>
+                              <w:t>ava</w:t>
                             </w:r>
                           </w:p>
                         </w:tc>

</xml_diff>

<commit_message>
friend b help with about me
</commit_message>
<xml_diff>
--- a/CV-RenanBazinin.docx
+++ b/CV-RenanBazinin.docx
@@ -68,7 +68,19 @@
                               <w:rPr>
                                 <w:sz w:val="24"/>
                               </w:rPr>
-                              <w:t xml:space="preserve">054-xxxxxxx | renanbazinin2@gmail.com  | </w:t>
+                              <w:t>054-</w:t>
+                            </w:r>
+                            <w:r>
+                              <w:rPr>
+                                <w:sz w:val="24"/>
+                              </w:rPr>
+                              <w:t>xxxxxxx</w:t>
+                            </w:r>
+                            <w:r>
+                              <w:rPr>
+                                <w:sz w:val="24"/>
+                              </w:rPr>
+                              <w:t xml:space="preserve"> | renanbazinin2@gmail.com  | </w:t>
                             </w:r>
                             <w:hyperlink r:id="rId6" w:history="1">
                               <w:r>
@@ -150,7 +162,19 @@
                         <w:rPr>
                           <w:sz w:val="24"/>
                         </w:rPr>
-                        <w:t xml:space="preserve">054-xxxxxxx | renanbazinin2@gmail.com  | </w:t>
+                        <w:t>054-</w:t>
+                      </w:r>
+                      <w:r>
+                        <w:rPr>
+                          <w:sz w:val="24"/>
+                        </w:rPr>
+                        <w:t>xxxxxxx</w:t>
+                      </w:r>
+                      <w:r>
+                        <w:rPr>
+                          <w:sz w:val="24"/>
+                        </w:rPr>
+                        <w:t xml:space="preserve"> | renanbazinin2@gmail.com  | </w:t>
                       </w:r>
                       <w:hyperlink r:id="rId9" w:history="1">
                         <w:r>
@@ -255,28 +279,99 @@
           <w:szCs w:val="28"/>
         </w:rPr>
       </w:pPr>
-      <w:bookmarkStart w:id="0" w:name="_Hlk211520902"/>
-      <w:r>
-        <w:rPr>
-          <w:rFonts w:cstheme="minorHAnsi"/>
-        </w:rPr>
-        <w:t xml:space="preserve">Aspiring software engineer with over </w:t>
-      </w:r>
-      <w:r>
-        <w:rPr>
-          <w:rFonts w:cstheme="minorHAnsi"/>
-          <w:b/>
-        </w:rPr>
-        <w:t>60 GitHub repositories</w:t>
-      </w:r>
-      <w:r>
-        <w:rPr>
-          <w:rFonts w:cstheme="minorHAnsi"/>
-        </w:rPr>
-        <w:t xml:space="preserve"> and OSS contributions. Experienced with React and full-stack JavaScript</w:t>
+      <w:r>
+        <w:rPr>
+          <w:rFonts w:cstheme="minorHAnsi"/>
+        </w:rPr>
+        <w:t xml:space="preserve">Motivated, award-winning Computer Science student with </w:t>
+      </w:r>
+      <w:r>
+        <w:rPr>
+          <w:rFonts w:cstheme="minorHAnsi"/>
+          <w:b/>
+          <w:bCs/>
+        </w:rPr>
+        <w:t>60+ GitHub</w:t>
+      </w:r>
+      <w:r>
+        <w:rPr>
+          <w:rFonts w:cstheme="minorHAnsi"/>
+        </w:rPr>
+        <w:t xml:space="preserve"> repositories and </w:t>
+      </w:r>
+      <w:r>
+        <w:rPr>
+          <w:rFonts w:cstheme="minorHAnsi"/>
+          <w:b/>
+          <w:bCs/>
+        </w:rPr>
+        <w:t>OOS</w:t>
+      </w:r>
+      <w:r>
+        <w:rPr>
+          <w:rFonts w:cstheme="minorHAnsi"/>
+        </w:rPr>
+        <w:t xml:space="preserve"> </w:t>
+      </w:r>
+      <w:r>
+        <w:rPr>
+          <w:rFonts w:cstheme="minorHAnsi"/>
+          <w:b/>
+          <w:bCs/>
+        </w:rPr>
+        <w:t>contributions</w:t>
+      </w:r>
+      <w:r>
+        <w:rPr>
+          <w:rFonts w:cstheme="minorHAnsi"/>
+        </w:rPr>
+        <w:t xml:space="preserve">. Proven </w:t>
+      </w:r>
+      <w:r>
+        <w:rPr>
+          <w:rFonts w:cstheme="minorHAnsi"/>
+          <w:b/>
+          <w:bCs/>
+        </w:rPr>
+        <w:t>ability</w:t>
+      </w:r>
+      <w:r>
+        <w:rPr>
+          <w:rFonts w:cstheme="minorHAnsi"/>
+        </w:rPr>
+        <w:t xml:space="preserve"> to deliver </w:t>
+      </w:r>
+      <w:r>
+        <w:rPr>
+          <w:rFonts w:cstheme="minorHAnsi"/>
+          <w:b/>
+          <w:bCs/>
+        </w:rPr>
+        <w:t>production</w:t>
+      </w:r>
+      <w:r>
+        <w:rPr>
+          <w:rFonts w:cstheme="minorHAnsi"/>
+          <w:b/>
+          <w:bCs/>
+        </w:rPr>
+        <w:t xml:space="preserve"> </w:t>
+      </w:r>
+      <w:r>
+        <w:rPr>
+          <w:rFonts w:cstheme="minorHAnsi"/>
+          <w:b/>
+          <w:bCs/>
+        </w:rPr>
+        <w:t>level</w:t>
+      </w:r>
+      <w:r>
+        <w:rPr>
+          <w:rFonts w:cstheme="minorHAnsi"/>
+        </w:rPr>
+        <w:t xml:space="preserve"> applications. Experienced with Python, React, and full-stack Node.js.</w:t>
       </w:r>
     </w:p>
-    <w:bookmarkEnd w:id="0"/>
     <w:p>
       <w:pPr>
         <w:spacing w:after="0" w:line="240" w:lineRule="auto"/>
@@ -937,7 +1032,35 @@
         <w:rPr>
           <w:rFonts w:cstheme="minorHAnsi"/>
         </w:rPr>
-        <w:t>Server: Node.js (Express) REST AP</w:t>
+        <w:t xml:space="preserve">Server: </w:t>
+      </w:r>
+      <w:r>
+        <w:rPr>
+          <w:rFonts w:cstheme="minorHAnsi"/>
+          <w:b/>
+          <w:bCs/>
+        </w:rPr>
+        <w:t>Node.js</w:t>
+      </w:r>
+      <w:r>
+        <w:rPr>
+          <w:rFonts w:cstheme="minorHAnsi"/>
+        </w:rPr>
+        <w:t xml:space="preserve"> (</w:t>
+      </w:r>
+      <w:r>
+        <w:rPr>
+          <w:rFonts w:cstheme="minorHAnsi"/>
+          <w:b/>
+          <w:bCs/>
+        </w:rPr>
+        <w:t>Express</w:t>
+      </w:r>
+      <w:r>
+        <w:rPr>
+          <w:rFonts w:cstheme="minorHAnsi"/>
+        </w:rPr>
+        <w:t>) REST AP</w:t>
       </w:r>
       <w:r>
         <w:rPr>
@@ -969,14 +1092,6 @@
           <w:rFonts w:cstheme="minorHAnsi"/>
         </w:rPr>
       </w:pPr>
-    </w:p>
-    <w:p>
-      <w:pPr>
-        <w:spacing w:after="0" w:line="240" w:lineRule="auto"/>
-        <w:rPr>
-          <w:rFonts w:cstheme="minorHAnsi"/>
-        </w:rPr>
-      </w:pPr>
       <w:r>
         <w:rPr>
           <w:rFonts w:asciiTheme="minorBidi" w:hAnsiTheme="minorBidi"/>
@@ -990,13 +1105,13 @@
         <mc:AlternateContent>
           <mc:Choice Requires="wps">
             <w:drawing>
-              <wp:anchor distT="0" distB="0" distL="114300" distR="114300" simplePos="0" relativeHeight="251672576" behindDoc="0" locked="0" layoutInCell="1" allowOverlap="1" wp14:anchorId="6C75187F" wp14:editId="7365DC22">
+              <wp:anchor distT="0" distB="0" distL="114300" distR="114300" simplePos="0" relativeHeight="251672576" behindDoc="0" locked="0" layoutInCell="1" allowOverlap="1" wp14:anchorId="6C75187F" wp14:editId="7C2839CA">
                 <wp:simplePos x="0" y="0"/>
                 <wp:positionH relativeFrom="column">
-                  <wp:posOffset>0</wp:posOffset>
+                  <wp:posOffset>19050</wp:posOffset>
                 </wp:positionH>
                 <wp:positionV relativeFrom="paragraph">
-                  <wp:posOffset>27940</wp:posOffset>
+                  <wp:posOffset>46355</wp:posOffset>
                 </wp:positionV>
                 <wp:extent cx="5730240" cy="15240"/>
                 <wp:effectExtent l="0" t="0" r="22860" b="22860"/>
@@ -1039,7 +1154,7 @@
           </mc:Choice>
           <mc:Fallback>
             <w:pict>
-              <v:line w14:anchorId="34D3DFF0" id="Straight Connector 8" o:spid="_x0000_s1026" style="position:absolute;left:0;text-align:left;flip:y;z-index:251672576;visibility:visible;mso-wrap-style:square;mso-wrap-distance-left:9pt;mso-wrap-distance-top:0;mso-wrap-distance-right:9pt;mso-wrap-distance-bottom:0;mso-position-horizontal:absolute;mso-position-horizontal-relative:text;mso-position-vertical:absolute;mso-position-vertical-relative:text" from="0,2.2pt" to="451.2pt,3.4pt" o:gfxdata="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" strokecolor="#4472c4 [3204]" strokeweight=".5pt">
+              <v:line w14:anchorId="13527D11" id="Straight Connector 8" o:spid="_x0000_s1026" style="position:absolute;left:0;text-align:left;flip:y;z-index:251672576;visibility:visible;mso-wrap-style:square;mso-wrap-distance-left:9pt;mso-wrap-distance-top:0;mso-wrap-distance-right:9pt;mso-wrap-distance-bottom:0;mso-position-horizontal:absolute;mso-position-horizontal-relative:text;mso-position-vertical:absolute;mso-position-vertical-relative:text" from="1.5pt,3.65pt" to="452.7pt,4.85pt" o:gfxdata="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" strokecolor="#4472c4 [3204]" strokeweight=".5pt">
                 <v:stroke joinstyle="miter"/>
               </v:line>
             </w:pict>
@@ -1067,13 +1182,13 @@
         <mc:AlternateContent>
           <mc:Choice Requires="wps">
             <w:drawing>
-              <wp:anchor distT="0" distB="0" distL="114300" distR="114300" simplePos="0" relativeHeight="251682816" behindDoc="0" locked="0" layoutInCell="1" allowOverlap="1" wp14:anchorId="42CD17ED" wp14:editId="51DDC9B0">
+              <wp:anchor distT="0" distB="0" distL="114300" distR="114300" simplePos="0" relativeHeight="251682816" behindDoc="0" locked="0" layoutInCell="1" allowOverlap="1" wp14:anchorId="42CD17ED" wp14:editId="2CEBA4B5">
                 <wp:simplePos x="0" y="0"/>
                 <wp:positionH relativeFrom="column">
                   <wp:posOffset>-171450</wp:posOffset>
                 </wp:positionH>
                 <wp:positionV relativeFrom="paragraph">
-                  <wp:posOffset>154940</wp:posOffset>
+                  <wp:posOffset>145415</wp:posOffset>
                 </wp:positionV>
                 <wp:extent cx="5457825" cy="828675"/>
                 <wp:effectExtent l="0" t="0" r="0" b="0"/>
@@ -1332,11 +1447,7 @@
           </mc:Choice>
           <mc:Fallback>
             <w:pict>
-              <v:shapetype w14:anchorId="42CD17ED" id="_x0000_t202" coordsize="21600,21600" o:spt="202" path="m,l,21600r21600,l21600,xe">
-                <v:stroke joinstyle="miter"/>
-                <v:path gradientshapeok="t" o:connecttype="rect"/>
-              </v:shapetype>
-              <v:shape id="_x0000_s1027" type="#_x0000_t202" style="position:absolute;margin-left:-13.5pt;margin-top:12.2pt;width:429.75pt;height:65.25pt;z-index:251682816;visibility:visible;mso-wrap-style:square;mso-wrap-distance-left:9pt;mso-wrap-distance-top:0;mso-wrap-distance-right:9pt;mso-wrap-distance-bottom:0;mso-position-horizontal:absolute;mso-position-horizontal-relative:text;mso-position-vertical:absolute;mso-position-vertical-relative:text;v-text-anchor:top" o:gfxdata="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" filled="f" stroked="f" strokeweight=".5pt">
+              <v:shape w14:anchorId="42CD17ED" id="_x0000_s1027" type="#_x0000_t202" style="position:absolute;margin-left:-13.5pt;margin-top:11.45pt;width:429.75pt;height:65.25pt;z-index:251682816;visibility:visible;mso-wrap-style:square;mso-wrap-distance-left:9pt;mso-wrap-distance-top:0;mso-wrap-distance-right:9pt;mso-wrap-distance-bottom:0;mso-position-horizontal:absolute;mso-position-horizontal-relative:text;mso-position-vertical:absolute;mso-position-vertical-relative:text;v-text-anchor:top" o:gfxdata="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" filled="f" stroked="f" strokeweight=".5pt">
                 <v:textbox>
                   <w:txbxContent>
                     <w:tbl>
@@ -1681,14 +1792,6 @@
       <w:pPr>
         <w:spacing w:after="0" w:line="240" w:lineRule="auto"/>
         <w:rPr>
-          <w:rFonts w:cstheme="minorHAnsi"/>
-        </w:rPr>
-      </w:pPr>
-    </w:p>
-    <w:p>
-      <w:pPr>
-        <w:spacing w:after="0" w:line="240" w:lineRule="auto"/>
-        <w:rPr>
           <w:rFonts w:asciiTheme="minorBidi" w:hAnsiTheme="minorBidi"/>
           <w:b/>
           <w:bCs/>
@@ -2301,7 +2404,7 @@
         <mc:AlternateContent>
           <mc:Choice Requires="wps">
             <w:drawing>
-              <wp:anchor distT="0" distB="0" distL="114300" distR="114300" simplePos="0" relativeHeight="251686912" behindDoc="0" locked="0" layoutInCell="1" allowOverlap="1" wp14:anchorId="2B3186F1" wp14:editId="47321598">
+              <wp:anchor distT="0" distB="0" distL="114300" distR="114300" simplePos="0" relativeHeight="251686912" behindDoc="0" locked="0" layoutInCell="1" allowOverlap="1" wp14:anchorId="2B3186F1" wp14:editId="6D2C8892">
                 <wp:simplePos x="0" y="0"/>
                 <wp:positionH relativeFrom="column">
                   <wp:posOffset>133350</wp:posOffset>
@@ -2335,6 +2438,44 @@
                         <w:txbxContent>
                           <w:p>
                             <w:pPr>
+                              <w:spacing w:after="0" w:line="276" w:lineRule="auto"/>
+                              <w:rPr>
+                                <w:b/>
+                              </w:rPr>
+                            </w:pPr>
+                            <w:r>
+                              <w:rPr>
+                                <w:bCs/>
+                              </w:rPr>
+                              <w:t>20</w:t>
+                            </w:r>
+                            <w:r>
+                              <w:rPr>
+                                <w:bCs/>
+                              </w:rPr>
+                              <w:t>17</w:t>
+                            </w:r>
+                            <w:r>
+                              <w:rPr>
+                                <w:bCs/>
+                              </w:rPr>
+                              <w:t>– 20</w:t>
+                            </w:r>
+                            <w:r>
+                              <w:rPr>
+                                <w:bCs/>
+                              </w:rPr>
+                              <w:t>19</w:t>
+                            </w:r>
+                            <w:r>
+                              <w:rPr>
+                                <w:b/>
+                              </w:rPr>
+                              <w:t>:</w:t>
+                            </w:r>
+                          </w:p>
+                          <w:p>
+                            <w:pPr>
                               <w:pStyle w:val="a4"/>
                               <w:numPr>
                                 <w:ilvl w:val="0"/>
@@ -2519,6 +2660,44 @@
               <v:shape w14:anchorId="2B3186F1" id="_x0000_s1029" type="#_x0000_t202" style="position:absolute;margin-left:10.5pt;margin-top:5.15pt;width:410.25pt;height:89.25pt;z-index:251686912;visibility:visible;mso-wrap-style:square;mso-width-percent:0;mso-height-percent:0;mso-wrap-distance-left:9pt;mso-wrap-distance-top:0;mso-wrap-distance-right:9pt;mso-wrap-distance-bottom:0;mso-position-horizontal:absolute;mso-position-horizontal-relative:text;mso-position-vertical:absolute;mso-position-vertical-relative:text;mso-width-percent:0;mso-height-percent:0;mso-width-relative:margin;mso-height-relative:margin;v-text-anchor:top" o:gfxdata="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" filled="f" stroked="f" strokeweight=".5pt">
                 <v:textbox>
                   <w:txbxContent>
+                    <w:p>
+                      <w:pPr>
+                        <w:spacing w:after="0" w:line="276" w:lineRule="auto"/>
+                        <w:rPr>
+                          <w:b/>
+                        </w:rPr>
+                      </w:pPr>
+                      <w:r>
+                        <w:rPr>
+                          <w:bCs/>
+                        </w:rPr>
+                        <w:t>20</w:t>
+                      </w:r>
+                      <w:r>
+                        <w:rPr>
+                          <w:bCs/>
+                        </w:rPr>
+                        <w:t>17</w:t>
+                      </w:r>
+                      <w:r>
+                        <w:rPr>
+                          <w:bCs/>
+                        </w:rPr>
+                        <w:t>– 20</w:t>
+                      </w:r>
+                      <w:r>
+                        <w:rPr>
+                          <w:bCs/>
+                        </w:rPr>
+                        <w:t>19</w:t>
+                      </w:r>
+                      <w:r>
+                        <w:rPr>
+                          <w:b/>
+                        </w:rPr>
+                        <w:t>:</w:t>
+                      </w:r>
+                    </w:p>
                     <w:p>
                       <w:pPr>
                         <w:pStyle w:val="a4"/>
@@ -3905,11 +4084,11 @@
   <w:style w:type="paragraph" w:default="1" w:styleId="a">
     <w:name w:val="Normal"/>
     <w:qFormat/>
+    <w:rsid w:val="006A6F22"/>
   </w:style>
   <w:style w:type="character" w:default="1" w:styleId="a0">
     <w:name w:val="Default Paragraph Font"/>
     <w:uiPriority w:val="1"/>
-    <w:semiHidden/>
     <w:unhideWhenUsed/>
   </w:style>
   <w:style w:type="table" w:default="1" w:styleId="a1">

</xml_diff>

<commit_message>
add lines for saying Looking for software developer roles
</commit_message>
<xml_diff>
--- a/CV-RenanBazinin.docx
+++ b/CV-RenanBazinin.docx
@@ -385,7 +385,52 @@
         <w:rPr>
           <w:rFonts w:cstheme="minorHAnsi"/>
         </w:rPr>
-        <w:t xml:space="preserve"> applications. Experienced with Python, React, and full-stack Node.js.</w:t>
+        <w:t xml:space="preserve"> applications. Experienced with Python, </w:t>
+      </w:r>
+      <w:r>
+        <w:rPr>
+          <w:rFonts w:cstheme="minorHAnsi"/>
+          <w:b/>
+          <w:bCs/>
+        </w:rPr>
+        <w:t>React</w:t>
+      </w:r>
+      <w:r>
+        <w:rPr>
+          <w:rFonts w:cstheme="minorHAnsi"/>
+        </w:rPr>
+        <w:t xml:space="preserve">, and </w:t>
+      </w:r>
+      <w:r>
+        <w:rPr>
+          <w:rFonts w:cstheme="minorHAnsi"/>
+          <w:b/>
+          <w:bCs/>
+        </w:rPr>
+        <w:t>full-stack Node.js</w:t>
+      </w:r>
+      <w:r>
+        <w:rPr>
+          <w:rFonts w:cstheme="minorHAnsi"/>
+        </w:rPr>
+        <w:t xml:space="preserve">. </w:t>
+      </w:r>
+      <w:r>
+        <w:rPr>
+          <w:rFonts w:cstheme="minorHAnsi"/>
+        </w:rPr>
+        <w:t>Looking for software developer roles</w:t>
+      </w:r>
+      <w:r>
+        <w:rPr>
+          <w:rFonts w:asciiTheme="minorBidi" w:hAnsiTheme="minorBidi"/>
+          <w:b/>
+          <w:bCs/>
+          <w:color w:val="2F5496" w:themeColor="accent1" w:themeShade="BF"/>
+          <w:sz w:val="28"/>
+          <w:szCs w:val="28"/>
+        </w:rPr>
+        <w:t xml:space="preserve"> </w:t>
       </w:r>
     </w:p>
     <w:p>
@@ -502,12 +547,21 @@
           <w:numId w:val="1"/>
         </w:numPr>
       </w:pPr>
-      <w:r>
-        <w:rPr>
-          <w:b/>
-          <w:bCs/>
-        </w:rPr>
-        <w:t xml:space="preserve">FocusFlow </w:t>
+      <w:proofErr w:type="spellStart"/>
+      <w:r>
+        <w:rPr>
+          <w:b/>
+          <w:bCs/>
+        </w:rPr>
+        <w:t>FocusFlow</w:t>
+      </w:r>
+      <w:proofErr w:type="spellEnd"/>
+      <w:r>
+        <w:rPr>
+          <w:b/>
+          <w:bCs/>
+        </w:rPr>
+        <w:t xml:space="preserve"> </w:t>
       </w:r>
       <w:r>
         <w:rPr>
@@ -614,7 +668,15 @@
         <w:t>, Redux and</w:t>
       </w:r>
       <w:r>
-        <w:t xml:space="preserve"> MediaPipe to extract landmarks in real time</w:t>
+        <w:t xml:space="preserve"> </w:t>
+      </w:r>
+      <w:proofErr w:type="spellStart"/>
+      <w:r>
+        <w:t>MediaPipe</w:t>
+      </w:r>
+      <w:proofErr w:type="spellEnd"/>
+      <w:r>
+        <w:t xml:space="preserve"> to extract landmarks in real time</w:t>
       </w:r>
       <w:r>
         <w:t>.</w:t>

</xml_diff>

<commit_message>
working exp 1 page
</commit_message>
<xml_diff>
--- a/CV-RenanBazinin.docx
+++ b/CV-RenanBazinin.docx
@@ -324,15 +324,20 @@
           </mc:Choice>
           <mc:Fallback>
             <w:pict>
-              <v:line w14:anchorId="27284451" id="Straight Connector 2" o:spid="_x0000_s1026" style="position:absolute;left:0;text-align:left;flip:y;z-index:251659264;visibility:visible;mso-wrap-style:square;mso-wrap-distance-left:9pt;mso-wrap-distance-top:0;mso-wrap-distance-right:9pt;mso-wrap-distance-bottom:0;mso-position-horizontal:absolute;mso-position-horizontal-relative:text;mso-position-vertical:absolute;mso-position-vertical-relative:text" from=".6pt,46.35pt" to="451.8pt,47.55pt" o:gfxdata="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" strokecolor="#4472c4 [3204]" strokeweight=".5pt">
+              <v:line w14:anchorId="5C9F031B" id="Straight Connector 2" o:spid="_x0000_s1026" style="position:absolute;left:0;text-align:left;flip:y;z-index:251659264;visibility:visible;mso-wrap-style:square;mso-wrap-distance-left:9pt;mso-wrap-distance-top:0;mso-wrap-distance-right:9pt;mso-wrap-distance-bottom:0;mso-position-horizontal:absolute;mso-position-horizontal-relative:text;mso-position-vertical:absolute;mso-position-vertical-relative:text" from=".6pt,46.35pt" to="451.8pt,47.55pt" o:gfxdata="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" strokecolor="#4472c4 [3204]" strokeweight=".5pt">
                 <v:stroke joinstyle="miter"/>
               </v:line>
             </w:pict>
           </mc:Fallback>
         </mc:AlternateContent>
       </w:r>
-      <w:r>
-        <w:t xml:space="preserve">Motivated, award-winning Computer Science student with 60+ GitHub repositories and </w:t>
+      <w:proofErr w:type="gramStart"/>
+      <w:r>
+        <w:t>Motivated</w:t>
+      </w:r>
+      <w:proofErr w:type="gramEnd"/>
+      <w:r>
+        <w:t xml:space="preserve">, award-winning Computer Science student with 60+ GitHub repositories and </w:t>
       </w:r>
       <w:r>
         <w:rPr>
@@ -678,12 +683,21 @@
         <w:pStyle w:val="a4"/>
         <w:ind w:left="-360" w:firstLine="720"/>
       </w:pPr>
-      <w:r>
-        <w:rPr>
-          <w:b/>
-          <w:bCs/>
-        </w:rPr>
-        <w:t xml:space="preserve">FocusFlow  </w:t>
+      <w:proofErr w:type="spellStart"/>
+      <w:r>
+        <w:rPr>
+          <w:b/>
+          <w:bCs/>
+        </w:rPr>
+        <w:t>FocusFlow</w:t>
+      </w:r>
+      <w:proofErr w:type="spellEnd"/>
+      <w:r>
+        <w:rPr>
+          <w:b/>
+          <w:bCs/>
+        </w:rPr>
+        <w:t xml:space="preserve">  </w:t>
       </w:r>
       <w:r>
         <w:rPr>
@@ -790,6 +804,7 @@
       <w:r>
         <w:t xml:space="preserve">: </w:t>
       </w:r>
+      <w:proofErr w:type="spellStart"/>
       <w:r>
         <w:rPr>
           <w:b/>
@@ -797,6 +812,7 @@
         </w:rPr>
         <w:t>MediaPipe</w:t>
       </w:r>
+      <w:proofErr w:type="spellEnd"/>
       <w:r>
         <w:t xml:space="preserve"> for real-time landmark extraction and </w:t>
       </w:r>
@@ -856,54 +872,79 @@
         </w:rPr>
       </w:pPr>
       <w:hyperlink r:id="rId18" w:history="1">
+        <w:proofErr w:type="spellStart"/>
         <w:r>
           <w:rPr>
             <w:rStyle w:val="Hyperlink"/>
             <w:b/>
             <w:bCs/>
           </w:rPr>
-          <w:t>FocusFlow: A Real-Time Engagement System Enabled by Client-Side Inference</w:t>
+          <w:t>FocusFlow</w:t>
         </w:r>
-      </w:hyperlink>
-      <w:r>
-        <w:rPr>
-          <w:b/>
-          <w:bCs/>
-        </w:rPr>
-        <w:t xml:space="preserve">, </w:t>
-      </w:r>
-      <w:r>
-        <w:t xml:space="preserve">Systor 2025, </w:t>
-      </w:r>
-      <w:r>
-        <w:rPr>
-          <w:b/>
-          <w:bCs/>
-          <w:color w:val="000000" w:themeColor="text1"/>
-        </w:rPr>
-        <w:t>Best Poster Awar</w:t>
-      </w:r>
-      <w:r>
-        <w:rPr>
-          <w:b/>
-          <w:bCs/>
-          <w:color w:val="000000" w:themeColor="text1"/>
-        </w:rPr>
-        <w:t>d.</w:t>
-      </w:r>
-    </w:p>
-    <w:p>
-      <w:pPr>
-        <w:pStyle w:val="a4"/>
-      </w:pPr>
-      <w:hyperlink r:id="rId19" w:history="1">
+        <w:proofErr w:type="spellEnd"/>
         <w:r>
           <w:rPr>
             <w:rStyle w:val="Hyperlink"/>
             <w:b/>
             <w:bCs/>
           </w:rPr>
-          <w:t>FocusFlow: AI-Driven Engagement Monitoring and Interaction for Educational Videos</w:t>
+          <w:t>: A Real-Time Engagement System Enabled by Client-Side Inference</w:t>
+        </w:r>
+      </w:hyperlink>
+      <w:r>
+        <w:rPr>
+          <w:b/>
+          <w:bCs/>
+        </w:rPr>
+        <w:t xml:space="preserve">, </w:t>
+      </w:r>
+      <w:proofErr w:type="spellStart"/>
+      <w:r>
+        <w:t>Systor</w:t>
+      </w:r>
+      <w:proofErr w:type="spellEnd"/>
+      <w:r>
+        <w:t xml:space="preserve"> 2025, </w:t>
+      </w:r>
+      <w:r>
+        <w:rPr>
+          <w:b/>
+          <w:bCs/>
+          <w:color w:val="000000" w:themeColor="text1"/>
+        </w:rPr>
+        <w:t>Best Poster Awar</w:t>
+      </w:r>
+      <w:r>
+        <w:rPr>
+          <w:b/>
+          <w:bCs/>
+          <w:color w:val="000000" w:themeColor="text1"/>
+        </w:rPr>
+        <w:t>d.</w:t>
+      </w:r>
+    </w:p>
+    <w:p>
+      <w:pPr>
+        <w:pStyle w:val="a4"/>
+      </w:pPr>
+      <w:hyperlink r:id="rId19" w:history="1">
+        <w:proofErr w:type="spellStart"/>
+        <w:r>
+          <w:rPr>
+            <w:rStyle w:val="Hyperlink"/>
+            <w:b/>
+            <w:bCs/>
+          </w:rPr>
+          <w:t>FocusFlow</w:t>
+        </w:r>
+        <w:proofErr w:type="spellEnd"/>
+        <w:r>
+          <w:rPr>
+            <w:rStyle w:val="Hyperlink"/>
+            <w:b/>
+            <w:bCs/>
+          </w:rPr>
+          <w:t>: AI-Driven Engagement Monitoring and Interaction for Educational Videos</w:t>
         </w:r>
       </w:hyperlink>
       <w:r>
@@ -969,19 +1010,32 @@
           <w:b/>
           <w:bCs/>
           <w:color w:val="2F5496" w:themeColor="accent1" w:themeShade="BF"/>
-        </w:rPr>
-        <w:t>Software</w:t>
-      </w:r>
-      <w:r>
-        <w:rPr>
-          <w:rFonts w:asciiTheme="minorBidi" w:hAnsiTheme="minorBidi"/>
-          <w:b/>
-          <w:bCs/>
-          <w:color w:val="2F5496" w:themeColor="accent1" w:themeShade="BF"/>
           <w:sz w:val="20"/>
           <w:szCs w:val="20"/>
         </w:rPr>
-        <w:t xml:space="preserve"> Engineer</w:t>
+        <w:t>Software</w:t>
+      </w:r>
+      <w:r>
+        <w:rPr>
+          <w:rFonts w:asciiTheme="minorBidi" w:hAnsiTheme="minorBidi"/>
+          <w:b/>
+          <w:bCs/>
+          <w:color w:val="2F5496" w:themeColor="accent1" w:themeShade="BF"/>
+          <w:sz w:val="18"/>
+          <w:szCs w:val="18"/>
+        </w:rPr>
+        <w:t xml:space="preserve"> </w:t>
+      </w:r>
+      <w:r>
+        <w:rPr>
+          <w:rFonts w:asciiTheme="minorBidi" w:hAnsiTheme="minorBidi"/>
+          <w:b/>
+          <w:bCs/>
+          <w:color w:val="2F5496" w:themeColor="accent1" w:themeShade="BF"/>
+          <w:sz w:val="20"/>
+          <w:szCs w:val="20"/>
+        </w:rPr>
+        <w:t>Engineer</w:t>
       </w:r>
       <w:r>
         <w:rPr>
@@ -1199,7 +1253,7 @@
           </mc:Choice>
           <mc:Fallback>
             <w:pict>
-              <v:line w14:anchorId="0A17056B" id="Straight Connector 8" o:spid="_x0000_s1026" style="position:absolute;left:0;text-align:left;flip:y;z-index:251672576;visibility:visible;mso-wrap-style:square;mso-wrap-distance-left:9pt;mso-wrap-distance-top:0;mso-wrap-distance-right:9pt;mso-wrap-distance-bottom:0;mso-position-horizontal:absolute;mso-position-horizontal-relative:text;mso-position-vertical:absolute;mso-position-vertical-relative:text" from="-.6pt,12.55pt" to="450.6pt,13.75pt" o:gfxdata="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" strokecolor="#4472c4 [3204]" strokeweight=".5pt">
+              <v:line w14:anchorId="7FB70EEB" id="Straight Connector 8" o:spid="_x0000_s1026" style="position:absolute;left:0;text-align:left;flip:y;z-index:251672576;visibility:visible;mso-wrap-style:square;mso-wrap-distance-left:9pt;mso-wrap-distance-top:0;mso-wrap-distance-right:9pt;mso-wrap-distance-bottom:0;mso-position-horizontal:absolute;mso-position-horizontal-relative:text;mso-position-vertical:absolute;mso-position-vertical-relative:text" from="-.6pt,12.55pt" to="450.6pt,13.75pt" o:gfxdata="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" strokecolor="#4472c4 [3204]" strokeweight=".5pt">
                 <v:stroke joinstyle="miter"/>
               </v:line>
             </w:pict>
@@ -1229,6 +1283,7 @@
       <w:r>
         <w:t xml:space="preserve">, and </w:t>
       </w:r>
+      <w:proofErr w:type="spellStart"/>
       <w:r>
         <w:rPr>
           <w:b/>
@@ -1236,6 +1291,7 @@
         </w:rPr>
         <w:t>MediaPipe</w:t>
       </w:r>
+      <w:proofErr w:type="spellEnd"/>
       <w:r>
         <w:t>.</w:t>
       </w:r>
@@ -1363,9 +1419,11 @@
                                     </w:numPr>
                                     <w:spacing w:line="276" w:lineRule="auto"/>
                                   </w:pPr>
+                                  <w:proofErr w:type="spellStart"/>
                                   <w:r>
                                     <w:t>DataBases</w:t>
                                   </w:r>
+                                  <w:proofErr w:type="spellEnd"/>
                                   <w:r>
                                     <w:t xml:space="preserve"> (</w:t>
                                   </w:r>
@@ -1408,7 +1466,31 @@
                                     <w:spacing w:line="276" w:lineRule="auto"/>
                                   </w:pPr>
                                   <w:r>
-                                    <w:t>Python (PyTorch, Flask, RestAPI, MediaPipe)</w:t>
+                                    <w:t>Python (</w:t>
+                                  </w:r>
+                                  <w:proofErr w:type="spellStart"/>
+                                  <w:r>
+                                    <w:t>PyTorch</w:t>
+                                  </w:r>
+                                  <w:proofErr w:type="spellEnd"/>
+                                  <w:r>
+                                    <w:t xml:space="preserve">, Flask, </w:t>
+                                  </w:r>
+                                  <w:proofErr w:type="spellStart"/>
+                                  <w:r>
+                                    <w:t>RestAPI</w:t>
+                                  </w:r>
+                                  <w:proofErr w:type="spellEnd"/>
+                                  <w:r>
+                                    <w:t xml:space="preserve">, </w:t>
+                                  </w:r>
+                                  <w:proofErr w:type="spellStart"/>
+                                  <w:r>
+                                    <w:t>MediaPipe</w:t>
+                                  </w:r>
+                                  <w:proofErr w:type="spellEnd"/>
+                                  <w:r>
+                                    <w:t>)</w:t>
                                   </w:r>
                                 </w:p>
                               </w:tc>
@@ -1590,9 +1672,11 @@
                               </w:numPr>
                               <w:spacing w:line="276" w:lineRule="auto"/>
                             </w:pPr>
+                            <w:proofErr w:type="spellStart"/>
                             <w:r>
                               <w:t>DataBases</w:t>
                             </w:r>
+                            <w:proofErr w:type="spellEnd"/>
                             <w:r>
                               <w:t xml:space="preserve"> (</w:t>
                             </w:r>
@@ -1635,7 +1719,31 @@
                               <w:spacing w:line="276" w:lineRule="auto"/>
                             </w:pPr>
                             <w:r>
-                              <w:t>Python (PyTorch, Flask, RestAPI, MediaPipe)</w:t>
+                              <w:t>Python (</w:t>
+                            </w:r>
+                            <w:proofErr w:type="spellStart"/>
+                            <w:r>
+                              <w:t>PyTorch</w:t>
+                            </w:r>
+                            <w:proofErr w:type="spellEnd"/>
+                            <w:r>
+                              <w:t xml:space="preserve">, Flask, </w:t>
+                            </w:r>
+                            <w:proofErr w:type="spellStart"/>
+                            <w:r>
+                              <w:t>RestAPI</w:t>
+                            </w:r>
+                            <w:proofErr w:type="spellEnd"/>
+                            <w:r>
+                              <w:t xml:space="preserve">, </w:t>
+                            </w:r>
+                            <w:proofErr w:type="spellStart"/>
+                            <w:r>
+                              <w:t>MediaPipe</w:t>
+                            </w:r>
+                            <w:proofErr w:type="spellEnd"/>
+                            <w:r>
+                              <w:t>)</w:t>
                             </w:r>
                           </w:p>
                         </w:tc>
@@ -1834,7 +1942,7 @@
           </mc:Choice>
           <mc:Fallback>
             <w:pict>
-              <v:line w14:anchorId="29D3C684" id="Straight Connector 5" o:spid="_x0000_s1026" style="position:absolute;left:0;text-align:left;flip:y;z-index:251678720;visibility:visible;mso-wrap-style:square;mso-wrap-distance-left:9pt;mso-wrap-distance-top:0;mso-wrap-distance-right:9pt;mso-wrap-distance-bottom:0;mso-position-horizontal:absolute;mso-position-horizontal-relative:text;mso-position-vertical:absolute;mso-position-vertical-relative:text" from="1.7pt,15.25pt" to="452.9pt,16.45pt" o:gfxdata="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" strokecolor="#4472c4 [3204]" strokeweight=".5pt">
+              <v:line w14:anchorId="6E8A0A88" id="Straight Connector 5" o:spid="_x0000_s1026" style="position:absolute;left:0;text-align:left;flip:y;z-index:251678720;visibility:visible;mso-wrap-style:square;mso-wrap-distance-left:9pt;mso-wrap-distance-top:0;mso-wrap-distance-right:9pt;mso-wrap-distance-bottom:0;mso-position-horizontal:absolute;mso-position-horizontal-relative:text;mso-position-vertical:absolute;mso-position-vertical-relative:text" from="1.7pt,15.25pt" to="452.9pt,16.45pt" o:gfxdata="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" strokecolor="#4472c4 [3204]" strokeweight=".5pt">
                 <v:stroke joinstyle="miter"/>
               </v:line>
             </w:pict>
@@ -2394,7 +2502,7 @@
           </mc:Choice>
           <mc:Fallback>
             <w:pict>
-              <v:line w14:anchorId="1C979B9D" id="Straight Connector 10" o:spid="_x0000_s1026" style="position:absolute;left:0;text-align:left;flip:y;z-index:251676672;visibility:visible;mso-wrap-style:square;mso-wrap-distance-left:9pt;mso-wrap-distance-top:0;mso-wrap-distance-right:9pt;mso-wrap-distance-bottom:0;mso-position-horizontal:absolute;mso-position-horizontal-relative:text;mso-position-vertical:absolute;mso-position-vertical-relative:text" from="0,11.75pt" to="451.2pt,12.95pt" o:gfxdata="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" strokecolor="#4472c4 [3204]" strokeweight=".5pt">
+              <v:line w14:anchorId="7EF8EE79" id="Straight Connector 10" o:spid="_x0000_s1026" style="position:absolute;left:0;text-align:left;flip:y;z-index:251676672;visibility:visible;mso-wrap-style:square;mso-wrap-distance-left:9pt;mso-wrap-distance-top:0;mso-wrap-distance-right:9pt;mso-wrap-distance-bottom:0;mso-position-horizontal:absolute;mso-position-horizontal-relative:text;mso-position-vertical:absolute;mso-position-vertical-relative:text" from="0,11.75pt" to="451.2pt,12.95pt" o:gfxdata="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" strokecolor="#4472c4 [3204]" strokeweight=".5pt">
                 <v:stroke joinstyle="miter"/>
               </v:line>
             </w:pict>
@@ -2718,7 +2826,7 @@
           </mc:Choice>
           <mc:Fallback>
             <w:pict>
-              <v:line w14:anchorId="5A6C8E69" id="Straight Connector 6" o:spid="_x0000_s1026" style="position:absolute;left:0;text-align:left;flip:y;z-index:251667456;visibility:visible;mso-wrap-style:square;mso-wrap-distance-left:9pt;mso-wrap-distance-top:0;mso-wrap-distance-right:9pt;mso-wrap-distance-bottom:0;mso-position-horizontal:absolute;mso-position-horizontal-relative:margin;mso-position-vertical:absolute;mso-position-vertical-relative:text" from="1.75pt,1pt" to="452.95pt,2.2pt" o:gfxdata="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" strokecolor="#4472c4 [3204]" strokeweight=".5pt">
+              <v:line w14:anchorId="12FB0F57" id="Straight Connector 6" o:spid="_x0000_s1026" style="position:absolute;left:0;text-align:left;flip:y;z-index:251667456;visibility:visible;mso-wrap-style:square;mso-wrap-distance-left:9pt;mso-wrap-distance-top:0;mso-wrap-distance-right:9pt;mso-wrap-distance-bottom:0;mso-position-horizontal:absolute;mso-position-horizontal-relative:margin;mso-position-vertical:absolute;mso-position-vertical-relative:text" from="1.75pt,1pt" to="452.95pt,2.2pt" o:gfxdata="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" strokecolor="#4472c4 [3204]" strokeweight=".5pt">
                 <v:stroke joinstyle="miter"/>
                 <w10:wrap anchorx="margin"/>
               </v:line>

</xml_diff>

<commit_message>
improved words and bolds
</commit_message>
<xml_diff>
--- a/CV-RenanBazinin.docx
+++ b/CV-RenanBazinin.docx
@@ -337,14 +337,34 @@
       </w:r>
       <w:proofErr w:type="gramEnd"/>
       <w:r>
-        <w:t xml:space="preserve">, award-winning Computer Science student with 60+ GitHub repositories and </w:t>
-      </w:r>
-      <w:r>
-        <w:rPr>
-          <w:b/>
-          <w:bCs/>
-        </w:rPr>
-        <w:t>OSS contributions (IPTV parser development, nand2tetris, &amp; others)</w:t>
+        <w:t xml:space="preserve">, award-winning Computer Science student with </w:t>
+      </w:r>
+      <w:r>
+        <w:rPr>
+          <w:b/>
+          <w:bCs/>
+        </w:rPr>
+        <w:t>60+ GitHub</w:t>
+      </w:r>
+      <w:r>
+        <w:t xml:space="preserve"> repositories and </w:t>
+      </w:r>
+      <w:r>
+        <w:rPr>
+          <w:b/>
+          <w:bCs/>
+        </w:rPr>
+        <w:t xml:space="preserve">OSS contributions </w:t>
+      </w:r>
+      <w:r>
+        <w:t>(IPTV parser development, nand2tetris, &amp; others</w:t>
+      </w:r>
+      <w:r>
+        <w:rPr>
+          <w:b/>
+          <w:bCs/>
+        </w:rPr>
+        <w:t>)</w:t>
       </w:r>
       <w:r>
         <w:t>. Proven ability to deliver production level applications. Experienced with Python, React, and full-stack Node.js. Looking for software developer roles</w:t>
@@ -1642,11 +1662,7 @@
           </mc:Choice>
           <mc:Fallback>
             <w:pict>
-              <v:shapetype w14:anchorId="42CD17ED" id="_x0000_t202" coordsize="21600,21600" o:spt="202" path="m,l,21600r21600,l21600,xe">
-                <v:stroke joinstyle="miter"/>
-                <v:path gradientshapeok="t" o:connecttype="rect"/>
-              </v:shapetype>
-              <v:shape id="_x0000_s1027" type="#_x0000_t202" style="position:absolute;margin-left:-13.5pt;margin-top:10.25pt;width:477.6pt;height:54.7pt;z-index:251682816;visibility:visible;mso-wrap-style:square;mso-width-percent:0;mso-height-percent:0;mso-wrap-distance-left:9pt;mso-wrap-distance-top:0;mso-wrap-distance-right:9pt;mso-wrap-distance-bottom:0;mso-position-horizontal:absolute;mso-position-horizontal-relative:text;mso-position-vertical:absolute;mso-position-vertical-relative:text;mso-width-percent:0;mso-height-percent:0;mso-width-relative:margin;mso-height-relative:margin;v-text-anchor:top" o:gfxdata="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" filled="f" stroked="f" strokeweight=".5pt">
+              <v:shape w14:anchorId="42CD17ED" id="_x0000_s1027" type="#_x0000_t202" style="position:absolute;margin-left:-13.5pt;margin-top:10.25pt;width:477.6pt;height:54.7pt;z-index:251682816;visibility:visible;mso-wrap-style:square;mso-width-percent:0;mso-height-percent:0;mso-wrap-distance-left:9pt;mso-wrap-distance-top:0;mso-wrap-distance-right:9pt;mso-wrap-distance-bottom:0;mso-position-horizontal:absolute;mso-position-horizontal-relative:text;mso-position-vertical:absolute;mso-position-vertical-relative:text;mso-width-percent:0;mso-height-percent:0;mso-width-relative:margin;mso-height-relative:margin;v-text-anchor:top" o:gfxdata="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" filled="f" stroked="f" strokeweight=".5pt">
                 <v:textbox>
                   <w:txbxContent>
                     <w:tbl>
@@ -4415,6 +4431,7 @@
   <w:style w:type="character" w:default="1" w:styleId="a0">
     <w:name w:val="Default Paragraph Font"/>
     <w:uiPriority w:val="1"/>
+    <w:semiHidden/>
     <w:unhideWhenUsed/>
   </w:style>
   <w:style w:type="table" w:default="1" w:styleId="a1">

</xml_diff>